<commit_message>
updated name on plan
</commit_message>
<xml_diff>
--- a/hoffman-site-plan.docx
+++ b/hoffman-site-plan.docx
@@ -35,7 +35,13 @@
         <w:rPr>
           <w:rFonts w:eastAsia="Times New Roman"/>
         </w:rPr>
-        <w:t>Michael Hoffma</w:t>
+        <w:t>Michael Hoffm</w:t>
+      </w:r>
+      <w:r>
+        <w:rPr>
+          <w:rFonts w:eastAsia="Times New Roman"/>
+        </w:rPr>
+        <w:t>an</w:t>
       </w:r>
     </w:p>
     <w:p>
@@ -634,34 +640,14 @@
         </w:rPr>
         <w:t xml:space="preserve">Heading Font: </w:t>
       </w:r>
-      <w:proofErr w:type="spellStart"/>
       <w:r>
         <w:rPr>
           <w:rFonts w:ascii="Efervescencia Programada" w:eastAsia="Times New Roman" w:hAnsi="Efervescencia Programada"/>
           <w:sz w:val="30"/>
           <w:szCs w:val="30"/>
         </w:rPr>
-        <w:t>Efervescencia</w:t>
-      </w:r>
-      <w:proofErr w:type="spellEnd"/>
-      <w:r>
-        <w:rPr>
-          <w:rFonts w:ascii="Efervescencia Programada" w:eastAsia="Times New Roman" w:hAnsi="Efervescencia Programada"/>
-          <w:sz w:val="30"/>
-          <w:szCs w:val="30"/>
-        </w:rPr>
-        <w:t xml:space="preserve"> </w:t>
-      </w:r>
-      <w:proofErr w:type="spellStart"/>
-      <w:r>
-        <w:rPr>
-          <w:rFonts w:ascii="Efervescencia Programada" w:eastAsia="Times New Roman" w:hAnsi="Efervescencia Programada"/>
-          <w:sz w:val="30"/>
-          <w:szCs w:val="30"/>
-        </w:rPr>
-        <w:t>Programada</w:t>
-      </w:r>
-      <w:proofErr w:type="spellEnd"/>
+        <w:t>Efervescencia Programada</w:t>
+      </w:r>
     </w:p>
     <w:p>
       <w:pPr>
@@ -672,93 +658,57 @@
         </w:rPr>
       </w:pPr>
       <w:hyperlink r:id="rId6" w:history="1">
-        <w:proofErr w:type="spellStart"/>
         <w:r>
           <w:rPr>
             <w:rStyle w:val="Hyperlink"/>
             <w:rFonts w:eastAsia="Times New Roman"/>
           </w:rPr>
-          <w:t>Efervescencia</w:t>
+          <w:t>Efervescencia Programada Font | dafont.com</w:t>
         </w:r>
-        <w:proofErr w:type="spellEnd"/>
+      </w:hyperlink>
+    </w:p>
+    <w:p>
+      <w:pPr>
+        <w:pStyle w:val="Heading4"/>
+        <w:jc w:val="center"/>
+        <w:rPr>
+          <w:rFonts w:eastAsia="Times New Roman"/>
+        </w:rPr>
+      </w:pPr>
+      <w:r>
+        <w:rPr>
+          <w:rFonts w:eastAsia="Times New Roman"/>
+        </w:rPr>
+        <w:t>Paragraph Font</w:t>
+      </w:r>
+      <w:r>
+        <w:rPr>
+          <w:rFonts w:eastAsia="Times New Roman"/>
+        </w:rPr>
+        <w:t xml:space="preserve">: </w:t>
+      </w:r>
+      <w:r>
+        <w:rPr>
+          <w:rFonts w:ascii="Softers" w:eastAsia="Times New Roman" w:hAnsi="Softers"/>
+        </w:rPr>
+        <w:t>Softers</w:t>
+      </w:r>
+    </w:p>
+    <w:p>
+      <w:pPr>
+        <w:pStyle w:val="Heading4"/>
+        <w:jc w:val="center"/>
+        <w:rPr>
+          <w:rFonts w:eastAsia="Times New Roman"/>
+        </w:rPr>
+      </w:pPr>
+      <w:hyperlink r:id="rId7" w:history="1">
         <w:r>
           <w:rPr>
             <w:rStyle w:val="Hyperlink"/>
             <w:rFonts w:eastAsia="Times New Roman"/>
           </w:rPr>
-          <w:t xml:space="preserve"> </w:t>
-        </w:r>
-        <w:proofErr w:type="spellStart"/>
-        <w:r>
-          <w:rPr>
-            <w:rStyle w:val="Hyperlink"/>
-            <w:rFonts w:eastAsia="Times New Roman"/>
-          </w:rPr>
-          <w:t>Programada</w:t>
-        </w:r>
-        <w:proofErr w:type="spellEnd"/>
-        <w:r>
-          <w:rPr>
-            <w:rStyle w:val="Hyperlink"/>
-            <w:rFonts w:eastAsia="Times New Roman"/>
-          </w:rPr>
-          <w:t xml:space="preserve"> Font | dafont.com</w:t>
-        </w:r>
-      </w:hyperlink>
-    </w:p>
-    <w:p>
-      <w:pPr>
-        <w:pStyle w:val="Heading4"/>
-        <w:jc w:val="center"/>
-        <w:rPr>
-          <w:rFonts w:eastAsia="Times New Roman"/>
-        </w:rPr>
-      </w:pPr>
-      <w:r>
-        <w:rPr>
-          <w:rFonts w:eastAsia="Times New Roman"/>
-        </w:rPr>
-        <w:t>Paragraph Font</w:t>
-      </w:r>
-      <w:r>
-        <w:rPr>
-          <w:rFonts w:eastAsia="Times New Roman"/>
-        </w:rPr>
-        <w:t xml:space="preserve">: </w:t>
-      </w:r>
-      <w:proofErr w:type="spellStart"/>
-      <w:r>
-        <w:rPr>
-          <w:rFonts w:ascii="Softers" w:eastAsia="Times New Roman" w:hAnsi="Softers"/>
-        </w:rPr>
-        <w:t>Softers</w:t>
-      </w:r>
-      <w:proofErr w:type="spellEnd"/>
-    </w:p>
-    <w:p>
-      <w:pPr>
-        <w:pStyle w:val="Heading4"/>
-        <w:jc w:val="center"/>
-        <w:rPr>
-          <w:rFonts w:eastAsia="Times New Roman"/>
-        </w:rPr>
-      </w:pPr>
-      <w:hyperlink r:id="rId7" w:history="1">
-        <w:proofErr w:type="spellStart"/>
-        <w:r>
-          <w:rPr>
-            <w:rStyle w:val="Hyperlink"/>
-            <w:rFonts w:eastAsia="Times New Roman"/>
-          </w:rPr>
-          <w:t>Softers</w:t>
-        </w:r>
-        <w:proofErr w:type="spellEnd"/>
-        <w:r>
-          <w:rPr>
-            <w:rStyle w:val="Hyperlink"/>
-            <w:rFonts w:eastAsia="Times New Roman"/>
-          </w:rPr>
-          <w:t xml:space="preserve"> Font | dafont.com</w:t>
+          <w:t>Softers Font | dafont.com</w:t>
         </w:r>
       </w:hyperlink>
     </w:p>
@@ -1662,19 +1612,11 @@
                 <w:rFonts w:eastAsia="Times New Roman"/>
               </w:rPr>
             </w:pPr>
-            <w:proofErr w:type="spellStart"/>
             <w:r>
               <w:rPr>
                 <w:rFonts w:eastAsia="Times New Roman"/>
               </w:rPr>
-              <w:t>CLion</w:t>
-            </w:r>
-            <w:proofErr w:type="spellEnd"/>
-            <w:r>
-              <w:rPr>
-                <w:rFonts w:eastAsia="Times New Roman"/>
-              </w:rPr>
-              <w:t>, Visual Studio</w:t>
+              <w:t>CLion, Visual Studio</w:t>
             </w:r>
           </w:p>
         </w:tc>
@@ -1848,16 +1790,8 @@
               <w:rPr>
                 <w:rFonts w:eastAsia="Times New Roman"/>
               </w:rPr>
-              <w:t xml:space="preserve">VS Code, </w:t>
+              <w:t>VS Code, PHPStorm</w:t>
             </w:r>
-            <w:proofErr w:type="spellStart"/>
-            <w:r>
-              <w:rPr>
-                <w:rFonts w:eastAsia="Times New Roman"/>
-              </w:rPr>
-              <w:t>PHPStorm</w:t>
-            </w:r>
-            <w:proofErr w:type="spellEnd"/>
           </w:p>
         </w:tc>
         <w:tc>

</xml_diff>

<commit_message>
added an about page section on the website plan
</commit_message>
<xml_diff>
--- a/hoffman-site-plan.docx
+++ b/hoffman-site-plan.docx
@@ -1612,11 +1612,19 @@
                 <w:rFonts w:eastAsia="Times New Roman"/>
               </w:rPr>
             </w:pPr>
+            <w:proofErr w:type="spellStart"/>
             <w:r>
               <w:rPr>
                 <w:rFonts w:eastAsia="Times New Roman"/>
               </w:rPr>
-              <w:t>CLion, Visual Studio</w:t>
+              <w:t>CLion</w:t>
+            </w:r>
+            <w:proofErr w:type="spellEnd"/>
+            <w:r>
+              <w:rPr>
+                <w:rFonts w:eastAsia="Times New Roman"/>
+              </w:rPr>
+              <w:t>, Visual Studio</w:t>
             </w:r>
           </w:p>
         </w:tc>
@@ -1790,8 +1798,16 @@
               <w:rPr>
                 <w:rFonts w:eastAsia="Times New Roman"/>
               </w:rPr>
-              <w:t>VS Code, PHPStorm</w:t>
+              <w:t xml:space="preserve">VS Code, </w:t>
             </w:r>
+            <w:proofErr w:type="spellStart"/>
+            <w:r>
+              <w:rPr>
+                <w:rFonts w:eastAsia="Times New Roman"/>
+              </w:rPr>
+              <w:t>PHPStorm</w:t>
+            </w:r>
+            <w:proofErr w:type="spellEnd"/>
           </w:p>
         </w:tc>
         <w:tc>
@@ -1837,10 +1853,940 @@
           <w:rFonts w:eastAsia="Times New Roman"/>
           <w:b/>
           <w:bCs/>
+          <w:sz w:val="36"/>
+          <w:szCs w:val="36"/>
+        </w:rPr>
+      </w:pPr>
+      <w:r>
+        <w:rPr>
+          <w:rFonts w:eastAsia="Times New Roman"/>
+          <w:b/>
+          <w:bCs/>
+          <w:sz w:val="36"/>
+          <w:szCs w:val="36"/>
+        </w:rPr>
+        <w:t>Third Page</w:t>
+      </w:r>
+      <w:r>
+        <w:rPr>
+          <w:rFonts w:eastAsia="Times New Roman"/>
+          <w:b/>
+          <w:bCs/>
+          <w:sz w:val="36"/>
+          <w:szCs w:val="36"/>
+        </w:rPr>
+        <w:t xml:space="preserve"> </w:t>
+      </w:r>
+      <w:r>
+        <w:rPr>
+          <w:rFonts w:eastAsia="Times New Roman"/>
+          <w:b/>
+          <w:bCs/>
+          <w:sz w:val="36"/>
+          <w:szCs w:val="36"/>
+        </w:rPr>
+        <w:t>–</w:t>
+      </w:r>
+      <w:r>
+        <w:rPr>
+          <w:rFonts w:eastAsia="Times New Roman"/>
+          <w:b/>
+          <w:bCs/>
+          <w:sz w:val="36"/>
+          <w:szCs w:val="36"/>
+        </w:rPr>
+        <w:t xml:space="preserve"> </w:t>
+      </w:r>
+      <w:r>
+        <w:rPr>
+          <w:rFonts w:eastAsia="Times New Roman"/>
+          <w:b/>
+          <w:bCs/>
+          <w:sz w:val="36"/>
+          <w:szCs w:val="36"/>
+        </w:rPr>
+        <w:t>About</w:t>
+      </w:r>
+    </w:p>
+    <w:p>
+      <w:pPr>
+        <w:rPr>
+          <w:rFonts w:eastAsia="Times New Roman"/>
+          <w:b/>
+          <w:bCs/>
+        </w:rPr>
+      </w:pPr>
+      <w:r>
+        <w:rPr>
+          <w:rFonts w:eastAsia="Times New Roman"/>
+          <w:b/>
+          <w:bCs/>
+        </w:rPr>
+        <w:t>About This Project</w:t>
+      </w:r>
+    </w:p>
+    <w:p>
+      <w:pPr>
+        <w:rPr>
+          <w:rFonts w:eastAsia="Times New Roman"/>
+        </w:rPr>
+      </w:pPr>
+      <w:r>
+        <w:rPr>
+          <w:rFonts w:eastAsia="Times New Roman"/>
+        </w:rPr>
+        <w:t>Welcome to our Programming Language Comparison Platform — a website designed to help users explore, understand, and compare different programming languages through shared concepts and real-world applications.</w:t>
+      </w:r>
+    </w:p>
+    <w:p>
+      <w:pPr>
+        <w:rPr>
+          <w:rFonts w:eastAsia="Times New Roman"/>
+        </w:rPr>
+      </w:pPr>
+      <w:r>
+        <w:rPr>
+          <w:rFonts w:eastAsia="Times New Roman"/>
+        </w:rPr>
+        <w:t>The purpose of this project is to simplify the process of learning how programming languages work by placing them side-by-side. Instead of learning each language in isolation, this site focuses on showing how the same core programming concepts—such as variables, loops, functions, and object-oriented principles—are implemented across multiple languages.</w:t>
+      </w:r>
+    </w:p>
+    <w:p>
+      <w:pPr>
+        <w:rPr>
+          <w:rFonts w:eastAsia="Times New Roman"/>
+          <w:b/>
+          <w:bCs/>
           <w:sz w:val="32"/>
           <w:szCs w:val="32"/>
         </w:rPr>
       </w:pPr>
+    </w:p>
+    <w:p>
+      <w:pPr>
+        <w:rPr>
+          <w:rFonts w:eastAsia="Times New Roman"/>
+          <w:b/>
+          <w:bCs/>
+        </w:rPr>
+      </w:pPr>
+      <w:r>
+        <w:rPr>
+          <w:rFonts w:eastAsia="Times New Roman"/>
+          <w:b/>
+          <w:bCs/>
+        </w:rPr>
+        <w:t>Why This Website Exists</w:t>
+      </w:r>
+    </w:p>
+    <w:p>
+      <w:pPr>
+        <w:rPr>
+          <w:rFonts w:eastAsia="Times New Roman"/>
+        </w:rPr>
+      </w:pPr>
+      <w:r>
+        <w:rPr>
+          <w:rFonts w:eastAsia="Times New Roman"/>
+        </w:rPr>
+        <w:t>Learning programming can be overwhelming, especially when there are so many languages to choose from. Beginners often struggle with questions like:</w:t>
+      </w:r>
+    </w:p>
+    <w:p>
+      <w:pPr>
+        <w:numPr>
+          <w:ilvl w:val="0"/>
+          <w:numId w:val="4"/>
+        </w:numPr>
+        <w:rPr>
+          <w:rFonts w:eastAsia="Times New Roman"/>
+        </w:rPr>
+      </w:pPr>
+      <w:r>
+        <w:rPr>
+          <w:rFonts w:eastAsia="Times New Roman"/>
+        </w:rPr>
+        <w:t>Which programming language should I learn first?</w:t>
+      </w:r>
+    </w:p>
+    <w:p>
+      <w:pPr>
+        <w:numPr>
+          <w:ilvl w:val="0"/>
+          <w:numId w:val="4"/>
+        </w:numPr>
+        <w:rPr>
+          <w:rFonts w:eastAsia="Times New Roman"/>
+        </w:rPr>
+      </w:pPr>
+      <w:r>
+        <w:rPr>
+          <w:rFonts w:eastAsia="Times New Roman"/>
+        </w:rPr>
+        <w:t>How different are languages really?</w:t>
+      </w:r>
+    </w:p>
+    <w:p>
+      <w:pPr>
+        <w:numPr>
+          <w:ilvl w:val="0"/>
+          <w:numId w:val="4"/>
+        </w:numPr>
+        <w:rPr>
+          <w:rFonts w:eastAsia="Times New Roman"/>
+        </w:rPr>
+      </w:pPr>
+      <w:r>
+        <w:rPr>
+          <w:rFonts w:eastAsia="Times New Roman"/>
+        </w:rPr>
+        <w:t>Are the concepts transferable between languages?</w:t>
+      </w:r>
+    </w:p>
+    <w:p>
+      <w:pPr>
+        <w:rPr>
+          <w:rFonts w:eastAsia="Times New Roman"/>
+        </w:rPr>
+      </w:pPr>
+      <w:r>
+        <w:rPr>
+          <w:rFonts w:eastAsia="Times New Roman"/>
+        </w:rPr>
+        <w:lastRenderedPageBreak/>
+        <w:t>This website was created to answer those questions in a clear and visual way. By comparing languages directly, users can see that while syntax may differ, the underlying logic often remains the same.</w:t>
+      </w:r>
+    </w:p>
+    <w:p>
+      <w:pPr>
+        <w:rPr>
+          <w:rFonts w:eastAsia="Times New Roman"/>
+        </w:rPr>
+      </w:pPr>
+    </w:p>
+    <w:p>
+      <w:pPr>
+        <w:rPr>
+          <w:rFonts w:eastAsia="Times New Roman"/>
+          <w:b/>
+          <w:bCs/>
+        </w:rPr>
+      </w:pPr>
+      <w:r>
+        <w:rPr>
+          <w:rFonts w:eastAsia="Times New Roman"/>
+          <w:b/>
+          <w:bCs/>
+        </w:rPr>
+        <w:t>What You’ll Find Here</w:t>
+      </w:r>
+    </w:p>
+    <w:p>
+      <w:pPr>
+        <w:rPr>
+          <w:rFonts w:eastAsia="Times New Roman"/>
+        </w:rPr>
+      </w:pPr>
+      <w:r>
+        <w:rPr>
+          <w:rFonts w:eastAsia="Times New Roman"/>
+        </w:rPr>
+        <w:t xml:space="preserve">This site is organized to make </w:t>
+      </w:r>
+      <w:proofErr w:type="gramStart"/>
+      <w:r>
+        <w:rPr>
+          <w:rFonts w:eastAsia="Times New Roman"/>
+        </w:rPr>
+        <w:t>comparisons simple and intuitive</w:t>
+      </w:r>
+      <w:proofErr w:type="gramEnd"/>
+      <w:r>
+        <w:rPr>
+          <w:rFonts w:eastAsia="Times New Roman"/>
+        </w:rPr>
+        <w:t>. Users can explore:</w:t>
+      </w:r>
+    </w:p>
+    <w:p>
+      <w:pPr>
+        <w:rPr>
+          <w:rFonts w:eastAsia="Times New Roman"/>
+        </w:rPr>
+      </w:pPr>
+    </w:p>
+    <w:p>
+      <w:pPr>
+        <w:rPr>
+          <w:rFonts w:eastAsia="Times New Roman"/>
+          <w:b/>
+          <w:bCs/>
+        </w:rPr>
+      </w:pPr>
+      <w:r>
+        <w:rPr>
+          <w:rFonts w:eastAsia="Times New Roman"/>
+          <w:b/>
+          <w:bCs/>
+        </w:rPr>
+        <w:t>Language Comparisons</w:t>
+      </w:r>
+    </w:p>
+    <w:p>
+      <w:pPr>
+        <w:rPr>
+          <w:rFonts w:eastAsia="Times New Roman"/>
+        </w:rPr>
+      </w:pPr>
+      <w:r>
+        <w:rPr>
+          <w:rFonts w:eastAsia="Times New Roman"/>
+        </w:rPr>
+        <w:t xml:space="preserve">Side-by-side examples of popular programming languages </w:t>
+      </w:r>
+      <w:proofErr w:type="gramStart"/>
+      <w:r>
+        <w:rPr>
+          <w:rFonts w:eastAsia="Times New Roman"/>
+        </w:rPr>
+        <w:t>demonstrating</w:t>
+      </w:r>
+      <w:proofErr w:type="gramEnd"/>
+      <w:r>
+        <w:rPr>
+          <w:rFonts w:eastAsia="Times New Roman"/>
+        </w:rPr>
+        <w:t xml:space="preserve"> how they handle the same tasks.</w:t>
+      </w:r>
+    </w:p>
+    <w:p>
+      <w:pPr>
+        <w:rPr>
+          <w:rFonts w:eastAsia="Times New Roman"/>
+        </w:rPr>
+      </w:pPr>
+    </w:p>
+    <w:p>
+      <w:pPr>
+        <w:rPr>
+          <w:rFonts w:eastAsia="Times New Roman"/>
+          <w:b/>
+          <w:bCs/>
+        </w:rPr>
+      </w:pPr>
+      <w:r>
+        <w:rPr>
+          <w:rFonts w:eastAsia="Times New Roman"/>
+          <w:b/>
+          <w:bCs/>
+        </w:rPr>
+        <w:t>Core Programming Concepts</w:t>
+      </w:r>
+    </w:p>
+    <w:p>
+      <w:pPr>
+        <w:rPr>
+          <w:rFonts w:eastAsia="Times New Roman"/>
+        </w:rPr>
+      </w:pPr>
+      <w:r>
+        <w:rPr>
+          <w:rFonts w:eastAsia="Times New Roman"/>
+        </w:rPr>
+        <w:t>Breakdowns of essential topics such as:</w:t>
+      </w:r>
+    </w:p>
+    <w:p>
+      <w:pPr>
+        <w:numPr>
+          <w:ilvl w:val="0"/>
+          <w:numId w:val="5"/>
+        </w:numPr>
+        <w:rPr>
+          <w:rFonts w:eastAsia="Times New Roman"/>
+        </w:rPr>
+      </w:pPr>
+      <w:r>
+        <w:rPr>
+          <w:rFonts w:eastAsia="Times New Roman"/>
+        </w:rPr>
+        <w:t>Variables and data types</w:t>
+      </w:r>
+    </w:p>
+    <w:p>
+      <w:pPr>
+        <w:numPr>
+          <w:ilvl w:val="0"/>
+          <w:numId w:val="5"/>
+        </w:numPr>
+        <w:rPr>
+          <w:rFonts w:eastAsia="Times New Roman"/>
+        </w:rPr>
+      </w:pPr>
+      <w:r>
+        <w:rPr>
+          <w:rFonts w:eastAsia="Times New Roman"/>
+        </w:rPr>
+        <w:t>Conditionals and logic</w:t>
+      </w:r>
+    </w:p>
+    <w:p>
+      <w:pPr>
+        <w:numPr>
+          <w:ilvl w:val="0"/>
+          <w:numId w:val="5"/>
+        </w:numPr>
+        <w:rPr>
+          <w:rFonts w:eastAsia="Times New Roman"/>
+        </w:rPr>
+      </w:pPr>
+      <w:r>
+        <w:rPr>
+          <w:rFonts w:eastAsia="Times New Roman"/>
+        </w:rPr>
+        <w:t>Loops and iteration</w:t>
+      </w:r>
+    </w:p>
+    <w:p>
+      <w:pPr>
+        <w:numPr>
+          <w:ilvl w:val="0"/>
+          <w:numId w:val="5"/>
+        </w:numPr>
+        <w:rPr>
+          <w:rFonts w:eastAsia="Times New Roman"/>
+        </w:rPr>
+      </w:pPr>
+      <w:r>
+        <w:rPr>
+          <w:rFonts w:eastAsia="Times New Roman"/>
+        </w:rPr>
+        <w:t>Functions and methods</w:t>
+      </w:r>
+    </w:p>
+    <w:p>
+      <w:pPr>
+        <w:numPr>
+          <w:ilvl w:val="0"/>
+          <w:numId w:val="5"/>
+        </w:numPr>
+        <w:rPr>
+          <w:rFonts w:eastAsia="Times New Roman"/>
+        </w:rPr>
+      </w:pPr>
+      <w:r>
+        <w:rPr>
+          <w:rFonts w:eastAsia="Times New Roman"/>
+        </w:rPr>
+        <w:t>Object-oriented programming</w:t>
+      </w:r>
+    </w:p>
+    <w:p>
+      <w:pPr>
+        <w:rPr>
+          <w:rFonts w:eastAsia="Times New Roman"/>
+        </w:rPr>
+      </w:pPr>
+    </w:p>
+    <w:p>
+      <w:pPr>
+        <w:rPr>
+          <w:rFonts w:eastAsia="Times New Roman"/>
+          <w:b/>
+          <w:bCs/>
+        </w:rPr>
+      </w:pPr>
+      <w:r>
+        <w:rPr>
+          <w:rFonts w:eastAsia="Times New Roman"/>
+          <w:b/>
+          <w:bCs/>
+        </w:rPr>
+        <w:t>Code Examples</w:t>
+      </w:r>
+    </w:p>
+    <w:p>
+      <w:pPr>
+        <w:rPr>
+          <w:rFonts w:eastAsia="Times New Roman"/>
+        </w:rPr>
+      </w:pPr>
+      <w:r>
+        <w:rPr>
+          <w:rFonts w:eastAsia="Times New Roman"/>
+        </w:rPr>
+        <w:t>Real code snippets that show how different languages implement identical functionality.</w:t>
+      </w:r>
+    </w:p>
+    <w:p>
+      <w:pPr>
+        <w:rPr>
+          <w:rFonts w:eastAsia="Times New Roman"/>
+        </w:rPr>
+      </w:pPr>
+    </w:p>
+    <w:p>
+      <w:pPr>
+        <w:rPr>
+          <w:rFonts w:eastAsia="Times New Roman"/>
+          <w:b/>
+          <w:bCs/>
+        </w:rPr>
+      </w:pPr>
+      <w:r>
+        <w:rPr>
+          <w:rFonts w:eastAsia="Times New Roman"/>
+          <w:b/>
+          <w:bCs/>
+        </w:rPr>
+        <w:t>Development Tools (IDEs)</w:t>
+      </w:r>
+    </w:p>
+    <w:p>
+      <w:pPr>
+        <w:rPr>
+          <w:rFonts w:eastAsia="Times New Roman"/>
+        </w:rPr>
+      </w:pPr>
+      <w:r>
+        <w:rPr>
+          <w:rFonts w:eastAsia="Times New Roman"/>
+        </w:rPr>
+        <w:t>An overview of environments used to write and run code, helping users understand how programming is done in practice.</w:t>
+      </w:r>
+    </w:p>
+    <w:p>
+      <w:pPr>
+        <w:rPr>
+          <w:rFonts w:eastAsia="Times New Roman"/>
+        </w:rPr>
+      </w:pPr>
+    </w:p>
+    <w:p>
+      <w:pPr>
+        <w:rPr>
+          <w:rFonts w:eastAsia="Times New Roman"/>
+          <w:b/>
+          <w:bCs/>
+        </w:rPr>
+      </w:pPr>
+      <w:r>
+        <w:rPr>
+          <w:rFonts w:eastAsia="Times New Roman"/>
+          <w:b/>
+          <w:bCs/>
+        </w:rPr>
+        <w:t>Our Approach</w:t>
+      </w:r>
+    </w:p>
+    <w:p>
+      <w:pPr>
+        <w:rPr>
+          <w:rFonts w:eastAsia="Times New Roman"/>
+        </w:rPr>
+      </w:pPr>
+      <w:r>
+        <w:rPr>
+          <w:rFonts w:eastAsia="Times New Roman"/>
+        </w:rPr>
+        <w:t xml:space="preserve">This project is built on the idea that </w:t>
+      </w:r>
+      <w:r>
+        <w:rPr>
+          <w:rFonts w:eastAsia="Times New Roman"/>
+          <w:b/>
+          <w:bCs/>
+        </w:rPr>
+        <w:t>understanding concepts is more important than memorizing syntax</w:t>
+      </w:r>
+      <w:r>
+        <w:rPr>
+          <w:rFonts w:eastAsia="Times New Roman"/>
+        </w:rPr>
+        <w:t>. By focusing on patterns and similarities between languages, users can develop a deeper and more flexible understanding of programming.</w:t>
+      </w:r>
+    </w:p>
+    <w:p>
+      <w:pPr>
+        <w:rPr>
+          <w:rFonts w:eastAsia="Times New Roman"/>
+        </w:rPr>
+      </w:pPr>
+      <w:r>
+        <w:rPr>
+          <w:rFonts w:eastAsia="Times New Roman"/>
+        </w:rPr>
+        <w:t>Rather than overwhelming users with theory, the site emphasizes:</w:t>
+      </w:r>
+    </w:p>
+    <w:p>
+      <w:pPr>
+        <w:numPr>
+          <w:ilvl w:val="0"/>
+          <w:numId w:val="6"/>
+        </w:numPr>
+        <w:rPr>
+          <w:rFonts w:eastAsia="Times New Roman"/>
+        </w:rPr>
+      </w:pPr>
+      <w:r>
+        <w:rPr>
+          <w:rFonts w:eastAsia="Times New Roman"/>
+        </w:rPr>
+        <w:t>Visual learning</w:t>
+      </w:r>
+    </w:p>
+    <w:p>
+      <w:pPr>
+        <w:numPr>
+          <w:ilvl w:val="0"/>
+          <w:numId w:val="6"/>
+        </w:numPr>
+        <w:rPr>
+          <w:rFonts w:eastAsia="Times New Roman"/>
+        </w:rPr>
+      </w:pPr>
+      <w:r>
+        <w:rPr>
+          <w:rFonts w:eastAsia="Times New Roman"/>
+        </w:rPr>
+        <w:t>Practical examples</w:t>
+      </w:r>
+    </w:p>
+    <w:p>
+      <w:pPr>
+        <w:numPr>
+          <w:ilvl w:val="0"/>
+          <w:numId w:val="6"/>
+        </w:numPr>
+        <w:rPr>
+          <w:rFonts w:eastAsia="Times New Roman"/>
+        </w:rPr>
+      </w:pPr>
+      <w:r>
+        <w:rPr>
+          <w:rFonts w:eastAsia="Times New Roman"/>
+        </w:rPr>
+        <w:t>Clear comparisons</w:t>
+      </w:r>
+    </w:p>
+    <w:p>
+      <w:pPr>
+        <w:numPr>
+          <w:ilvl w:val="0"/>
+          <w:numId w:val="6"/>
+        </w:numPr>
+        <w:rPr>
+          <w:rFonts w:eastAsia="Times New Roman"/>
+        </w:rPr>
+      </w:pPr>
+      <w:r>
+        <w:rPr>
+          <w:rFonts w:eastAsia="Times New Roman"/>
+        </w:rPr>
+        <w:t>Simple explanations</w:t>
+      </w:r>
+    </w:p>
+    <w:p>
+      <w:pPr>
+        <w:rPr>
+          <w:rFonts w:eastAsia="Times New Roman"/>
+        </w:rPr>
+      </w:pPr>
+    </w:p>
+    <w:p>
+      <w:pPr>
+        <w:rPr>
+          <w:rFonts w:eastAsia="Times New Roman"/>
+          <w:b/>
+          <w:bCs/>
+        </w:rPr>
+      </w:pPr>
+      <w:r>
+        <w:rPr>
+          <w:rFonts w:eastAsia="Times New Roman"/>
+          <w:b/>
+          <w:bCs/>
+        </w:rPr>
+        <w:t>Who This Is For</w:t>
+      </w:r>
+    </w:p>
+    <w:p>
+      <w:pPr>
+        <w:rPr>
+          <w:rFonts w:eastAsia="Times New Roman"/>
+        </w:rPr>
+      </w:pPr>
+      <w:r>
+        <w:rPr>
+          <w:rFonts w:eastAsia="Times New Roman"/>
+        </w:rPr>
+        <w:t>This website is designed for:</w:t>
+      </w:r>
+    </w:p>
+    <w:p>
+      <w:pPr>
+        <w:numPr>
+          <w:ilvl w:val="0"/>
+          <w:numId w:val="7"/>
+        </w:numPr>
+        <w:rPr>
+          <w:rFonts w:eastAsia="Times New Roman"/>
+        </w:rPr>
+      </w:pPr>
+      <w:r>
+        <w:rPr>
+          <w:rFonts w:eastAsia="Times New Roman"/>
+        </w:rPr>
+        <w:t>Beginners learning their first programming language</w:t>
+      </w:r>
+    </w:p>
+    <w:p>
+      <w:pPr>
+        <w:numPr>
+          <w:ilvl w:val="0"/>
+          <w:numId w:val="7"/>
+        </w:numPr>
+        <w:rPr>
+          <w:rFonts w:eastAsia="Times New Roman"/>
+        </w:rPr>
+      </w:pPr>
+      <w:r>
+        <w:rPr>
+          <w:rFonts w:eastAsia="Times New Roman"/>
+        </w:rPr>
+        <w:t>Students studying computer science concepts</w:t>
+      </w:r>
+    </w:p>
+    <w:p>
+      <w:pPr>
+        <w:numPr>
+          <w:ilvl w:val="0"/>
+          <w:numId w:val="7"/>
+        </w:numPr>
+        <w:rPr>
+          <w:rFonts w:eastAsia="Times New Roman"/>
+        </w:rPr>
+      </w:pPr>
+      <w:r>
+        <w:rPr>
+          <w:rFonts w:eastAsia="Times New Roman"/>
+        </w:rPr>
+        <w:t>Developers exploring new languages</w:t>
+      </w:r>
+    </w:p>
+    <w:p>
+      <w:pPr>
+        <w:numPr>
+          <w:ilvl w:val="0"/>
+          <w:numId w:val="7"/>
+        </w:numPr>
+        <w:rPr>
+          <w:rFonts w:eastAsia="Times New Roman"/>
+        </w:rPr>
+      </w:pPr>
+      <w:r>
+        <w:rPr>
+          <w:rFonts w:eastAsia="Times New Roman"/>
+        </w:rPr>
+        <w:t>Anyone curious about how programming languages compare</w:t>
+      </w:r>
+    </w:p>
+    <w:p>
+      <w:pPr>
+        <w:rPr>
+          <w:rFonts w:eastAsia="Times New Roman"/>
+        </w:rPr>
+      </w:pPr>
+    </w:p>
+    <w:p>
+      <w:pPr>
+        <w:rPr>
+          <w:rFonts w:eastAsia="Times New Roman"/>
+          <w:b/>
+          <w:bCs/>
+        </w:rPr>
+      </w:pPr>
+      <w:r>
+        <w:rPr>
+          <w:rFonts w:eastAsia="Times New Roman"/>
+          <w:b/>
+          <w:bCs/>
+        </w:rPr>
+        <w:t>Project Goals</w:t>
+      </w:r>
+    </w:p>
+    <w:p>
+      <w:pPr>
+        <w:rPr>
+          <w:rFonts w:eastAsia="Times New Roman"/>
+        </w:rPr>
+      </w:pPr>
+      <w:r>
+        <w:rPr>
+          <w:rFonts w:eastAsia="Times New Roman"/>
+        </w:rPr>
+        <w:t>The main goals of this project are to:</w:t>
+      </w:r>
+    </w:p>
+    <w:p>
+      <w:pPr>
+        <w:numPr>
+          <w:ilvl w:val="0"/>
+          <w:numId w:val="8"/>
+        </w:numPr>
+        <w:rPr>
+          <w:rFonts w:eastAsia="Times New Roman"/>
+        </w:rPr>
+      </w:pPr>
+      <w:proofErr w:type="gramStart"/>
+      <w:r>
+        <w:rPr>
+          <w:rFonts w:eastAsia="Times New Roman"/>
+        </w:rPr>
+        <w:t>Make</w:t>
+      </w:r>
+      <w:proofErr w:type="gramEnd"/>
+      <w:r>
+        <w:rPr>
+          <w:rFonts w:eastAsia="Times New Roman"/>
+        </w:rPr>
+        <w:t xml:space="preserve"> programming concepts easier to understand</w:t>
+      </w:r>
+    </w:p>
+    <w:p>
+      <w:pPr>
+        <w:numPr>
+          <w:ilvl w:val="0"/>
+          <w:numId w:val="8"/>
+        </w:numPr>
+        <w:rPr>
+          <w:rFonts w:eastAsia="Times New Roman"/>
+        </w:rPr>
+      </w:pPr>
+      <w:r>
+        <w:rPr>
+          <w:rFonts w:eastAsia="Times New Roman"/>
+        </w:rPr>
+        <w:lastRenderedPageBreak/>
+        <w:t>Show relationships between different languages</w:t>
+      </w:r>
+    </w:p>
+    <w:p>
+      <w:pPr>
+        <w:numPr>
+          <w:ilvl w:val="0"/>
+          <w:numId w:val="8"/>
+        </w:numPr>
+        <w:rPr>
+          <w:rFonts w:eastAsia="Times New Roman"/>
+        </w:rPr>
+      </w:pPr>
+      <w:proofErr w:type="gramStart"/>
+      <w:r>
+        <w:rPr>
+          <w:rFonts w:eastAsia="Times New Roman"/>
+        </w:rPr>
+        <w:t>Provide</w:t>
+      </w:r>
+      <w:proofErr w:type="gramEnd"/>
+      <w:r>
+        <w:rPr>
+          <w:rFonts w:eastAsia="Times New Roman"/>
+        </w:rPr>
+        <w:t xml:space="preserve"> a useful educational resource</w:t>
+      </w:r>
+    </w:p>
+    <w:p>
+      <w:pPr>
+        <w:numPr>
+          <w:ilvl w:val="0"/>
+          <w:numId w:val="8"/>
+        </w:numPr>
+        <w:rPr>
+          <w:rFonts w:eastAsia="Times New Roman"/>
+        </w:rPr>
+      </w:pPr>
+      <w:r>
+        <w:rPr>
+          <w:rFonts w:eastAsia="Times New Roman"/>
+        </w:rPr>
+        <w:t>Demonstrate web development and design skills</w:t>
+      </w:r>
+    </w:p>
+    <w:p>
+      <w:pPr>
+        <w:rPr>
+          <w:rFonts w:eastAsia="Times New Roman"/>
+        </w:rPr>
+      </w:pPr>
+    </w:p>
+    <w:p>
+      <w:pPr>
+        <w:rPr>
+          <w:rFonts w:eastAsia="Times New Roman"/>
+          <w:b/>
+          <w:bCs/>
+        </w:rPr>
+      </w:pPr>
+      <w:r>
+        <w:rPr>
+          <w:rFonts w:eastAsia="Times New Roman"/>
+          <w:b/>
+          <w:bCs/>
+        </w:rPr>
+        <w:t>About the Developer</w:t>
+      </w:r>
+    </w:p>
+    <w:p>
+      <w:pPr>
+        <w:rPr>
+          <w:rFonts w:eastAsia="Times New Roman"/>
+        </w:rPr>
+      </w:pPr>
+      <w:r>
+        <w:rPr>
+          <w:rFonts w:eastAsia="Times New Roman"/>
+        </w:rPr>
+        <w:t>This website was created as a college final project to combine both technical knowledge and creative design. It reflects an interest in programming, problem-solving, and building tools that help others learn more effectively.</w:t>
+      </w:r>
+    </w:p>
+    <w:p>
+      <w:pPr>
+        <w:rPr>
+          <w:rFonts w:eastAsia="Times New Roman"/>
+        </w:rPr>
+      </w:pPr>
+    </w:p>
+    <w:p>
+      <w:pPr>
+        <w:rPr>
+          <w:rFonts w:eastAsia="Times New Roman"/>
+          <w:b/>
+          <w:bCs/>
+        </w:rPr>
+      </w:pPr>
+      <w:r>
+        <w:rPr>
+          <w:rFonts w:eastAsia="Times New Roman"/>
+          <w:b/>
+          <w:bCs/>
+        </w:rPr>
+        <w:t>Final Thoughts</w:t>
+      </w:r>
+    </w:p>
+    <w:p>
+      <w:pPr>
+        <w:rPr>
+          <w:rFonts w:eastAsia="Times New Roman"/>
+        </w:rPr>
+      </w:pPr>
+      <w:r>
+        <w:rPr>
+          <w:rFonts w:eastAsia="Times New Roman"/>
+        </w:rPr>
+        <w:t>Programming languages may look different on the surface, but at their core, they share many of the same ideas. This website exists to highlight those connections and make learning programming more approachable, logical, and engaging.</w:t>
+      </w:r>
     </w:p>
     <w:p>
       <w:pPr>
@@ -2267,6 +3213,602 @@
     </w:lvl>
   </w:abstractNum>
   <w:abstractNum w:abstractNumId="2" w15:restartNumberingAfterBreak="0">
+    <w:nsid w:val="1DF31EB4"/>
+    <w:multiLevelType w:val="multilevel"/>
+    <w:tmpl w:val="2DECFCBC"/>
+    <w:lvl w:ilvl="0">
+      <w:start w:val="1"/>
+      <w:numFmt w:val="bullet"/>
+      <w:lvlText w:val=""/>
+      <w:lvlJc w:val="left"/>
+      <w:pPr>
+        <w:tabs>
+          <w:tab w:val="num" w:pos="720"/>
+        </w:tabs>
+        <w:ind w:left="720" w:hanging="360"/>
+      </w:pPr>
+      <w:rPr>
+        <w:rFonts w:ascii="Symbol" w:hAnsi="Symbol" w:hint="default"/>
+        <w:sz w:val="20"/>
+      </w:rPr>
+    </w:lvl>
+    <w:lvl w:ilvl="1" w:tentative="1">
+      <w:start w:val="1"/>
+      <w:numFmt w:val="bullet"/>
+      <w:lvlText w:val="o"/>
+      <w:lvlJc w:val="left"/>
+      <w:pPr>
+        <w:tabs>
+          <w:tab w:val="num" w:pos="1440"/>
+        </w:tabs>
+        <w:ind w:left="1440" w:hanging="360"/>
+      </w:pPr>
+      <w:rPr>
+        <w:rFonts w:ascii="Courier New" w:hAnsi="Courier New" w:hint="default"/>
+        <w:sz w:val="20"/>
+      </w:rPr>
+    </w:lvl>
+    <w:lvl w:ilvl="2" w:tentative="1">
+      <w:start w:val="1"/>
+      <w:numFmt w:val="bullet"/>
+      <w:lvlText w:val=""/>
+      <w:lvlJc w:val="left"/>
+      <w:pPr>
+        <w:tabs>
+          <w:tab w:val="num" w:pos="2160"/>
+        </w:tabs>
+        <w:ind w:left="2160" w:hanging="360"/>
+      </w:pPr>
+      <w:rPr>
+        <w:rFonts w:ascii="Wingdings" w:hAnsi="Wingdings" w:hint="default"/>
+        <w:sz w:val="20"/>
+      </w:rPr>
+    </w:lvl>
+    <w:lvl w:ilvl="3" w:tentative="1">
+      <w:start w:val="1"/>
+      <w:numFmt w:val="bullet"/>
+      <w:lvlText w:val=""/>
+      <w:lvlJc w:val="left"/>
+      <w:pPr>
+        <w:tabs>
+          <w:tab w:val="num" w:pos="2880"/>
+        </w:tabs>
+        <w:ind w:left="2880" w:hanging="360"/>
+      </w:pPr>
+      <w:rPr>
+        <w:rFonts w:ascii="Wingdings" w:hAnsi="Wingdings" w:hint="default"/>
+        <w:sz w:val="20"/>
+      </w:rPr>
+    </w:lvl>
+    <w:lvl w:ilvl="4" w:tentative="1">
+      <w:start w:val="1"/>
+      <w:numFmt w:val="bullet"/>
+      <w:lvlText w:val=""/>
+      <w:lvlJc w:val="left"/>
+      <w:pPr>
+        <w:tabs>
+          <w:tab w:val="num" w:pos="3600"/>
+        </w:tabs>
+        <w:ind w:left="3600" w:hanging="360"/>
+      </w:pPr>
+      <w:rPr>
+        <w:rFonts w:ascii="Wingdings" w:hAnsi="Wingdings" w:hint="default"/>
+        <w:sz w:val="20"/>
+      </w:rPr>
+    </w:lvl>
+    <w:lvl w:ilvl="5" w:tentative="1">
+      <w:start w:val="1"/>
+      <w:numFmt w:val="bullet"/>
+      <w:lvlText w:val=""/>
+      <w:lvlJc w:val="left"/>
+      <w:pPr>
+        <w:tabs>
+          <w:tab w:val="num" w:pos="4320"/>
+        </w:tabs>
+        <w:ind w:left="4320" w:hanging="360"/>
+      </w:pPr>
+      <w:rPr>
+        <w:rFonts w:ascii="Wingdings" w:hAnsi="Wingdings" w:hint="default"/>
+        <w:sz w:val="20"/>
+      </w:rPr>
+    </w:lvl>
+    <w:lvl w:ilvl="6" w:tentative="1">
+      <w:start w:val="1"/>
+      <w:numFmt w:val="bullet"/>
+      <w:lvlText w:val=""/>
+      <w:lvlJc w:val="left"/>
+      <w:pPr>
+        <w:tabs>
+          <w:tab w:val="num" w:pos="5040"/>
+        </w:tabs>
+        <w:ind w:left="5040" w:hanging="360"/>
+      </w:pPr>
+      <w:rPr>
+        <w:rFonts w:ascii="Wingdings" w:hAnsi="Wingdings" w:hint="default"/>
+        <w:sz w:val="20"/>
+      </w:rPr>
+    </w:lvl>
+    <w:lvl w:ilvl="7" w:tentative="1">
+      <w:start w:val="1"/>
+      <w:numFmt w:val="bullet"/>
+      <w:lvlText w:val=""/>
+      <w:lvlJc w:val="left"/>
+      <w:pPr>
+        <w:tabs>
+          <w:tab w:val="num" w:pos="5760"/>
+        </w:tabs>
+        <w:ind w:left="5760" w:hanging="360"/>
+      </w:pPr>
+      <w:rPr>
+        <w:rFonts w:ascii="Wingdings" w:hAnsi="Wingdings" w:hint="default"/>
+        <w:sz w:val="20"/>
+      </w:rPr>
+    </w:lvl>
+    <w:lvl w:ilvl="8" w:tentative="1">
+      <w:start w:val="1"/>
+      <w:numFmt w:val="bullet"/>
+      <w:lvlText w:val=""/>
+      <w:lvlJc w:val="left"/>
+      <w:pPr>
+        <w:tabs>
+          <w:tab w:val="num" w:pos="6480"/>
+        </w:tabs>
+        <w:ind w:left="6480" w:hanging="360"/>
+      </w:pPr>
+      <w:rPr>
+        <w:rFonts w:ascii="Wingdings" w:hAnsi="Wingdings" w:hint="default"/>
+        <w:sz w:val="20"/>
+      </w:rPr>
+    </w:lvl>
+  </w:abstractNum>
+  <w:abstractNum w:abstractNumId="3" w15:restartNumberingAfterBreak="0">
+    <w:nsid w:val="263E5557"/>
+    <w:multiLevelType w:val="multilevel"/>
+    <w:tmpl w:val="6A04764A"/>
+    <w:lvl w:ilvl="0">
+      <w:start w:val="1"/>
+      <w:numFmt w:val="bullet"/>
+      <w:lvlText w:val=""/>
+      <w:lvlJc w:val="left"/>
+      <w:pPr>
+        <w:tabs>
+          <w:tab w:val="num" w:pos="720"/>
+        </w:tabs>
+        <w:ind w:left="720" w:hanging="360"/>
+      </w:pPr>
+      <w:rPr>
+        <w:rFonts w:ascii="Symbol" w:hAnsi="Symbol" w:hint="default"/>
+        <w:sz w:val="20"/>
+      </w:rPr>
+    </w:lvl>
+    <w:lvl w:ilvl="1" w:tentative="1">
+      <w:start w:val="1"/>
+      <w:numFmt w:val="bullet"/>
+      <w:lvlText w:val="o"/>
+      <w:lvlJc w:val="left"/>
+      <w:pPr>
+        <w:tabs>
+          <w:tab w:val="num" w:pos="1440"/>
+        </w:tabs>
+        <w:ind w:left="1440" w:hanging="360"/>
+      </w:pPr>
+      <w:rPr>
+        <w:rFonts w:ascii="Courier New" w:hAnsi="Courier New" w:hint="default"/>
+        <w:sz w:val="20"/>
+      </w:rPr>
+    </w:lvl>
+    <w:lvl w:ilvl="2" w:tentative="1">
+      <w:start w:val="1"/>
+      <w:numFmt w:val="bullet"/>
+      <w:lvlText w:val=""/>
+      <w:lvlJc w:val="left"/>
+      <w:pPr>
+        <w:tabs>
+          <w:tab w:val="num" w:pos="2160"/>
+        </w:tabs>
+        <w:ind w:left="2160" w:hanging="360"/>
+      </w:pPr>
+      <w:rPr>
+        <w:rFonts w:ascii="Wingdings" w:hAnsi="Wingdings" w:hint="default"/>
+        <w:sz w:val="20"/>
+      </w:rPr>
+    </w:lvl>
+    <w:lvl w:ilvl="3" w:tentative="1">
+      <w:start w:val="1"/>
+      <w:numFmt w:val="bullet"/>
+      <w:lvlText w:val=""/>
+      <w:lvlJc w:val="left"/>
+      <w:pPr>
+        <w:tabs>
+          <w:tab w:val="num" w:pos="2880"/>
+        </w:tabs>
+        <w:ind w:left="2880" w:hanging="360"/>
+      </w:pPr>
+      <w:rPr>
+        <w:rFonts w:ascii="Wingdings" w:hAnsi="Wingdings" w:hint="default"/>
+        <w:sz w:val="20"/>
+      </w:rPr>
+    </w:lvl>
+    <w:lvl w:ilvl="4" w:tentative="1">
+      <w:start w:val="1"/>
+      <w:numFmt w:val="bullet"/>
+      <w:lvlText w:val=""/>
+      <w:lvlJc w:val="left"/>
+      <w:pPr>
+        <w:tabs>
+          <w:tab w:val="num" w:pos="3600"/>
+        </w:tabs>
+        <w:ind w:left="3600" w:hanging="360"/>
+      </w:pPr>
+      <w:rPr>
+        <w:rFonts w:ascii="Wingdings" w:hAnsi="Wingdings" w:hint="default"/>
+        <w:sz w:val="20"/>
+      </w:rPr>
+    </w:lvl>
+    <w:lvl w:ilvl="5" w:tentative="1">
+      <w:start w:val="1"/>
+      <w:numFmt w:val="bullet"/>
+      <w:lvlText w:val=""/>
+      <w:lvlJc w:val="left"/>
+      <w:pPr>
+        <w:tabs>
+          <w:tab w:val="num" w:pos="4320"/>
+        </w:tabs>
+        <w:ind w:left="4320" w:hanging="360"/>
+      </w:pPr>
+      <w:rPr>
+        <w:rFonts w:ascii="Wingdings" w:hAnsi="Wingdings" w:hint="default"/>
+        <w:sz w:val="20"/>
+      </w:rPr>
+    </w:lvl>
+    <w:lvl w:ilvl="6" w:tentative="1">
+      <w:start w:val="1"/>
+      <w:numFmt w:val="bullet"/>
+      <w:lvlText w:val=""/>
+      <w:lvlJc w:val="left"/>
+      <w:pPr>
+        <w:tabs>
+          <w:tab w:val="num" w:pos="5040"/>
+        </w:tabs>
+        <w:ind w:left="5040" w:hanging="360"/>
+      </w:pPr>
+      <w:rPr>
+        <w:rFonts w:ascii="Wingdings" w:hAnsi="Wingdings" w:hint="default"/>
+        <w:sz w:val="20"/>
+      </w:rPr>
+    </w:lvl>
+    <w:lvl w:ilvl="7" w:tentative="1">
+      <w:start w:val="1"/>
+      <w:numFmt w:val="bullet"/>
+      <w:lvlText w:val=""/>
+      <w:lvlJc w:val="left"/>
+      <w:pPr>
+        <w:tabs>
+          <w:tab w:val="num" w:pos="5760"/>
+        </w:tabs>
+        <w:ind w:left="5760" w:hanging="360"/>
+      </w:pPr>
+      <w:rPr>
+        <w:rFonts w:ascii="Wingdings" w:hAnsi="Wingdings" w:hint="default"/>
+        <w:sz w:val="20"/>
+      </w:rPr>
+    </w:lvl>
+    <w:lvl w:ilvl="8" w:tentative="1">
+      <w:start w:val="1"/>
+      <w:numFmt w:val="bullet"/>
+      <w:lvlText w:val=""/>
+      <w:lvlJc w:val="left"/>
+      <w:pPr>
+        <w:tabs>
+          <w:tab w:val="num" w:pos="6480"/>
+        </w:tabs>
+        <w:ind w:left="6480" w:hanging="360"/>
+      </w:pPr>
+      <w:rPr>
+        <w:rFonts w:ascii="Wingdings" w:hAnsi="Wingdings" w:hint="default"/>
+        <w:sz w:val="20"/>
+      </w:rPr>
+    </w:lvl>
+  </w:abstractNum>
+  <w:abstractNum w:abstractNumId="4" w15:restartNumberingAfterBreak="0">
+    <w:nsid w:val="3BA16064"/>
+    <w:multiLevelType w:val="multilevel"/>
+    <w:tmpl w:val="368E45FA"/>
+    <w:lvl w:ilvl="0">
+      <w:start w:val="1"/>
+      <w:numFmt w:val="bullet"/>
+      <w:lvlText w:val=""/>
+      <w:lvlJc w:val="left"/>
+      <w:pPr>
+        <w:tabs>
+          <w:tab w:val="num" w:pos="720"/>
+        </w:tabs>
+        <w:ind w:left="720" w:hanging="360"/>
+      </w:pPr>
+      <w:rPr>
+        <w:rFonts w:ascii="Symbol" w:hAnsi="Symbol" w:hint="default"/>
+        <w:sz w:val="20"/>
+      </w:rPr>
+    </w:lvl>
+    <w:lvl w:ilvl="1" w:tentative="1">
+      <w:start w:val="1"/>
+      <w:numFmt w:val="bullet"/>
+      <w:lvlText w:val="o"/>
+      <w:lvlJc w:val="left"/>
+      <w:pPr>
+        <w:tabs>
+          <w:tab w:val="num" w:pos="1440"/>
+        </w:tabs>
+        <w:ind w:left="1440" w:hanging="360"/>
+      </w:pPr>
+      <w:rPr>
+        <w:rFonts w:ascii="Courier New" w:hAnsi="Courier New" w:hint="default"/>
+        <w:sz w:val="20"/>
+      </w:rPr>
+    </w:lvl>
+    <w:lvl w:ilvl="2" w:tentative="1">
+      <w:start w:val="1"/>
+      <w:numFmt w:val="bullet"/>
+      <w:lvlText w:val=""/>
+      <w:lvlJc w:val="left"/>
+      <w:pPr>
+        <w:tabs>
+          <w:tab w:val="num" w:pos="2160"/>
+        </w:tabs>
+        <w:ind w:left="2160" w:hanging="360"/>
+      </w:pPr>
+      <w:rPr>
+        <w:rFonts w:ascii="Wingdings" w:hAnsi="Wingdings" w:hint="default"/>
+        <w:sz w:val="20"/>
+      </w:rPr>
+    </w:lvl>
+    <w:lvl w:ilvl="3" w:tentative="1">
+      <w:start w:val="1"/>
+      <w:numFmt w:val="bullet"/>
+      <w:lvlText w:val=""/>
+      <w:lvlJc w:val="left"/>
+      <w:pPr>
+        <w:tabs>
+          <w:tab w:val="num" w:pos="2880"/>
+        </w:tabs>
+        <w:ind w:left="2880" w:hanging="360"/>
+      </w:pPr>
+      <w:rPr>
+        <w:rFonts w:ascii="Wingdings" w:hAnsi="Wingdings" w:hint="default"/>
+        <w:sz w:val="20"/>
+      </w:rPr>
+    </w:lvl>
+    <w:lvl w:ilvl="4" w:tentative="1">
+      <w:start w:val="1"/>
+      <w:numFmt w:val="bullet"/>
+      <w:lvlText w:val=""/>
+      <w:lvlJc w:val="left"/>
+      <w:pPr>
+        <w:tabs>
+          <w:tab w:val="num" w:pos="3600"/>
+        </w:tabs>
+        <w:ind w:left="3600" w:hanging="360"/>
+      </w:pPr>
+      <w:rPr>
+        <w:rFonts w:ascii="Wingdings" w:hAnsi="Wingdings" w:hint="default"/>
+        <w:sz w:val="20"/>
+      </w:rPr>
+    </w:lvl>
+    <w:lvl w:ilvl="5" w:tentative="1">
+      <w:start w:val="1"/>
+      <w:numFmt w:val="bullet"/>
+      <w:lvlText w:val=""/>
+      <w:lvlJc w:val="left"/>
+      <w:pPr>
+        <w:tabs>
+          <w:tab w:val="num" w:pos="4320"/>
+        </w:tabs>
+        <w:ind w:left="4320" w:hanging="360"/>
+      </w:pPr>
+      <w:rPr>
+        <w:rFonts w:ascii="Wingdings" w:hAnsi="Wingdings" w:hint="default"/>
+        <w:sz w:val="20"/>
+      </w:rPr>
+    </w:lvl>
+    <w:lvl w:ilvl="6" w:tentative="1">
+      <w:start w:val="1"/>
+      <w:numFmt w:val="bullet"/>
+      <w:lvlText w:val=""/>
+      <w:lvlJc w:val="left"/>
+      <w:pPr>
+        <w:tabs>
+          <w:tab w:val="num" w:pos="5040"/>
+        </w:tabs>
+        <w:ind w:left="5040" w:hanging="360"/>
+      </w:pPr>
+      <w:rPr>
+        <w:rFonts w:ascii="Wingdings" w:hAnsi="Wingdings" w:hint="default"/>
+        <w:sz w:val="20"/>
+      </w:rPr>
+    </w:lvl>
+    <w:lvl w:ilvl="7" w:tentative="1">
+      <w:start w:val="1"/>
+      <w:numFmt w:val="bullet"/>
+      <w:lvlText w:val=""/>
+      <w:lvlJc w:val="left"/>
+      <w:pPr>
+        <w:tabs>
+          <w:tab w:val="num" w:pos="5760"/>
+        </w:tabs>
+        <w:ind w:left="5760" w:hanging="360"/>
+      </w:pPr>
+      <w:rPr>
+        <w:rFonts w:ascii="Wingdings" w:hAnsi="Wingdings" w:hint="default"/>
+        <w:sz w:val="20"/>
+      </w:rPr>
+    </w:lvl>
+    <w:lvl w:ilvl="8" w:tentative="1">
+      <w:start w:val="1"/>
+      <w:numFmt w:val="bullet"/>
+      <w:lvlText w:val=""/>
+      <w:lvlJc w:val="left"/>
+      <w:pPr>
+        <w:tabs>
+          <w:tab w:val="num" w:pos="6480"/>
+        </w:tabs>
+        <w:ind w:left="6480" w:hanging="360"/>
+      </w:pPr>
+      <w:rPr>
+        <w:rFonts w:ascii="Wingdings" w:hAnsi="Wingdings" w:hint="default"/>
+        <w:sz w:val="20"/>
+      </w:rPr>
+    </w:lvl>
+  </w:abstractNum>
+  <w:abstractNum w:abstractNumId="5" w15:restartNumberingAfterBreak="0">
+    <w:nsid w:val="47DC03D9"/>
+    <w:multiLevelType w:val="multilevel"/>
+    <w:tmpl w:val="8CF86EDA"/>
+    <w:lvl w:ilvl="0">
+      <w:start w:val="1"/>
+      <w:numFmt w:val="bullet"/>
+      <w:lvlText w:val=""/>
+      <w:lvlJc w:val="left"/>
+      <w:pPr>
+        <w:tabs>
+          <w:tab w:val="num" w:pos="720"/>
+        </w:tabs>
+        <w:ind w:left="720" w:hanging="360"/>
+      </w:pPr>
+      <w:rPr>
+        <w:rFonts w:ascii="Symbol" w:hAnsi="Symbol" w:hint="default"/>
+        <w:sz w:val="20"/>
+      </w:rPr>
+    </w:lvl>
+    <w:lvl w:ilvl="1" w:tentative="1">
+      <w:start w:val="1"/>
+      <w:numFmt w:val="bullet"/>
+      <w:lvlText w:val="o"/>
+      <w:lvlJc w:val="left"/>
+      <w:pPr>
+        <w:tabs>
+          <w:tab w:val="num" w:pos="1440"/>
+        </w:tabs>
+        <w:ind w:left="1440" w:hanging="360"/>
+      </w:pPr>
+      <w:rPr>
+        <w:rFonts w:ascii="Courier New" w:hAnsi="Courier New" w:hint="default"/>
+        <w:sz w:val="20"/>
+      </w:rPr>
+    </w:lvl>
+    <w:lvl w:ilvl="2" w:tentative="1">
+      <w:start w:val="1"/>
+      <w:numFmt w:val="bullet"/>
+      <w:lvlText w:val=""/>
+      <w:lvlJc w:val="left"/>
+      <w:pPr>
+        <w:tabs>
+          <w:tab w:val="num" w:pos="2160"/>
+        </w:tabs>
+        <w:ind w:left="2160" w:hanging="360"/>
+      </w:pPr>
+      <w:rPr>
+        <w:rFonts w:ascii="Wingdings" w:hAnsi="Wingdings" w:hint="default"/>
+        <w:sz w:val="20"/>
+      </w:rPr>
+    </w:lvl>
+    <w:lvl w:ilvl="3" w:tentative="1">
+      <w:start w:val="1"/>
+      <w:numFmt w:val="bullet"/>
+      <w:lvlText w:val=""/>
+      <w:lvlJc w:val="left"/>
+      <w:pPr>
+        <w:tabs>
+          <w:tab w:val="num" w:pos="2880"/>
+        </w:tabs>
+        <w:ind w:left="2880" w:hanging="360"/>
+      </w:pPr>
+      <w:rPr>
+        <w:rFonts w:ascii="Wingdings" w:hAnsi="Wingdings" w:hint="default"/>
+        <w:sz w:val="20"/>
+      </w:rPr>
+    </w:lvl>
+    <w:lvl w:ilvl="4" w:tentative="1">
+      <w:start w:val="1"/>
+      <w:numFmt w:val="bullet"/>
+      <w:lvlText w:val=""/>
+      <w:lvlJc w:val="left"/>
+      <w:pPr>
+        <w:tabs>
+          <w:tab w:val="num" w:pos="3600"/>
+        </w:tabs>
+        <w:ind w:left="3600" w:hanging="360"/>
+      </w:pPr>
+      <w:rPr>
+        <w:rFonts w:ascii="Wingdings" w:hAnsi="Wingdings" w:hint="default"/>
+        <w:sz w:val="20"/>
+      </w:rPr>
+    </w:lvl>
+    <w:lvl w:ilvl="5" w:tentative="1">
+      <w:start w:val="1"/>
+      <w:numFmt w:val="bullet"/>
+      <w:lvlText w:val=""/>
+      <w:lvlJc w:val="left"/>
+      <w:pPr>
+        <w:tabs>
+          <w:tab w:val="num" w:pos="4320"/>
+        </w:tabs>
+        <w:ind w:left="4320" w:hanging="360"/>
+      </w:pPr>
+      <w:rPr>
+        <w:rFonts w:ascii="Wingdings" w:hAnsi="Wingdings" w:hint="default"/>
+        <w:sz w:val="20"/>
+      </w:rPr>
+    </w:lvl>
+    <w:lvl w:ilvl="6" w:tentative="1">
+      <w:start w:val="1"/>
+      <w:numFmt w:val="bullet"/>
+      <w:lvlText w:val=""/>
+      <w:lvlJc w:val="left"/>
+      <w:pPr>
+        <w:tabs>
+          <w:tab w:val="num" w:pos="5040"/>
+        </w:tabs>
+        <w:ind w:left="5040" w:hanging="360"/>
+      </w:pPr>
+      <w:rPr>
+        <w:rFonts w:ascii="Wingdings" w:hAnsi="Wingdings" w:hint="default"/>
+        <w:sz w:val="20"/>
+      </w:rPr>
+    </w:lvl>
+    <w:lvl w:ilvl="7" w:tentative="1">
+      <w:start w:val="1"/>
+      <w:numFmt w:val="bullet"/>
+      <w:lvlText w:val=""/>
+      <w:lvlJc w:val="left"/>
+      <w:pPr>
+        <w:tabs>
+          <w:tab w:val="num" w:pos="5760"/>
+        </w:tabs>
+        <w:ind w:left="5760" w:hanging="360"/>
+      </w:pPr>
+      <w:rPr>
+        <w:rFonts w:ascii="Wingdings" w:hAnsi="Wingdings" w:hint="default"/>
+        <w:sz w:val="20"/>
+      </w:rPr>
+    </w:lvl>
+    <w:lvl w:ilvl="8" w:tentative="1">
+      <w:start w:val="1"/>
+      <w:numFmt w:val="bullet"/>
+      <w:lvlText w:val=""/>
+      <w:lvlJc w:val="left"/>
+      <w:pPr>
+        <w:tabs>
+          <w:tab w:val="num" w:pos="6480"/>
+        </w:tabs>
+        <w:ind w:left="6480" w:hanging="360"/>
+      </w:pPr>
+      <w:rPr>
+        <w:rFonts w:ascii="Wingdings" w:hAnsi="Wingdings" w:hint="default"/>
+        <w:sz w:val="20"/>
+      </w:rPr>
+    </w:lvl>
+  </w:abstractNum>
+  <w:abstractNum w:abstractNumId="6" w15:restartNumberingAfterBreak="0">
     <w:nsid w:val="64FF530C"/>
     <w:multiLevelType w:val="multilevel"/>
     <w:tmpl w:val="97145B8A"/>
@@ -2415,14 +3957,178 @@
       </w:rPr>
     </w:lvl>
   </w:abstractNum>
+  <w:abstractNum w:abstractNumId="7" w15:restartNumberingAfterBreak="0">
+    <w:nsid w:val="7FFB250A"/>
+    <w:multiLevelType w:val="multilevel"/>
+    <w:tmpl w:val="59384012"/>
+    <w:lvl w:ilvl="0">
+      <w:start w:val="1"/>
+      <w:numFmt w:val="bullet"/>
+      <w:lvlText w:val=""/>
+      <w:lvlJc w:val="left"/>
+      <w:pPr>
+        <w:tabs>
+          <w:tab w:val="num" w:pos="720"/>
+        </w:tabs>
+        <w:ind w:left="720" w:hanging="360"/>
+      </w:pPr>
+      <w:rPr>
+        <w:rFonts w:ascii="Symbol" w:hAnsi="Symbol" w:hint="default"/>
+        <w:sz w:val="20"/>
+      </w:rPr>
+    </w:lvl>
+    <w:lvl w:ilvl="1" w:tentative="1">
+      <w:start w:val="1"/>
+      <w:numFmt w:val="bullet"/>
+      <w:lvlText w:val="o"/>
+      <w:lvlJc w:val="left"/>
+      <w:pPr>
+        <w:tabs>
+          <w:tab w:val="num" w:pos="1440"/>
+        </w:tabs>
+        <w:ind w:left="1440" w:hanging="360"/>
+      </w:pPr>
+      <w:rPr>
+        <w:rFonts w:ascii="Courier New" w:hAnsi="Courier New" w:hint="default"/>
+        <w:sz w:val="20"/>
+      </w:rPr>
+    </w:lvl>
+    <w:lvl w:ilvl="2" w:tentative="1">
+      <w:start w:val="1"/>
+      <w:numFmt w:val="bullet"/>
+      <w:lvlText w:val=""/>
+      <w:lvlJc w:val="left"/>
+      <w:pPr>
+        <w:tabs>
+          <w:tab w:val="num" w:pos="2160"/>
+        </w:tabs>
+        <w:ind w:left="2160" w:hanging="360"/>
+      </w:pPr>
+      <w:rPr>
+        <w:rFonts w:ascii="Wingdings" w:hAnsi="Wingdings" w:hint="default"/>
+        <w:sz w:val="20"/>
+      </w:rPr>
+    </w:lvl>
+    <w:lvl w:ilvl="3" w:tentative="1">
+      <w:start w:val="1"/>
+      <w:numFmt w:val="bullet"/>
+      <w:lvlText w:val=""/>
+      <w:lvlJc w:val="left"/>
+      <w:pPr>
+        <w:tabs>
+          <w:tab w:val="num" w:pos="2880"/>
+        </w:tabs>
+        <w:ind w:left="2880" w:hanging="360"/>
+      </w:pPr>
+      <w:rPr>
+        <w:rFonts w:ascii="Wingdings" w:hAnsi="Wingdings" w:hint="default"/>
+        <w:sz w:val="20"/>
+      </w:rPr>
+    </w:lvl>
+    <w:lvl w:ilvl="4" w:tentative="1">
+      <w:start w:val="1"/>
+      <w:numFmt w:val="bullet"/>
+      <w:lvlText w:val=""/>
+      <w:lvlJc w:val="left"/>
+      <w:pPr>
+        <w:tabs>
+          <w:tab w:val="num" w:pos="3600"/>
+        </w:tabs>
+        <w:ind w:left="3600" w:hanging="360"/>
+      </w:pPr>
+      <w:rPr>
+        <w:rFonts w:ascii="Wingdings" w:hAnsi="Wingdings" w:hint="default"/>
+        <w:sz w:val="20"/>
+      </w:rPr>
+    </w:lvl>
+    <w:lvl w:ilvl="5" w:tentative="1">
+      <w:start w:val="1"/>
+      <w:numFmt w:val="bullet"/>
+      <w:lvlText w:val=""/>
+      <w:lvlJc w:val="left"/>
+      <w:pPr>
+        <w:tabs>
+          <w:tab w:val="num" w:pos="4320"/>
+        </w:tabs>
+        <w:ind w:left="4320" w:hanging="360"/>
+      </w:pPr>
+      <w:rPr>
+        <w:rFonts w:ascii="Wingdings" w:hAnsi="Wingdings" w:hint="default"/>
+        <w:sz w:val="20"/>
+      </w:rPr>
+    </w:lvl>
+    <w:lvl w:ilvl="6" w:tentative="1">
+      <w:start w:val="1"/>
+      <w:numFmt w:val="bullet"/>
+      <w:lvlText w:val=""/>
+      <w:lvlJc w:val="left"/>
+      <w:pPr>
+        <w:tabs>
+          <w:tab w:val="num" w:pos="5040"/>
+        </w:tabs>
+        <w:ind w:left="5040" w:hanging="360"/>
+      </w:pPr>
+      <w:rPr>
+        <w:rFonts w:ascii="Wingdings" w:hAnsi="Wingdings" w:hint="default"/>
+        <w:sz w:val="20"/>
+      </w:rPr>
+    </w:lvl>
+    <w:lvl w:ilvl="7" w:tentative="1">
+      <w:start w:val="1"/>
+      <w:numFmt w:val="bullet"/>
+      <w:lvlText w:val=""/>
+      <w:lvlJc w:val="left"/>
+      <w:pPr>
+        <w:tabs>
+          <w:tab w:val="num" w:pos="5760"/>
+        </w:tabs>
+        <w:ind w:left="5760" w:hanging="360"/>
+      </w:pPr>
+      <w:rPr>
+        <w:rFonts w:ascii="Wingdings" w:hAnsi="Wingdings" w:hint="default"/>
+        <w:sz w:val="20"/>
+      </w:rPr>
+    </w:lvl>
+    <w:lvl w:ilvl="8" w:tentative="1">
+      <w:start w:val="1"/>
+      <w:numFmt w:val="bullet"/>
+      <w:lvlText w:val=""/>
+      <w:lvlJc w:val="left"/>
+      <w:pPr>
+        <w:tabs>
+          <w:tab w:val="num" w:pos="6480"/>
+        </w:tabs>
+        <w:ind w:left="6480" w:hanging="360"/>
+      </w:pPr>
+      <w:rPr>
+        <w:rFonts w:ascii="Wingdings" w:hAnsi="Wingdings" w:hint="default"/>
+        <w:sz w:val="20"/>
+      </w:rPr>
+    </w:lvl>
+  </w:abstractNum>
   <w:num w:numId="1" w16cid:durableId="743068070">
-    <w:abstractNumId w:val="2"/>
+    <w:abstractNumId w:val="6"/>
   </w:num>
   <w:num w:numId="2" w16cid:durableId="944579289">
     <w:abstractNumId w:val="0"/>
   </w:num>
   <w:num w:numId="3" w16cid:durableId="33434850">
     <w:abstractNumId w:val="1"/>
+  </w:num>
+  <w:num w:numId="4" w16cid:durableId="98574562">
+    <w:abstractNumId w:val="4"/>
+  </w:num>
+  <w:num w:numId="5" w16cid:durableId="2110420785">
+    <w:abstractNumId w:val="5"/>
+  </w:num>
+  <w:num w:numId="6" w16cid:durableId="1259095550">
+    <w:abstractNumId w:val="3"/>
+  </w:num>
+  <w:num w:numId="7" w16cid:durableId="906653135">
+    <w:abstractNumId w:val="2"/>
+  </w:num>
+  <w:num w:numId="8" w16cid:durableId="588461709">
+    <w:abstractNumId w:val="7"/>
   </w:num>
 </w:numbering>
 </file>
@@ -2819,6 +4525,7 @@
   <w:style w:type="paragraph" w:default="1" w:styleId="Normal">
     <w:name w:val="Normal"/>
     <w:qFormat/>
+    <w:rsid w:val="006D2D06"/>
     <w:rPr>
       <w:rFonts w:eastAsiaTheme="minorEastAsia"/>
       <w:sz w:val="24"/>
@@ -2895,7 +4602,6 @@
   <w:style w:type="character" w:default="1" w:styleId="DefaultParagraphFont">
     <w:name w:val="Default Paragraph Font"/>
     <w:uiPriority w:val="1"/>
-    <w:semiHidden/>
     <w:unhideWhenUsed/>
   </w:style>
   <w:style w:type="table" w:default="1" w:styleId="TableNormal">

</xml_diff>

<commit_message>
added images and updated the IDE page of the website plan
</commit_message>
<xml_diff>
--- a/hoffman-site-plan.docx
+++ b/hoffman-site-plan.docx
@@ -1028,12 +1028,22 @@
           <w:bCs/>
         </w:rPr>
       </w:pPr>
-      <w:r>
-        <w:rPr>
-          <w:rFonts w:eastAsia="Times New Roman"/>
-          <w:b/>
-          <w:bCs/>
-        </w:rPr>
+    </w:p>
+    <w:p>
+      <w:pPr>
+        <w:rPr>
+          <w:rFonts w:eastAsia="Times New Roman"/>
+          <w:b/>
+          <w:bCs/>
+        </w:rPr>
+      </w:pPr>
+      <w:r>
+        <w:rPr>
+          <w:rFonts w:eastAsia="Times New Roman"/>
+          <w:b/>
+          <w:bCs/>
+        </w:rPr>
+        <w:lastRenderedPageBreak/>
         <w:t>Explore Languages:</w:t>
       </w:r>
     </w:p>
@@ -1055,7 +1065,6 @@
           <w:b/>
           <w:bCs/>
         </w:rPr>
-        <w:lastRenderedPageBreak/>
         <w:t xml:space="preserve">The Powerhouses: </w:t>
       </w:r>
       <w:r>
@@ -1853,6 +1862,1746 @@
           <w:rFonts w:eastAsia="Times New Roman"/>
           <w:b/>
           <w:bCs/>
+        </w:rPr>
+      </w:pPr>
+      <w:r>
+        <w:rPr>
+          <w:rFonts w:ascii="Segoe UI Emoji" w:eastAsia="Times New Roman" w:hAnsi="Segoe UI Emoji" w:cs="Segoe UI Emoji"/>
+          <w:b/>
+          <w:bCs/>
+        </w:rPr>
+        <w:t>🔧</w:t>
+      </w:r>
+      <w:r>
+        <w:rPr>
+          <w:rFonts w:eastAsia="Times New Roman"/>
+          <w:b/>
+          <w:bCs/>
+        </w:rPr>
+        <w:t xml:space="preserve"> Why IDEs Matter</w:t>
+      </w:r>
+    </w:p>
+    <w:p>
+      <w:pPr>
+        <w:rPr>
+          <w:rFonts w:eastAsia="Times New Roman"/>
+        </w:rPr>
+      </w:pPr>
+      <w:r>
+        <w:rPr>
+          <w:rFonts w:eastAsia="Times New Roman"/>
+        </w:rPr>
+        <w:t>Integrated Development Environments (IDEs) are more than just code editors—they are full ecosystems designed to improve developer productivity, reduce errors, and streamline workflows.</w:t>
+      </w:r>
+    </w:p>
+    <w:p>
+      <w:pPr>
+        <w:rPr>
+          <w:rFonts w:eastAsia="Times New Roman"/>
+        </w:rPr>
+      </w:pPr>
+      <w:r>
+        <w:rPr>
+          <w:rFonts w:eastAsia="Times New Roman"/>
+        </w:rPr>
+        <w:t>Modern IDEs provide tools that help developers:</w:t>
+      </w:r>
+    </w:p>
+    <w:p>
+      <w:pPr>
+        <w:numPr>
+          <w:ilvl w:val="0"/>
+          <w:numId w:val="9"/>
+        </w:numPr>
+        <w:rPr>
+          <w:rFonts w:eastAsia="Times New Roman"/>
+        </w:rPr>
+      </w:pPr>
+      <w:r>
+        <w:rPr>
+          <w:rFonts w:eastAsia="Times New Roman"/>
+        </w:rPr>
+        <w:t>Write code faster with auto-completion</w:t>
+      </w:r>
+    </w:p>
+    <w:p>
+      <w:pPr>
+        <w:numPr>
+          <w:ilvl w:val="0"/>
+          <w:numId w:val="9"/>
+        </w:numPr>
+        <w:rPr>
+          <w:rFonts w:eastAsia="Times New Roman"/>
+        </w:rPr>
+      </w:pPr>
+      <w:r>
+        <w:rPr>
+          <w:rFonts w:eastAsia="Times New Roman"/>
+        </w:rPr>
+        <w:t>Detect bugs early with real-time error checking</w:t>
+      </w:r>
+    </w:p>
+    <w:p>
+      <w:pPr>
+        <w:numPr>
+          <w:ilvl w:val="0"/>
+          <w:numId w:val="9"/>
+        </w:numPr>
+        <w:rPr>
+          <w:rFonts w:eastAsia="Times New Roman"/>
+        </w:rPr>
+      </w:pPr>
+      <w:r>
+        <w:rPr>
+          <w:rFonts w:eastAsia="Times New Roman"/>
+        </w:rPr>
+        <w:t>Debug efficiently with step-by-step execution</w:t>
+      </w:r>
+    </w:p>
+    <w:p>
+      <w:pPr>
+        <w:numPr>
+          <w:ilvl w:val="0"/>
+          <w:numId w:val="9"/>
+        </w:numPr>
+        <w:rPr>
+          <w:rFonts w:eastAsia="Times New Roman"/>
+        </w:rPr>
+      </w:pPr>
+      <w:r>
+        <w:rPr>
+          <w:rFonts w:eastAsia="Times New Roman"/>
+        </w:rPr>
+        <w:t>Manage large projects with file organization and navigation tools</w:t>
+      </w:r>
+    </w:p>
+    <w:p>
+      <w:pPr>
+        <w:rPr>
+          <w:rFonts w:eastAsia="Times New Roman"/>
+        </w:rPr>
+      </w:pPr>
+      <w:r>
+        <w:rPr>
+          <w:rFonts w:eastAsia="Times New Roman"/>
+        </w:rPr>
+        <w:t>Choosing the right IDE can significantly impact both learning speed and development efficiency.</w:t>
+      </w:r>
+    </w:p>
+    <w:p>
+      <w:pPr>
+        <w:rPr>
+          <w:rFonts w:eastAsia="Times New Roman"/>
+        </w:rPr>
+      </w:pPr>
+    </w:p>
+    <w:p>
+      <w:pPr>
+        <w:rPr>
+          <w:rFonts w:eastAsia="Times New Roman"/>
+          <w:b/>
+          <w:bCs/>
+        </w:rPr>
+      </w:pPr>
+      <w:r>
+        <w:rPr>
+          <w:rFonts w:ascii="Segoe UI Emoji" w:eastAsia="Times New Roman" w:hAnsi="Segoe UI Emoji" w:cs="Segoe UI Emoji"/>
+          <w:b/>
+          <w:bCs/>
+        </w:rPr>
+        <w:t>⚙️</w:t>
+      </w:r>
+      <w:r>
+        <w:rPr>
+          <w:rFonts w:eastAsia="Times New Roman"/>
+          <w:b/>
+          <w:bCs/>
+        </w:rPr>
+        <w:t xml:space="preserve"> Key Features to Look For in an IDE</w:t>
+      </w:r>
+    </w:p>
+    <w:p>
+      <w:pPr>
+        <w:rPr>
+          <w:rFonts w:eastAsia="Times New Roman"/>
+        </w:rPr>
+      </w:pPr>
+      <w:r>
+        <w:rPr>
+          <w:rFonts w:eastAsia="Times New Roman"/>
+        </w:rPr>
+        <w:t>When comparing IDEs, there are several core features that define their effectiveness:</w:t>
+      </w:r>
+    </w:p>
+    <w:p>
+      <w:pPr>
+        <w:rPr>
+          <w:rFonts w:eastAsia="Times New Roman"/>
+        </w:rPr>
+      </w:pPr>
+    </w:p>
+    <w:p>
+      <w:pPr>
+        <w:rPr>
+          <w:rFonts w:eastAsia="Times New Roman"/>
+          <w:b/>
+          <w:bCs/>
+        </w:rPr>
+      </w:pPr>
+      <w:r>
+        <w:rPr>
+          <w:rFonts w:ascii="Segoe UI Emoji" w:eastAsia="Times New Roman" w:hAnsi="Segoe UI Emoji" w:cs="Segoe UI Emoji"/>
+          <w:b/>
+          <w:bCs/>
+        </w:rPr>
+        <w:t>🧠</w:t>
+      </w:r>
+      <w:r>
+        <w:rPr>
+          <w:rFonts w:eastAsia="Times New Roman"/>
+          <w:b/>
+          <w:bCs/>
+        </w:rPr>
+        <w:t xml:space="preserve"> Intelligent Code Completion</w:t>
+      </w:r>
+    </w:p>
+    <w:p>
+      <w:pPr>
+        <w:rPr>
+          <w:rFonts w:eastAsia="Times New Roman"/>
+        </w:rPr>
+      </w:pPr>
+      <w:r>
+        <w:rPr>
+          <w:rFonts w:eastAsia="Times New Roman"/>
+        </w:rPr>
+        <w:t>Smart suggestions that predict what you’re typing and reduce repetitive coding.</w:t>
+      </w:r>
+    </w:p>
+    <w:p>
+      <w:pPr>
+        <w:rPr>
+          <w:rFonts w:eastAsia="Times New Roman"/>
+        </w:rPr>
+      </w:pPr>
+    </w:p>
+    <w:p>
+      <w:pPr>
+        <w:rPr>
+          <w:rFonts w:eastAsia="Times New Roman"/>
+          <w:b/>
+          <w:bCs/>
+        </w:rPr>
+      </w:pPr>
+      <w:r>
+        <w:rPr>
+          <w:rFonts w:eastAsia="Times New Roman"/>
+          <w:b/>
+          <w:bCs/>
+        </w:rPr>
+        <w:t>Debugging Tools</w:t>
+      </w:r>
+    </w:p>
+    <w:p>
+      <w:pPr>
+        <w:rPr>
+          <w:rFonts w:eastAsia="Times New Roman"/>
+        </w:rPr>
+      </w:pPr>
+      <w:r>
+        <w:rPr>
+          <w:rFonts w:eastAsia="Times New Roman"/>
+        </w:rPr>
+        <w:t>Allows you to:</w:t>
+      </w:r>
+    </w:p>
+    <w:p>
+      <w:pPr>
+        <w:numPr>
+          <w:ilvl w:val="0"/>
+          <w:numId w:val="10"/>
+        </w:numPr>
+        <w:rPr>
+          <w:rFonts w:eastAsia="Times New Roman"/>
+        </w:rPr>
+      </w:pPr>
+      <w:r>
+        <w:rPr>
+          <w:rFonts w:eastAsia="Times New Roman"/>
+        </w:rPr>
+        <w:t>Set breakpoints</w:t>
+      </w:r>
+    </w:p>
+    <w:p>
+      <w:pPr>
+        <w:numPr>
+          <w:ilvl w:val="0"/>
+          <w:numId w:val="10"/>
+        </w:numPr>
+        <w:rPr>
+          <w:rFonts w:eastAsia="Times New Roman"/>
+        </w:rPr>
+      </w:pPr>
+      <w:r>
+        <w:rPr>
+          <w:rFonts w:eastAsia="Times New Roman"/>
+        </w:rPr>
+        <w:t>Step through code</w:t>
+      </w:r>
+    </w:p>
+    <w:p>
+      <w:pPr>
+        <w:numPr>
+          <w:ilvl w:val="0"/>
+          <w:numId w:val="10"/>
+        </w:numPr>
+        <w:rPr>
+          <w:rFonts w:eastAsia="Times New Roman"/>
+        </w:rPr>
+      </w:pPr>
+      <w:r>
+        <w:rPr>
+          <w:rFonts w:eastAsia="Times New Roman"/>
+        </w:rPr>
+        <w:t>Inspect variables in real time</w:t>
+      </w:r>
+    </w:p>
+    <w:p>
+      <w:pPr>
+        <w:rPr>
+          <w:rFonts w:eastAsia="Times New Roman"/>
+        </w:rPr>
+      </w:pPr>
+    </w:p>
+    <w:p>
+      <w:pPr>
+        <w:rPr>
+          <w:rFonts w:eastAsia="Times New Roman"/>
+          <w:b/>
+          <w:bCs/>
+        </w:rPr>
+      </w:pPr>
+      <w:r>
+        <w:rPr>
+          <w:rFonts w:eastAsia="Times New Roman"/>
+          <w:b/>
+          <w:bCs/>
+        </w:rPr>
+        <w:t>Plugin &amp; Extension Support</w:t>
+      </w:r>
+    </w:p>
+    <w:p>
+      <w:pPr>
+        <w:rPr>
+          <w:rFonts w:eastAsia="Times New Roman"/>
+        </w:rPr>
+      </w:pPr>
+      <w:r>
+        <w:rPr>
+          <w:rFonts w:eastAsia="Times New Roman"/>
+        </w:rPr>
+        <w:t>Expand functionality with tools for:</w:t>
+      </w:r>
+    </w:p>
+    <w:p>
+      <w:pPr>
+        <w:numPr>
+          <w:ilvl w:val="0"/>
+          <w:numId w:val="11"/>
+        </w:numPr>
+        <w:rPr>
+          <w:rFonts w:eastAsia="Times New Roman"/>
+        </w:rPr>
+      </w:pPr>
+      <w:r>
+        <w:rPr>
+          <w:rFonts w:eastAsia="Times New Roman"/>
+        </w:rPr>
+        <w:t>Linting</w:t>
+      </w:r>
+    </w:p>
+    <w:p>
+      <w:pPr>
+        <w:numPr>
+          <w:ilvl w:val="0"/>
+          <w:numId w:val="11"/>
+        </w:numPr>
+        <w:rPr>
+          <w:rFonts w:eastAsia="Times New Roman"/>
+        </w:rPr>
+      </w:pPr>
+      <w:r>
+        <w:rPr>
+          <w:rFonts w:eastAsia="Times New Roman"/>
+        </w:rPr>
+        <w:t>Formatting</w:t>
+      </w:r>
+    </w:p>
+    <w:p>
+      <w:pPr>
+        <w:numPr>
+          <w:ilvl w:val="0"/>
+          <w:numId w:val="11"/>
+        </w:numPr>
+        <w:rPr>
+          <w:rFonts w:eastAsia="Times New Roman"/>
+        </w:rPr>
+      </w:pPr>
+      <w:r>
+        <w:rPr>
+          <w:rFonts w:eastAsia="Times New Roman"/>
+        </w:rPr>
+        <w:t>Framework support</w:t>
+      </w:r>
+    </w:p>
+    <w:p>
+      <w:pPr>
+        <w:numPr>
+          <w:ilvl w:val="0"/>
+          <w:numId w:val="11"/>
+        </w:numPr>
+        <w:rPr>
+          <w:rFonts w:eastAsia="Times New Roman"/>
+        </w:rPr>
+      </w:pPr>
+      <w:r>
+        <w:rPr>
+          <w:rFonts w:eastAsia="Times New Roman"/>
+        </w:rPr>
+        <w:t>Version control integration</w:t>
+      </w:r>
+    </w:p>
+    <w:p>
+      <w:pPr>
+        <w:rPr>
+          <w:rFonts w:eastAsia="Times New Roman"/>
+        </w:rPr>
+      </w:pPr>
+    </w:p>
+    <w:p>
+      <w:pPr>
+        <w:rPr>
+          <w:rFonts w:eastAsia="Times New Roman"/>
+          <w:b/>
+          <w:bCs/>
+        </w:rPr>
+      </w:pPr>
+      <w:r>
+        <w:rPr>
+          <w:rFonts w:eastAsia="Times New Roman"/>
+          <w:b/>
+          <w:bCs/>
+        </w:rPr>
+        <w:t>Project Management</w:t>
+      </w:r>
+    </w:p>
+    <w:p>
+      <w:pPr>
+        <w:rPr>
+          <w:rFonts w:eastAsia="Times New Roman"/>
+        </w:rPr>
+      </w:pPr>
+      <w:r>
+        <w:rPr>
+          <w:rFonts w:eastAsia="Times New Roman"/>
+        </w:rPr>
+        <w:t>Organize large projects with:</w:t>
+      </w:r>
+    </w:p>
+    <w:p>
+      <w:pPr>
+        <w:numPr>
+          <w:ilvl w:val="0"/>
+          <w:numId w:val="12"/>
+        </w:numPr>
+        <w:rPr>
+          <w:rFonts w:eastAsia="Times New Roman"/>
+        </w:rPr>
+      </w:pPr>
+      <w:r>
+        <w:rPr>
+          <w:rFonts w:eastAsia="Times New Roman"/>
+        </w:rPr>
+        <w:t>File trees</w:t>
+      </w:r>
+    </w:p>
+    <w:p>
+      <w:pPr>
+        <w:numPr>
+          <w:ilvl w:val="0"/>
+          <w:numId w:val="12"/>
+        </w:numPr>
+        <w:rPr>
+          <w:rFonts w:eastAsia="Times New Roman"/>
+        </w:rPr>
+      </w:pPr>
+      <w:r>
+        <w:rPr>
+          <w:rFonts w:eastAsia="Times New Roman"/>
+        </w:rPr>
+        <w:t>Search tools</w:t>
+      </w:r>
+    </w:p>
+    <w:p>
+      <w:pPr>
+        <w:numPr>
+          <w:ilvl w:val="0"/>
+          <w:numId w:val="12"/>
+        </w:numPr>
+        <w:rPr>
+          <w:rFonts w:eastAsia="Times New Roman"/>
+        </w:rPr>
+      </w:pPr>
+      <w:r>
+        <w:rPr>
+          <w:rFonts w:eastAsia="Times New Roman"/>
+        </w:rPr>
+        <w:t>Dependency management</w:t>
+      </w:r>
+    </w:p>
+    <w:p>
+      <w:pPr>
+        <w:rPr>
+          <w:rFonts w:eastAsia="Times New Roman"/>
+        </w:rPr>
+      </w:pPr>
+    </w:p>
+    <w:p>
+      <w:pPr>
+        <w:rPr>
+          <w:rFonts w:eastAsia="Times New Roman"/>
+          <w:b/>
+          <w:bCs/>
+        </w:rPr>
+      </w:pPr>
+      <w:r>
+        <w:rPr>
+          <w:rFonts w:eastAsia="Times New Roman"/>
+          <w:b/>
+          <w:bCs/>
+        </w:rPr>
+        <w:t>Performance &amp; Speed</w:t>
+      </w:r>
+    </w:p>
+    <w:p>
+      <w:pPr>
+        <w:rPr>
+          <w:rFonts w:eastAsia="Times New Roman"/>
+        </w:rPr>
+      </w:pPr>
+      <w:r>
+        <w:rPr>
+          <w:rFonts w:eastAsia="Times New Roman"/>
+        </w:rPr>
+        <w:t>Some IDEs are lightweight and fast, while others are feature-rich but heavier.</w:t>
+      </w:r>
+    </w:p>
+    <w:p>
+      <w:pPr>
+        <w:rPr>
+          <w:rFonts w:eastAsia="Times New Roman"/>
+        </w:rPr>
+      </w:pPr>
+    </w:p>
+    <w:p>
+      <w:pPr>
+        <w:rPr>
+          <w:rFonts w:eastAsia="Times New Roman"/>
+          <w:b/>
+          <w:bCs/>
+        </w:rPr>
+      </w:pPr>
+      <w:r>
+        <w:rPr>
+          <w:rFonts w:eastAsia="Times New Roman"/>
+          <w:b/>
+          <w:bCs/>
+        </w:rPr>
+        <w:t>IDE vs Text Editor</w:t>
+      </w:r>
+    </w:p>
+    <w:p>
+      <w:pPr>
+        <w:rPr>
+          <w:rFonts w:eastAsia="Times New Roman"/>
+        </w:rPr>
+      </w:pPr>
+      <w:r>
+        <w:rPr>
+          <w:rFonts w:eastAsia="Times New Roman"/>
+        </w:rPr>
+        <w:t>Understanding the difference is important for beginners:</w:t>
+      </w:r>
+    </w:p>
+    <w:p>
+      <w:pPr>
+        <w:rPr>
+          <w:rFonts w:eastAsia="Times New Roman"/>
+        </w:rPr>
+      </w:pPr>
+    </w:p>
+    <w:tbl>
+      <w:tblPr>
+        <w:tblW w:w="0" w:type="auto"/>
+        <w:tblCellSpacing w:w="15" w:type="dxa"/>
+        <w:tblBorders>
+          <w:top w:val="single" w:sz="4" w:space="0" w:color="auto"/>
+          <w:left w:val="single" w:sz="4" w:space="0" w:color="auto"/>
+          <w:bottom w:val="single" w:sz="4" w:space="0" w:color="auto"/>
+          <w:right w:val="single" w:sz="4" w:space="0" w:color="auto"/>
+          <w:insideH w:val="single" w:sz="4" w:space="0" w:color="auto"/>
+          <w:insideV w:val="single" w:sz="4" w:space="0" w:color="auto"/>
+        </w:tblBorders>
+        <w:tblCellMar>
+          <w:top w:w="15" w:type="dxa"/>
+          <w:left w:w="15" w:type="dxa"/>
+          <w:bottom w:w="15" w:type="dxa"/>
+          <w:right w:w="15" w:type="dxa"/>
+        </w:tblCellMar>
+        <w:tblLook w:val="04A0" w:firstRow="1" w:lastRow="0" w:firstColumn="1" w:lastColumn="0" w:noHBand="0" w:noVBand="1"/>
+      </w:tblPr>
+      <w:tblGrid>
+        <w:gridCol w:w="1849"/>
+        <w:gridCol w:w="1443"/>
+        <w:gridCol w:w="1505"/>
+      </w:tblGrid>
+      <w:tr>
+        <w:trPr>
+          <w:tblHeader/>
+          <w:tblCellSpacing w:w="15" w:type="dxa"/>
+        </w:trPr>
+        <w:tc>
+          <w:tcPr>
+            <w:tcW w:w="0" w:type="auto"/>
+            <w:vAlign w:val="center"/>
+            <w:hideMark/>
+          </w:tcPr>
+          <w:p>
+            <w:pPr>
+              <w:rPr>
+                <w:rFonts w:eastAsia="Times New Roman"/>
+                <w:b/>
+                <w:bCs/>
+              </w:rPr>
+            </w:pPr>
+            <w:r>
+              <w:rPr>
+                <w:rFonts w:eastAsia="Times New Roman"/>
+                <w:b/>
+                <w:bCs/>
+              </w:rPr>
+              <w:t>Feature</w:t>
+            </w:r>
+          </w:p>
+        </w:tc>
+        <w:tc>
+          <w:tcPr>
+            <w:tcW w:w="0" w:type="auto"/>
+            <w:vAlign w:val="center"/>
+            <w:hideMark/>
+          </w:tcPr>
+          <w:p>
+            <w:pPr>
+              <w:rPr>
+                <w:rFonts w:eastAsia="Times New Roman"/>
+                <w:b/>
+                <w:bCs/>
+              </w:rPr>
+            </w:pPr>
+            <w:r>
+              <w:rPr>
+                <w:rFonts w:eastAsia="Times New Roman"/>
+                <w:b/>
+                <w:bCs/>
+              </w:rPr>
+              <w:t>IDE</w:t>
+            </w:r>
+          </w:p>
+        </w:tc>
+        <w:tc>
+          <w:tcPr>
+            <w:tcW w:w="0" w:type="auto"/>
+            <w:vAlign w:val="center"/>
+            <w:hideMark/>
+          </w:tcPr>
+          <w:p>
+            <w:pPr>
+              <w:rPr>
+                <w:rFonts w:eastAsia="Times New Roman"/>
+                <w:b/>
+                <w:bCs/>
+              </w:rPr>
+            </w:pPr>
+            <w:r>
+              <w:rPr>
+                <w:rFonts w:eastAsia="Times New Roman"/>
+                <w:b/>
+                <w:bCs/>
+              </w:rPr>
+              <w:t>Text Editor</w:t>
+            </w:r>
+          </w:p>
+        </w:tc>
+      </w:tr>
+      <w:tr>
+        <w:trPr>
+          <w:tblCellSpacing w:w="15" w:type="dxa"/>
+        </w:trPr>
+        <w:tc>
+          <w:tcPr>
+            <w:tcW w:w="0" w:type="auto"/>
+            <w:vAlign w:val="center"/>
+            <w:hideMark/>
+          </w:tcPr>
+          <w:p>
+            <w:pPr>
+              <w:rPr>
+                <w:rFonts w:eastAsia="Times New Roman"/>
+              </w:rPr>
+            </w:pPr>
+            <w:r>
+              <w:rPr>
+                <w:rFonts w:eastAsia="Times New Roman"/>
+              </w:rPr>
+              <w:t>Built-in tools</w:t>
+            </w:r>
+          </w:p>
+        </w:tc>
+        <w:tc>
+          <w:tcPr>
+            <w:tcW w:w="0" w:type="auto"/>
+            <w:vAlign w:val="center"/>
+            <w:hideMark/>
+          </w:tcPr>
+          <w:p>
+            <w:pPr>
+              <w:rPr>
+                <w:rFonts w:eastAsia="Times New Roman"/>
+              </w:rPr>
+            </w:pPr>
+            <w:r>
+              <w:rPr>
+                <w:rFonts w:ascii="Segoe UI Emoji" w:eastAsia="Times New Roman" w:hAnsi="Segoe UI Emoji" w:cs="Segoe UI Emoji"/>
+              </w:rPr>
+              <w:t>✅</w:t>
+            </w:r>
+            <w:r>
+              <w:rPr>
+                <w:rFonts w:eastAsia="Times New Roman"/>
+              </w:rPr>
+              <w:t xml:space="preserve"> Yes</w:t>
+            </w:r>
+          </w:p>
+        </w:tc>
+        <w:tc>
+          <w:tcPr>
+            <w:tcW w:w="0" w:type="auto"/>
+            <w:vAlign w:val="center"/>
+            <w:hideMark/>
+          </w:tcPr>
+          <w:p>
+            <w:pPr>
+              <w:rPr>
+                <w:rFonts w:eastAsia="Times New Roman"/>
+              </w:rPr>
+            </w:pPr>
+            <w:r>
+              <w:rPr>
+                <w:rFonts w:ascii="Segoe UI Emoji" w:eastAsia="Times New Roman" w:hAnsi="Segoe UI Emoji" w:cs="Segoe UI Emoji"/>
+              </w:rPr>
+              <w:t>❌</w:t>
+            </w:r>
+            <w:r>
+              <w:rPr>
+                <w:rFonts w:eastAsia="Times New Roman"/>
+              </w:rPr>
+              <w:t xml:space="preserve"> Minimal</w:t>
+            </w:r>
+          </w:p>
+        </w:tc>
+      </w:tr>
+      <w:tr>
+        <w:trPr>
+          <w:tblCellSpacing w:w="15" w:type="dxa"/>
+        </w:trPr>
+        <w:tc>
+          <w:tcPr>
+            <w:tcW w:w="0" w:type="auto"/>
+            <w:vAlign w:val="center"/>
+            <w:hideMark/>
+          </w:tcPr>
+          <w:p>
+            <w:pPr>
+              <w:rPr>
+                <w:rFonts w:eastAsia="Times New Roman"/>
+              </w:rPr>
+            </w:pPr>
+            <w:r>
+              <w:rPr>
+                <w:rFonts w:eastAsia="Times New Roman"/>
+              </w:rPr>
+              <w:t>Debugging</w:t>
+            </w:r>
+          </w:p>
+        </w:tc>
+        <w:tc>
+          <w:tcPr>
+            <w:tcW w:w="0" w:type="auto"/>
+            <w:vAlign w:val="center"/>
+            <w:hideMark/>
+          </w:tcPr>
+          <w:p>
+            <w:pPr>
+              <w:rPr>
+                <w:rFonts w:eastAsia="Times New Roman"/>
+              </w:rPr>
+            </w:pPr>
+            <w:r>
+              <w:rPr>
+                <w:rFonts w:ascii="Segoe UI Emoji" w:eastAsia="Times New Roman" w:hAnsi="Segoe UI Emoji" w:cs="Segoe UI Emoji"/>
+              </w:rPr>
+              <w:t>✅</w:t>
+            </w:r>
+            <w:r>
+              <w:rPr>
+                <w:rFonts w:eastAsia="Times New Roman"/>
+              </w:rPr>
+              <w:t xml:space="preserve"> Advanced</w:t>
+            </w:r>
+          </w:p>
+        </w:tc>
+        <w:tc>
+          <w:tcPr>
+            <w:tcW w:w="0" w:type="auto"/>
+            <w:vAlign w:val="center"/>
+            <w:hideMark/>
+          </w:tcPr>
+          <w:p>
+            <w:pPr>
+              <w:rPr>
+                <w:rFonts w:eastAsia="Times New Roman"/>
+              </w:rPr>
+            </w:pPr>
+            <w:r>
+              <w:rPr>
+                <w:rFonts w:ascii="Segoe UI Emoji" w:eastAsia="Times New Roman" w:hAnsi="Segoe UI Emoji" w:cs="Segoe UI Emoji"/>
+              </w:rPr>
+              <w:t>❌</w:t>
+            </w:r>
+            <w:r>
+              <w:rPr>
+                <w:rFonts w:eastAsia="Times New Roman"/>
+              </w:rPr>
+              <w:t xml:space="preserve"> Limited</w:t>
+            </w:r>
+          </w:p>
+        </w:tc>
+      </w:tr>
+      <w:tr>
+        <w:trPr>
+          <w:tblCellSpacing w:w="15" w:type="dxa"/>
+        </w:trPr>
+        <w:tc>
+          <w:tcPr>
+            <w:tcW w:w="0" w:type="auto"/>
+            <w:vAlign w:val="center"/>
+            <w:hideMark/>
+          </w:tcPr>
+          <w:p>
+            <w:pPr>
+              <w:rPr>
+                <w:rFonts w:eastAsia="Times New Roman"/>
+              </w:rPr>
+            </w:pPr>
+            <w:r>
+              <w:rPr>
+                <w:rFonts w:eastAsia="Times New Roman"/>
+              </w:rPr>
+              <w:t>Speed</w:t>
+            </w:r>
+          </w:p>
+        </w:tc>
+        <w:tc>
+          <w:tcPr>
+            <w:tcW w:w="0" w:type="auto"/>
+            <w:vAlign w:val="center"/>
+            <w:hideMark/>
+          </w:tcPr>
+          <w:p>
+            <w:pPr>
+              <w:rPr>
+                <w:rFonts w:eastAsia="Times New Roman"/>
+              </w:rPr>
+            </w:pPr>
+            <w:r>
+              <w:rPr>
+                <w:rFonts w:ascii="Segoe UI Emoji" w:eastAsia="Times New Roman" w:hAnsi="Segoe UI Emoji" w:cs="Segoe UI Emoji"/>
+              </w:rPr>
+              <w:t>⚠️</w:t>
+            </w:r>
+            <w:r>
+              <w:rPr>
+                <w:rFonts w:eastAsia="Times New Roman"/>
+              </w:rPr>
+              <w:t xml:space="preserve"> Slower</w:t>
+            </w:r>
+          </w:p>
+        </w:tc>
+        <w:tc>
+          <w:tcPr>
+            <w:tcW w:w="0" w:type="auto"/>
+            <w:vAlign w:val="center"/>
+            <w:hideMark/>
+          </w:tcPr>
+          <w:p>
+            <w:pPr>
+              <w:rPr>
+                <w:rFonts w:eastAsia="Times New Roman"/>
+              </w:rPr>
+            </w:pPr>
+            <w:r>
+              <w:rPr>
+                <w:rFonts w:ascii="Segoe UI Emoji" w:eastAsia="Times New Roman" w:hAnsi="Segoe UI Emoji" w:cs="Segoe UI Emoji"/>
+              </w:rPr>
+              <w:t>✅</w:t>
+            </w:r>
+            <w:r>
+              <w:rPr>
+                <w:rFonts w:eastAsia="Times New Roman"/>
+              </w:rPr>
+              <w:t xml:space="preserve"> Faster</w:t>
+            </w:r>
+          </w:p>
+        </w:tc>
+      </w:tr>
+      <w:tr>
+        <w:trPr>
+          <w:tblCellSpacing w:w="15" w:type="dxa"/>
+        </w:trPr>
+        <w:tc>
+          <w:tcPr>
+            <w:tcW w:w="0" w:type="auto"/>
+            <w:vAlign w:val="center"/>
+            <w:hideMark/>
+          </w:tcPr>
+          <w:p>
+            <w:pPr>
+              <w:rPr>
+                <w:rFonts w:eastAsia="Times New Roman"/>
+              </w:rPr>
+            </w:pPr>
+            <w:r>
+              <w:rPr>
+                <w:rFonts w:eastAsia="Times New Roman"/>
+              </w:rPr>
+              <w:t>Customization</w:t>
+            </w:r>
+          </w:p>
+        </w:tc>
+        <w:tc>
+          <w:tcPr>
+            <w:tcW w:w="0" w:type="auto"/>
+            <w:vAlign w:val="center"/>
+            <w:hideMark/>
+          </w:tcPr>
+          <w:p>
+            <w:pPr>
+              <w:rPr>
+                <w:rFonts w:eastAsia="Times New Roman"/>
+              </w:rPr>
+            </w:pPr>
+            <w:r>
+              <w:rPr>
+                <w:rFonts w:ascii="Segoe UI Emoji" w:eastAsia="Times New Roman" w:hAnsi="Segoe UI Emoji" w:cs="Segoe UI Emoji"/>
+              </w:rPr>
+              <w:t>✅</w:t>
+            </w:r>
+            <w:r>
+              <w:rPr>
+                <w:rFonts w:eastAsia="Times New Roman"/>
+              </w:rPr>
+              <w:t xml:space="preserve"> High</w:t>
+            </w:r>
+          </w:p>
+        </w:tc>
+        <w:tc>
+          <w:tcPr>
+            <w:tcW w:w="0" w:type="auto"/>
+            <w:vAlign w:val="center"/>
+            <w:hideMark/>
+          </w:tcPr>
+          <w:p>
+            <w:pPr>
+              <w:rPr>
+                <w:rFonts w:eastAsia="Times New Roman"/>
+              </w:rPr>
+            </w:pPr>
+            <w:r>
+              <w:rPr>
+                <w:rFonts w:ascii="Segoe UI Emoji" w:eastAsia="Times New Roman" w:hAnsi="Segoe UI Emoji" w:cs="Segoe UI Emoji"/>
+              </w:rPr>
+              <w:t>✅</w:t>
+            </w:r>
+            <w:r>
+              <w:rPr>
+                <w:rFonts w:eastAsia="Times New Roman"/>
+              </w:rPr>
+              <w:t xml:space="preserve"> Very High</w:t>
+            </w:r>
+          </w:p>
+        </w:tc>
+      </w:tr>
+      <w:tr>
+        <w:trPr>
+          <w:tblCellSpacing w:w="15" w:type="dxa"/>
+        </w:trPr>
+        <w:tc>
+          <w:tcPr>
+            <w:tcW w:w="0" w:type="auto"/>
+            <w:vAlign w:val="center"/>
+            <w:hideMark/>
+          </w:tcPr>
+          <w:p>
+            <w:pPr>
+              <w:rPr>
+                <w:rFonts w:eastAsia="Times New Roman"/>
+              </w:rPr>
+            </w:pPr>
+            <w:r>
+              <w:rPr>
+                <w:rFonts w:eastAsia="Times New Roman"/>
+              </w:rPr>
+              <w:t>Beginner Friendly</w:t>
+            </w:r>
+          </w:p>
+        </w:tc>
+        <w:tc>
+          <w:tcPr>
+            <w:tcW w:w="0" w:type="auto"/>
+            <w:vAlign w:val="center"/>
+            <w:hideMark/>
+          </w:tcPr>
+          <w:p>
+            <w:pPr>
+              <w:rPr>
+                <w:rFonts w:eastAsia="Times New Roman"/>
+              </w:rPr>
+            </w:pPr>
+            <w:r>
+              <w:rPr>
+                <w:rFonts w:ascii="Segoe UI Emoji" w:eastAsia="Times New Roman" w:hAnsi="Segoe UI Emoji" w:cs="Segoe UI Emoji"/>
+              </w:rPr>
+              <w:t>✅</w:t>
+            </w:r>
+            <w:r>
+              <w:rPr>
+                <w:rFonts w:eastAsia="Times New Roman"/>
+              </w:rPr>
+              <w:t xml:space="preserve"> Yes</w:t>
+            </w:r>
+          </w:p>
+        </w:tc>
+        <w:tc>
+          <w:tcPr>
+            <w:tcW w:w="0" w:type="auto"/>
+            <w:vAlign w:val="center"/>
+            <w:hideMark/>
+          </w:tcPr>
+          <w:p>
+            <w:pPr>
+              <w:rPr>
+                <w:rFonts w:eastAsia="Times New Roman"/>
+              </w:rPr>
+            </w:pPr>
+            <w:r>
+              <w:rPr>
+                <w:rFonts w:ascii="Segoe UI Emoji" w:eastAsia="Times New Roman" w:hAnsi="Segoe UI Emoji" w:cs="Segoe UI Emoji"/>
+              </w:rPr>
+              <w:t>⚠️</w:t>
+            </w:r>
+            <w:r>
+              <w:rPr>
+                <w:rFonts w:eastAsia="Times New Roman"/>
+              </w:rPr>
+              <w:t xml:space="preserve"> Depends</w:t>
+            </w:r>
+          </w:p>
+        </w:tc>
+      </w:tr>
+    </w:tbl>
+    <w:p>
+      <w:pPr>
+        <w:rPr>
+          <w:rFonts w:ascii="Segoe UI Emoji" w:eastAsia="Times New Roman" w:hAnsi="Segoe UI Emoji" w:cs="Segoe UI Emoji"/>
+        </w:rPr>
+      </w:pPr>
+    </w:p>
+    <w:p>
+      <w:pPr>
+        <w:rPr>
+          <w:rFonts w:eastAsia="Times New Roman"/>
+        </w:rPr>
+      </w:pPr>
+      <w:r>
+        <w:rPr>
+          <w:rFonts w:eastAsia="Times New Roman"/>
+        </w:rPr>
+        <w:t>Examples:</w:t>
+      </w:r>
+    </w:p>
+    <w:p>
+      <w:pPr>
+        <w:numPr>
+          <w:ilvl w:val="0"/>
+          <w:numId w:val="13"/>
+        </w:numPr>
+        <w:rPr>
+          <w:rFonts w:eastAsia="Times New Roman"/>
+        </w:rPr>
+      </w:pPr>
+      <w:r>
+        <w:rPr>
+          <w:rFonts w:eastAsia="Times New Roman"/>
+        </w:rPr>
+        <w:t>IDE: IntelliJ, Visual Studio</w:t>
+      </w:r>
+    </w:p>
+    <w:p>
+      <w:pPr>
+        <w:numPr>
+          <w:ilvl w:val="0"/>
+          <w:numId w:val="13"/>
+        </w:numPr>
+        <w:rPr>
+          <w:rFonts w:eastAsia="Times New Roman"/>
+        </w:rPr>
+      </w:pPr>
+      <w:r>
+        <w:rPr>
+          <w:rFonts w:eastAsia="Times New Roman"/>
+        </w:rPr>
+        <w:t>Text Editor: VS Code, Sublime Text</w:t>
+      </w:r>
+    </w:p>
+    <w:p>
+      <w:pPr>
+        <w:rPr>
+          <w:rFonts w:eastAsia="Times New Roman"/>
+        </w:rPr>
+      </w:pPr>
+    </w:p>
+    <w:p>
+      <w:pPr>
+        <w:rPr>
+          <w:rFonts w:eastAsia="Times New Roman"/>
+          <w:b/>
+          <w:bCs/>
+        </w:rPr>
+      </w:pPr>
+      <w:r>
+        <w:rPr>
+          <w:rFonts w:eastAsia="Times New Roman"/>
+          <w:b/>
+          <w:bCs/>
+        </w:rPr>
+        <w:t>Real Workflow Example</w:t>
+      </w:r>
+    </w:p>
+    <w:p>
+      <w:pPr>
+        <w:rPr>
+          <w:rFonts w:eastAsia="Times New Roman"/>
+        </w:rPr>
+      </w:pPr>
+      <w:r>
+        <w:rPr>
+          <w:rFonts w:eastAsia="Times New Roman"/>
+        </w:rPr>
+        <w:t>Here’s how an IDE improves a simple workflow:</w:t>
+      </w:r>
+    </w:p>
+    <w:p>
+      <w:pPr>
+        <w:rPr>
+          <w:rFonts w:eastAsia="Times New Roman"/>
+        </w:rPr>
+      </w:pPr>
+    </w:p>
+    <w:p>
+      <w:pPr>
+        <w:rPr>
+          <w:rFonts w:eastAsia="Times New Roman"/>
+          <w:b/>
+          <w:bCs/>
+        </w:rPr>
+      </w:pPr>
+      <w:r>
+        <w:rPr>
+          <w:rFonts w:eastAsia="Times New Roman"/>
+          <w:b/>
+          <w:bCs/>
+        </w:rPr>
+        <w:t>Without an IDE:</w:t>
+      </w:r>
+    </w:p>
+    <w:p>
+      <w:pPr>
+        <w:numPr>
+          <w:ilvl w:val="0"/>
+          <w:numId w:val="14"/>
+        </w:numPr>
+        <w:rPr>
+          <w:rFonts w:eastAsia="Times New Roman"/>
+        </w:rPr>
+      </w:pPr>
+      <w:r>
+        <w:rPr>
+          <w:rFonts w:eastAsia="Times New Roman"/>
+        </w:rPr>
+        <w:t>Write code manually</w:t>
+      </w:r>
+    </w:p>
+    <w:p>
+      <w:pPr>
+        <w:numPr>
+          <w:ilvl w:val="0"/>
+          <w:numId w:val="14"/>
+        </w:numPr>
+        <w:rPr>
+          <w:rFonts w:eastAsia="Times New Roman"/>
+        </w:rPr>
+      </w:pPr>
+      <w:r>
+        <w:rPr>
+          <w:rFonts w:eastAsia="Times New Roman"/>
+        </w:rPr>
+        <w:t>Run commands in terminal</w:t>
+      </w:r>
+    </w:p>
+    <w:p>
+      <w:pPr>
+        <w:numPr>
+          <w:ilvl w:val="0"/>
+          <w:numId w:val="14"/>
+        </w:numPr>
+        <w:rPr>
+          <w:rFonts w:eastAsia="Times New Roman"/>
+        </w:rPr>
+      </w:pPr>
+      <w:r>
+        <w:rPr>
+          <w:rFonts w:eastAsia="Times New Roman"/>
+        </w:rPr>
+        <w:t>Debug using print statements</w:t>
+      </w:r>
+    </w:p>
+    <w:p>
+      <w:pPr>
+        <w:rPr>
+          <w:rFonts w:eastAsia="Times New Roman"/>
+        </w:rPr>
+      </w:pPr>
+    </w:p>
+    <w:p>
+      <w:pPr>
+        <w:rPr>
+          <w:rFonts w:eastAsia="Times New Roman"/>
+          <w:b/>
+          <w:bCs/>
+        </w:rPr>
+      </w:pPr>
+      <w:r>
+        <w:rPr>
+          <w:rFonts w:eastAsia="Times New Roman"/>
+          <w:b/>
+          <w:bCs/>
+        </w:rPr>
+        <w:t>With an IDE:</w:t>
+      </w:r>
+    </w:p>
+    <w:p>
+      <w:pPr>
+        <w:numPr>
+          <w:ilvl w:val="0"/>
+          <w:numId w:val="15"/>
+        </w:numPr>
+        <w:rPr>
+          <w:rFonts w:eastAsia="Times New Roman"/>
+        </w:rPr>
+      </w:pPr>
+      <w:r>
+        <w:rPr>
+          <w:rFonts w:eastAsia="Times New Roman"/>
+        </w:rPr>
+        <w:t>Auto-complete code instantly</w:t>
+      </w:r>
+    </w:p>
+    <w:p>
+      <w:pPr>
+        <w:numPr>
+          <w:ilvl w:val="0"/>
+          <w:numId w:val="15"/>
+        </w:numPr>
+        <w:rPr>
+          <w:rFonts w:eastAsia="Times New Roman"/>
+        </w:rPr>
+      </w:pPr>
+      <w:r>
+        <w:rPr>
+          <w:rFonts w:eastAsia="Times New Roman"/>
+        </w:rPr>
+        <w:t>Click “Run” to execute</w:t>
+      </w:r>
+    </w:p>
+    <w:p>
+      <w:pPr>
+        <w:numPr>
+          <w:ilvl w:val="0"/>
+          <w:numId w:val="15"/>
+        </w:numPr>
+        <w:rPr>
+          <w:rFonts w:eastAsia="Times New Roman"/>
+        </w:rPr>
+      </w:pPr>
+      <w:r>
+        <w:rPr>
+          <w:rFonts w:eastAsia="Times New Roman"/>
+        </w:rPr>
+        <w:t>Use debugger to inspect issues visually</w:t>
+      </w:r>
+    </w:p>
+    <w:p>
+      <w:pPr>
+        <w:rPr>
+          <w:rFonts w:eastAsia="Times New Roman"/>
+        </w:rPr>
+      </w:pPr>
+      <w:r>
+        <w:rPr>
+          <w:rFonts w:ascii="Segoe UI Emoji" w:eastAsia="Times New Roman" w:hAnsi="Segoe UI Emoji" w:cs="Segoe UI Emoji"/>
+        </w:rPr>
+        <w:t>➡️</w:t>
+      </w:r>
+      <w:r>
+        <w:rPr>
+          <w:rFonts w:eastAsia="Times New Roman"/>
+        </w:rPr>
+        <w:t xml:space="preserve"> Result: Faster development + fewer mistakes</w:t>
+      </w:r>
+    </w:p>
+    <w:p>
+      <w:pPr>
+        <w:rPr>
+          <w:rFonts w:eastAsia="Times New Roman"/>
+        </w:rPr>
+      </w:pPr>
+    </w:p>
+    <w:p>
+      <w:pPr>
+        <w:rPr>
+          <w:rFonts w:eastAsia="Times New Roman"/>
+          <w:b/>
+          <w:bCs/>
+        </w:rPr>
+      </w:pPr>
+      <w:r>
+        <w:rPr>
+          <w:rFonts w:eastAsia="Times New Roman"/>
+          <w:b/>
+          <w:bCs/>
+        </w:rPr>
+        <w:t>Choosing the Right IDE</w:t>
+      </w:r>
+    </w:p>
+    <w:p>
+      <w:pPr>
+        <w:rPr>
+          <w:rFonts w:eastAsia="Times New Roman"/>
+        </w:rPr>
+      </w:pPr>
+      <w:r>
+        <w:rPr>
+          <w:rFonts w:eastAsia="Times New Roman"/>
+        </w:rPr>
+        <w:t>The best IDE depends on your goals:</w:t>
+      </w:r>
+    </w:p>
+    <w:p>
+      <w:pPr>
+        <w:rPr>
+          <w:rFonts w:eastAsia="Times New Roman"/>
+        </w:rPr>
+      </w:pPr>
+    </w:p>
+    <w:p>
+      <w:pPr>
+        <w:rPr>
+          <w:rFonts w:eastAsia="Times New Roman"/>
+          <w:b/>
+          <w:bCs/>
+        </w:rPr>
+      </w:pPr>
+      <w:r>
+        <w:rPr>
+          <w:rFonts w:ascii="Segoe UI Emoji" w:eastAsia="Times New Roman" w:hAnsi="Segoe UI Emoji" w:cs="Segoe UI Emoji"/>
+          <w:b/>
+          <w:bCs/>
+        </w:rPr>
+        <w:t>🟢</w:t>
+      </w:r>
+      <w:r>
+        <w:rPr>
+          <w:rFonts w:eastAsia="Times New Roman"/>
+          <w:b/>
+          <w:bCs/>
+        </w:rPr>
+        <w:t xml:space="preserve"> Beginner</w:t>
+      </w:r>
+    </w:p>
+    <w:p>
+      <w:pPr>
+        <w:numPr>
+          <w:ilvl w:val="0"/>
+          <w:numId w:val="16"/>
+        </w:numPr>
+        <w:rPr>
+          <w:rFonts w:eastAsia="Times New Roman"/>
+        </w:rPr>
+      </w:pPr>
+      <w:r>
+        <w:rPr>
+          <w:rFonts w:eastAsia="Times New Roman"/>
+        </w:rPr>
+        <w:t>Simple interface</w:t>
+      </w:r>
+    </w:p>
+    <w:p>
+      <w:pPr>
+        <w:numPr>
+          <w:ilvl w:val="0"/>
+          <w:numId w:val="16"/>
+        </w:numPr>
+        <w:rPr>
+          <w:rFonts w:eastAsia="Times New Roman"/>
+        </w:rPr>
+      </w:pPr>
+      <w:r>
+        <w:rPr>
+          <w:rFonts w:eastAsia="Times New Roman"/>
+        </w:rPr>
+        <w:t>Helpful suggestions</w:t>
+      </w:r>
+    </w:p>
+    <w:p>
+      <w:pPr>
+        <w:numPr>
+          <w:ilvl w:val="0"/>
+          <w:numId w:val="16"/>
+        </w:numPr>
+        <w:rPr>
+          <w:rFonts w:eastAsia="Times New Roman"/>
+        </w:rPr>
+      </w:pPr>
+      <w:r>
+        <w:rPr>
+          <w:rFonts w:eastAsia="Times New Roman"/>
+        </w:rPr>
+        <w:t>Low setup required</w:t>
+      </w:r>
+    </w:p>
+    <w:p>
+      <w:pPr>
+        <w:rPr>
+          <w:rFonts w:eastAsia="Times New Roman"/>
+        </w:rPr>
+      </w:pPr>
+    </w:p>
+    <w:p>
+      <w:pPr>
+        <w:rPr>
+          <w:rFonts w:eastAsia="Times New Roman"/>
+          <w:b/>
+          <w:bCs/>
+        </w:rPr>
+      </w:pPr>
+      <w:r>
+        <w:rPr>
+          <w:rFonts w:ascii="Segoe UI Emoji" w:eastAsia="Times New Roman" w:hAnsi="Segoe UI Emoji" w:cs="Segoe UI Emoji"/>
+          <w:b/>
+          <w:bCs/>
+        </w:rPr>
+        <w:t>🔵</w:t>
+      </w:r>
+      <w:r>
+        <w:rPr>
+          <w:rFonts w:eastAsia="Times New Roman"/>
+          <w:b/>
+          <w:bCs/>
+        </w:rPr>
+        <w:t xml:space="preserve"> Intermediate</w:t>
+      </w:r>
+    </w:p>
+    <w:p>
+      <w:pPr>
+        <w:numPr>
+          <w:ilvl w:val="0"/>
+          <w:numId w:val="17"/>
+        </w:numPr>
+        <w:rPr>
+          <w:rFonts w:eastAsia="Times New Roman"/>
+        </w:rPr>
+      </w:pPr>
+      <w:r>
+        <w:rPr>
+          <w:rFonts w:eastAsia="Times New Roman"/>
+        </w:rPr>
+        <w:t>Plugin support</w:t>
+      </w:r>
+    </w:p>
+    <w:p>
+      <w:pPr>
+        <w:numPr>
+          <w:ilvl w:val="0"/>
+          <w:numId w:val="17"/>
+        </w:numPr>
+        <w:rPr>
+          <w:rFonts w:eastAsia="Times New Roman"/>
+        </w:rPr>
+      </w:pPr>
+      <w:r>
+        <w:rPr>
+          <w:rFonts w:eastAsia="Times New Roman"/>
+        </w:rPr>
+        <w:t>Git integration</w:t>
+      </w:r>
+    </w:p>
+    <w:p>
+      <w:pPr>
+        <w:numPr>
+          <w:ilvl w:val="0"/>
+          <w:numId w:val="17"/>
+        </w:numPr>
+        <w:rPr>
+          <w:rFonts w:eastAsia="Times New Roman"/>
+        </w:rPr>
+      </w:pPr>
+      <w:r>
+        <w:rPr>
+          <w:rFonts w:eastAsia="Times New Roman"/>
+        </w:rPr>
+        <w:t>Debugging tools</w:t>
+      </w:r>
+    </w:p>
+    <w:p>
+      <w:pPr>
+        <w:rPr>
+          <w:rFonts w:eastAsia="Times New Roman"/>
+        </w:rPr>
+      </w:pPr>
+    </w:p>
+    <w:p>
+      <w:pPr>
+        <w:rPr>
+          <w:rFonts w:eastAsia="Times New Roman"/>
+          <w:b/>
+          <w:bCs/>
+        </w:rPr>
+      </w:pPr>
+      <w:r>
+        <w:rPr>
+          <w:rFonts w:ascii="Segoe UI Emoji" w:eastAsia="Times New Roman" w:hAnsi="Segoe UI Emoji" w:cs="Segoe UI Emoji"/>
+          <w:b/>
+          <w:bCs/>
+        </w:rPr>
+        <w:t>🔴</w:t>
+      </w:r>
+      <w:r>
+        <w:rPr>
+          <w:rFonts w:eastAsia="Times New Roman"/>
+          <w:b/>
+          <w:bCs/>
+        </w:rPr>
+        <w:t xml:space="preserve"> Advanced</w:t>
+      </w:r>
+    </w:p>
+    <w:p>
+      <w:pPr>
+        <w:numPr>
+          <w:ilvl w:val="0"/>
+          <w:numId w:val="18"/>
+        </w:numPr>
+        <w:rPr>
+          <w:rFonts w:eastAsia="Times New Roman"/>
+        </w:rPr>
+      </w:pPr>
+      <w:r>
+        <w:rPr>
+          <w:rFonts w:eastAsia="Times New Roman"/>
+        </w:rPr>
+        <w:t>Full control</w:t>
+      </w:r>
+    </w:p>
+    <w:p>
+      <w:pPr>
+        <w:numPr>
+          <w:ilvl w:val="0"/>
+          <w:numId w:val="18"/>
+        </w:numPr>
+        <w:rPr>
+          <w:rFonts w:eastAsia="Times New Roman"/>
+        </w:rPr>
+      </w:pPr>
+      <w:r>
+        <w:rPr>
+          <w:rFonts w:eastAsia="Times New Roman"/>
+        </w:rPr>
+        <w:t>Performance tuning</w:t>
+      </w:r>
+    </w:p>
+    <w:p>
+      <w:pPr>
+        <w:numPr>
+          <w:ilvl w:val="0"/>
+          <w:numId w:val="18"/>
+        </w:numPr>
+        <w:rPr>
+          <w:rFonts w:eastAsia="Times New Roman"/>
+        </w:rPr>
+      </w:pPr>
+      <w:r>
+        <w:rPr>
+          <w:rFonts w:eastAsia="Times New Roman"/>
+        </w:rPr>
+        <w:t>Deep customization</w:t>
+      </w:r>
+    </w:p>
+    <w:p>
+      <w:pPr>
+        <w:rPr>
+          <w:rFonts w:eastAsia="Times New Roman"/>
+        </w:rPr>
+      </w:pPr>
+    </w:p>
+    <w:p>
+      <w:pPr>
+        <w:rPr>
+          <w:rFonts w:eastAsia="Times New Roman"/>
+          <w:b/>
+          <w:bCs/>
+        </w:rPr>
+      </w:pPr>
+      <w:r>
+        <w:rPr>
+          <w:rFonts w:eastAsia="Times New Roman"/>
+          <w:b/>
+          <w:bCs/>
+        </w:rPr>
+        <w:t>Pro Tips for Students</w:t>
+      </w:r>
+    </w:p>
+    <w:p>
+      <w:pPr>
+        <w:numPr>
+          <w:ilvl w:val="0"/>
+          <w:numId w:val="19"/>
+        </w:numPr>
+        <w:rPr>
+          <w:rFonts w:eastAsia="Times New Roman"/>
+        </w:rPr>
+      </w:pPr>
+      <w:r>
+        <w:rPr>
+          <w:rFonts w:eastAsia="Times New Roman"/>
+        </w:rPr>
+        <w:t xml:space="preserve">Start with one IDE and </w:t>
+      </w:r>
+      <w:r>
+        <w:rPr>
+          <w:rFonts w:eastAsia="Times New Roman"/>
+          <w:b/>
+          <w:bCs/>
+        </w:rPr>
+        <w:t>master it</w:t>
+      </w:r>
+    </w:p>
+    <w:p>
+      <w:pPr>
+        <w:numPr>
+          <w:ilvl w:val="0"/>
+          <w:numId w:val="19"/>
+        </w:numPr>
+        <w:rPr>
+          <w:rFonts w:eastAsia="Times New Roman"/>
+        </w:rPr>
+      </w:pPr>
+      <w:r>
+        <w:rPr>
+          <w:rFonts w:eastAsia="Times New Roman"/>
+        </w:rPr>
+        <w:t>Learn keyboard shortcuts early</w:t>
+      </w:r>
+    </w:p>
+    <w:p>
+      <w:pPr>
+        <w:numPr>
+          <w:ilvl w:val="0"/>
+          <w:numId w:val="19"/>
+        </w:numPr>
+        <w:rPr>
+          <w:rFonts w:eastAsia="Times New Roman"/>
+        </w:rPr>
+      </w:pPr>
+      <w:r>
+        <w:rPr>
+          <w:rFonts w:eastAsia="Times New Roman"/>
+        </w:rPr>
+        <w:t>Use extensions—but don’t overload your setup</w:t>
+      </w:r>
+    </w:p>
+    <w:p>
+      <w:pPr>
+        <w:numPr>
+          <w:ilvl w:val="0"/>
+          <w:numId w:val="19"/>
+        </w:numPr>
+        <w:rPr>
+          <w:rFonts w:eastAsia="Times New Roman"/>
+        </w:rPr>
+      </w:pPr>
+      <w:r>
+        <w:rPr>
+          <w:rFonts w:eastAsia="Times New Roman"/>
+        </w:rPr>
+        <w:t xml:space="preserve">Focus on </w:t>
+      </w:r>
+      <w:r>
+        <w:rPr>
+          <w:rFonts w:eastAsia="Times New Roman"/>
+          <w:b/>
+          <w:bCs/>
+        </w:rPr>
+        <w:t>understanding code</w:t>
+      </w:r>
+      <w:r>
+        <w:rPr>
+          <w:rFonts w:eastAsia="Times New Roman"/>
+        </w:rPr>
+        <w:t>, not just tools</w:t>
+      </w:r>
+    </w:p>
+    <w:p>
+      <w:pPr>
+        <w:rPr>
+          <w:rFonts w:eastAsia="Times New Roman"/>
+        </w:rPr>
+      </w:pPr>
+    </w:p>
+    <w:p>
+      <w:pPr>
+        <w:rPr>
+          <w:rFonts w:eastAsia="Times New Roman"/>
+          <w:b/>
+          <w:bCs/>
           <w:sz w:val="36"/>
           <w:szCs w:val="36"/>
         </w:rPr>
@@ -2023,6 +3772,7 @@
         <w:rPr>
           <w:rFonts w:eastAsia="Times New Roman"/>
         </w:rPr>
+        <w:lastRenderedPageBreak/>
         <w:t>How different are languages really?</w:t>
       </w:r>
     </w:p>
@@ -2053,7 +3803,6 @@
         <w:rPr>
           <w:rFonts w:eastAsia="Times New Roman"/>
         </w:rPr>
-        <w:lastRenderedPageBreak/>
         <w:t>This website was created to answer those questions in a clear and visual way. By comparing languages directly, users can see that while syntax may differ, the underlying logic often remains the same.</w:t>
       </w:r>
     </w:p>
@@ -2626,6 +4375,7 @@
         <w:rPr>
           <w:rFonts w:eastAsia="Times New Roman"/>
         </w:rPr>
+        <w:lastRenderedPageBreak/>
         <w:t>The main goals of this project are to:</w:t>
       </w:r>
     </w:p>
@@ -2668,7 +4418,6 @@
         <w:rPr>
           <w:rFonts w:eastAsia="Times New Roman"/>
         </w:rPr>
-        <w:lastRenderedPageBreak/>
         <w:t>Show relationships between different languages</w:t>
       </w:r>
     </w:p>
@@ -3064,6 +4813,155 @@
     </w:lvl>
   </w:abstractNum>
   <w:abstractNum w:abstractNumId="1" w15:restartNumberingAfterBreak="0">
+    <w:nsid w:val="0CE147B8"/>
+    <w:multiLevelType w:val="multilevel"/>
+    <w:tmpl w:val="39409B86"/>
+    <w:lvl w:ilvl="0">
+      <w:start w:val="1"/>
+      <w:numFmt w:val="bullet"/>
+      <w:lvlText w:val=""/>
+      <w:lvlJc w:val="left"/>
+      <w:pPr>
+        <w:tabs>
+          <w:tab w:val="num" w:pos="720"/>
+        </w:tabs>
+        <w:ind w:left="720" w:hanging="360"/>
+      </w:pPr>
+      <w:rPr>
+        <w:rFonts w:ascii="Symbol" w:hAnsi="Symbol" w:hint="default"/>
+        <w:sz w:val="20"/>
+      </w:rPr>
+    </w:lvl>
+    <w:lvl w:ilvl="1" w:tentative="1">
+      <w:start w:val="1"/>
+      <w:numFmt w:val="bullet"/>
+      <w:lvlText w:val="o"/>
+      <w:lvlJc w:val="left"/>
+      <w:pPr>
+        <w:tabs>
+          <w:tab w:val="num" w:pos="1440"/>
+        </w:tabs>
+        <w:ind w:left="1440" w:hanging="360"/>
+      </w:pPr>
+      <w:rPr>
+        <w:rFonts w:ascii="Courier New" w:hAnsi="Courier New" w:hint="default"/>
+        <w:sz w:val="20"/>
+      </w:rPr>
+    </w:lvl>
+    <w:lvl w:ilvl="2" w:tentative="1">
+      <w:start w:val="1"/>
+      <w:numFmt w:val="bullet"/>
+      <w:lvlText w:val=""/>
+      <w:lvlJc w:val="left"/>
+      <w:pPr>
+        <w:tabs>
+          <w:tab w:val="num" w:pos="2160"/>
+        </w:tabs>
+        <w:ind w:left="2160" w:hanging="360"/>
+      </w:pPr>
+      <w:rPr>
+        <w:rFonts w:ascii="Wingdings" w:hAnsi="Wingdings" w:hint="default"/>
+        <w:sz w:val="20"/>
+      </w:rPr>
+    </w:lvl>
+    <w:lvl w:ilvl="3" w:tentative="1">
+      <w:start w:val="1"/>
+      <w:numFmt w:val="bullet"/>
+      <w:lvlText w:val=""/>
+      <w:lvlJc w:val="left"/>
+      <w:pPr>
+        <w:tabs>
+          <w:tab w:val="num" w:pos="2880"/>
+        </w:tabs>
+        <w:ind w:left="2880" w:hanging="360"/>
+      </w:pPr>
+      <w:rPr>
+        <w:rFonts w:ascii="Wingdings" w:hAnsi="Wingdings" w:hint="default"/>
+        <w:sz w:val="20"/>
+      </w:rPr>
+    </w:lvl>
+    <w:lvl w:ilvl="4" w:tentative="1">
+      <w:start w:val="1"/>
+      <w:numFmt w:val="bullet"/>
+      <w:lvlText w:val=""/>
+      <w:lvlJc w:val="left"/>
+      <w:pPr>
+        <w:tabs>
+          <w:tab w:val="num" w:pos="3600"/>
+        </w:tabs>
+        <w:ind w:left="3600" w:hanging="360"/>
+      </w:pPr>
+      <w:rPr>
+        <w:rFonts w:ascii="Wingdings" w:hAnsi="Wingdings" w:hint="default"/>
+        <w:sz w:val="20"/>
+      </w:rPr>
+    </w:lvl>
+    <w:lvl w:ilvl="5" w:tentative="1">
+      <w:start w:val="1"/>
+      <w:numFmt w:val="bullet"/>
+      <w:lvlText w:val=""/>
+      <w:lvlJc w:val="left"/>
+      <w:pPr>
+        <w:tabs>
+          <w:tab w:val="num" w:pos="4320"/>
+        </w:tabs>
+        <w:ind w:left="4320" w:hanging="360"/>
+      </w:pPr>
+      <w:rPr>
+        <w:rFonts w:ascii="Wingdings" w:hAnsi="Wingdings" w:hint="default"/>
+        <w:sz w:val="20"/>
+      </w:rPr>
+    </w:lvl>
+    <w:lvl w:ilvl="6" w:tentative="1">
+      <w:start w:val="1"/>
+      <w:numFmt w:val="bullet"/>
+      <w:lvlText w:val=""/>
+      <w:lvlJc w:val="left"/>
+      <w:pPr>
+        <w:tabs>
+          <w:tab w:val="num" w:pos="5040"/>
+        </w:tabs>
+        <w:ind w:left="5040" w:hanging="360"/>
+      </w:pPr>
+      <w:rPr>
+        <w:rFonts w:ascii="Wingdings" w:hAnsi="Wingdings" w:hint="default"/>
+        <w:sz w:val="20"/>
+      </w:rPr>
+    </w:lvl>
+    <w:lvl w:ilvl="7" w:tentative="1">
+      <w:start w:val="1"/>
+      <w:numFmt w:val="bullet"/>
+      <w:lvlText w:val=""/>
+      <w:lvlJc w:val="left"/>
+      <w:pPr>
+        <w:tabs>
+          <w:tab w:val="num" w:pos="5760"/>
+        </w:tabs>
+        <w:ind w:left="5760" w:hanging="360"/>
+      </w:pPr>
+      <w:rPr>
+        <w:rFonts w:ascii="Wingdings" w:hAnsi="Wingdings" w:hint="default"/>
+        <w:sz w:val="20"/>
+      </w:rPr>
+    </w:lvl>
+    <w:lvl w:ilvl="8" w:tentative="1">
+      <w:start w:val="1"/>
+      <w:numFmt w:val="bullet"/>
+      <w:lvlText w:val=""/>
+      <w:lvlJc w:val="left"/>
+      <w:pPr>
+        <w:tabs>
+          <w:tab w:val="num" w:pos="6480"/>
+        </w:tabs>
+        <w:ind w:left="6480" w:hanging="360"/>
+      </w:pPr>
+      <w:rPr>
+        <w:rFonts w:ascii="Wingdings" w:hAnsi="Wingdings" w:hint="default"/>
+        <w:sz w:val="20"/>
+      </w:rPr>
+    </w:lvl>
+  </w:abstractNum>
+  <w:abstractNum w:abstractNumId="2" w15:restartNumberingAfterBreak="0">
     <w:nsid w:val="1CDD779B"/>
     <w:multiLevelType w:val="multilevel"/>
     <w:tmpl w:val="8A6A7488"/>
@@ -3212,7 +5110,156 @@
       </w:rPr>
     </w:lvl>
   </w:abstractNum>
-  <w:abstractNum w:abstractNumId="2" w15:restartNumberingAfterBreak="0">
+  <w:abstractNum w:abstractNumId="3" w15:restartNumberingAfterBreak="0">
+    <w:nsid w:val="1D822E50"/>
+    <w:multiLevelType w:val="multilevel"/>
+    <w:tmpl w:val="DC820B7A"/>
+    <w:lvl w:ilvl="0">
+      <w:start w:val="1"/>
+      <w:numFmt w:val="bullet"/>
+      <w:lvlText w:val=""/>
+      <w:lvlJc w:val="left"/>
+      <w:pPr>
+        <w:tabs>
+          <w:tab w:val="num" w:pos="720"/>
+        </w:tabs>
+        <w:ind w:left="720" w:hanging="360"/>
+      </w:pPr>
+      <w:rPr>
+        <w:rFonts w:ascii="Symbol" w:hAnsi="Symbol" w:hint="default"/>
+        <w:sz w:val="20"/>
+      </w:rPr>
+    </w:lvl>
+    <w:lvl w:ilvl="1" w:tentative="1">
+      <w:start w:val="1"/>
+      <w:numFmt w:val="bullet"/>
+      <w:lvlText w:val="o"/>
+      <w:lvlJc w:val="left"/>
+      <w:pPr>
+        <w:tabs>
+          <w:tab w:val="num" w:pos="1440"/>
+        </w:tabs>
+        <w:ind w:left="1440" w:hanging="360"/>
+      </w:pPr>
+      <w:rPr>
+        <w:rFonts w:ascii="Courier New" w:hAnsi="Courier New" w:hint="default"/>
+        <w:sz w:val="20"/>
+      </w:rPr>
+    </w:lvl>
+    <w:lvl w:ilvl="2" w:tentative="1">
+      <w:start w:val="1"/>
+      <w:numFmt w:val="bullet"/>
+      <w:lvlText w:val=""/>
+      <w:lvlJc w:val="left"/>
+      <w:pPr>
+        <w:tabs>
+          <w:tab w:val="num" w:pos="2160"/>
+        </w:tabs>
+        <w:ind w:left="2160" w:hanging="360"/>
+      </w:pPr>
+      <w:rPr>
+        <w:rFonts w:ascii="Wingdings" w:hAnsi="Wingdings" w:hint="default"/>
+        <w:sz w:val="20"/>
+      </w:rPr>
+    </w:lvl>
+    <w:lvl w:ilvl="3" w:tentative="1">
+      <w:start w:val="1"/>
+      <w:numFmt w:val="bullet"/>
+      <w:lvlText w:val=""/>
+      <w:lvlJc w:val="left"/>
+      <w:pPr>
+        <w:tabs>
+          <w:tab w:val="num" w:pos="2880"/>
+        </w:tabs>
+        <w:ind w:left="2880" w:hanging="360"/>
+      </w:pPr>
+      <w:rPr>
+        <w:rFonts w:ascii="Wingdings" w:hAnsi="Wingdings" w:hint="default"/>
+        <w:sz w:val="20"/>
+      </w:rPr>
+    </w:lvl>
+    <w:lvl w:ilvl="4" w:tentative="1">
+      <w:start w:val="1"/>
+      <w:numFmt w:val="bullet"/>
+      <w:lvlText w:val=""/>
+      <w:lvlJc w:val="left"/>
+      <w:pPr>
+        <w:tabs>
+          <w:tab w:val="num" w:pos="3600"/>
+        </w:tabs>
+        <w:ind w:left="3600" w:hanging="360"/>
+      </w:pPr>
+      <w:rPr>
+        <w:rFonts w:ascii="Wingdings" w:hAnsi="Wingdings" w:hint="default"/>
+        <w:sz w:val="20"/>
+      </w:rPr>
+    </w:lvl>
+    <w:lvl w:ilvl="5" w:tentative="1">
+      <w:start w:val="1"/>
+      <w:numFmt w:val="bullet"/>
+      <w:lvlText w:val=""/>
+      <w:lvlJc w:val="left"/>
+      <w:pPr>
+        <w:tabs>
+          <w:tab w:val="num" w:pos="4320"/>
+        </w:tabs>
+        <w:ind w:left="4320" w:hanging="360"/>
+      </w:pPr>
+      <w:rPr>
+        <w:rFonts w:ascii="Wingdings" w:hAnsi="Wingdings" w:hint="default"/>
+        <w:sz w:val="20"/>
+      </w:rPr>
+    </w:lvl>
+    <w:lvl w:ilvl="6" w:tentative="1">
+      <w:start w:val="1"/>
+      <w:numFmt w:val="bullet"/>
+      <w:lvlText w:val=""/>
+      <w:lvlJc w:val="left"/>
+      <w:pPr>
+        <w:tabs>
+          <w:tab w:val="num" w:pos="5040"/>
+        </w:tabs>
+        <w:ind w:left="5040" w:hanging="360"/>
+      </w:pPr>
+      <w:rPr>
+        <w:rFonts w:ascii="Wingdings" w:hAnsi="Wingdings" w:hint="default"/>
+        <w:sz w:val="20"/>
+      </w:rPr>
+    </w:lvl>
+    <w:lvl w:ilvl="7" w:tentative="1">
+      <w:start w:val="1"/>
+      <w:numFmt w:val="bullet"/>
+      <w:lvlText w:val=""/>
+      <w:lvlJc w:val="left"/>
+      <w:pPr>
+        <w:tabs>
+          <w:tab w:val="num" w:pos="5760"/>
+        </w:tabs>
+        <w:ind w:left="5760" w:hanging="360"/>
+      </w:pPr>
+      <w:rPr>
+        <w:rFonts w:ascii="Wingdings" w:hAnsi="Wingdings" w:hint="default"/>
+        <w:sz w:val="20"/>
+      </w:rPr>
+    </w:lvl>
+    <w:lvl w:ilvl="8" w:tentative="1">
+      <w:start w:val="1"/>
+      <w:numFmt w:val="bullet"/>
+      <w:lvlText w:val=""/>
+      <w:lvlJc w:val="left"/>
+      <w:pPr>
+        <w:tabs>
+          <w:tab w:val="num" w:pos="6480"/>
+        </w:tabs>
+        <w:ind w:left="6480" w:hanging="360"/>
+      </w:pPr>
+      <w:rPr>
+        <w:rFonts w:ascii="Wingdings" w:hAnsi="Wingdings" w:hint="default"/>
+        <w:sz w:val="20"/>
+      </w:rPr>
+    </w:lvl>
+  </w:abstractNum>
+  <w:abstractNum w:abstractNumId="4" w15:restartNumberingAfterBreak="0">
     <w:nsid w:val="1DF31EB4"/>
     <w:multiLevelType w:val="multilevel"/>
     <w:tmpl w:val="2DECFCBC"/>
@@ -3361,7 +5408,7 @@
       </w:rPr>
     </w:lvl>
   </w:abstractNum>
-  <w:abstractNum w:abstractNumId="3" w15:restartNumberingAfterBreak="0">
+  <w:abstractNum w:abstractNumId="5" w15:restartNumberingAfterBreak="0">
     <w:nsid w:val="263E5557"/>
     <w:multiLevelType w:val="multilevel"/>
     <w:tmpl w:val="6A04764A"/>
@@ -3510,7 +5557,454 @@
       </w:rPr>
     </w:lvl>
   </w:abstractNum>
-  <w:abstractNum w:abstractNumId="4" w15:restartNumberingAfterBreak="0">
+  <w:abstractNum w:abstractNumId="6" w15:restartNumberingAfterBreak="0">
+    <w:nsid w:val="2A745452"/>
+    <w:multiLevelType w:val="multilevel"/>
+    <w:tmpl w:val="3AAC28D8"/>
+    <w:lvl w:ilvl="0">
+      <w:start w:val="1"/>
+      <w:numFmt w:val="bullet"/>
+      <w:lvlText w:val=""/>
+      <w:lvlJc w:val="left"/>
+      <w:pPr>
+        <w:tabs>
+          <w:tab w:val="num" w:pos="720"/>
+        </w:tabs>
+        <w:ind w:left="720" w:hanging="360"/>
+      </w:pPr>
+      <w:rPr>
+        <w:rFonts w:ascii="Symbol" w:hAnsi="Symbol" w:hint="default"/>
+        <w:sz w:val="20"/>
+      </w:rPr>
+    </w:lvl>
+    <w:lvl w:ilvl="1" w:tentative="1">
+      <w:start w:val="1"/>
+      <w:numFmt w:val="bullet"/>
+      <w:lvlText w:val="o"/>
+      <w:lvlJc w:val="left"/>
+      <w:pPr>
+        <w:tabs>
+          <w:tab w:val="num" w:pos="1440"/>
+        </w:tabs>
+        <w:ind w:left="1440" w:hanging="360"/>
+      </w:pPr>
+      <w:rPr>
+        <w:rFonts w:ascii="Courier New" w:hAnsi="Courier New" w:hint="default"/>
+        <w:sz w:val="20"/>
+      </w:rPr>
+    </w:lvl>
+    <w:lvl w:ilvl="2" w:tentative="1">
+      <w:start w:val="1"/>
+      <w:numFmt w:val="bullet"/>
+      <w:lvlText w:val=""/>
+      <w:lvlJc w:val="left"/>
+      <w:pPr>
+        <w:tabs>
+          <w:tab w:val="num" w:pos="2160"/>
+        </w:tabs>
+        <w:ind w:left="2160" w:hanging="360"/>
+      </w:pPr>
+      <w:rPr>
+        <w:rFonts w:ascii="Wingdings" w:hAnsi="Wingdings" w:hint="default"/>
+        <w:sz w:val="20"/>
+      </w:rPr>
+    </w:lvl>
+    <w:lvl w:ilvl="3" w:tentative="1">
+      <w:start w:val="1"/>
+      <w:numFmt w:val="bullet"/>
+      <w:lvlText w:val=""/>
+      <w:lvlJc w:val="left"/>
+      <w:pPr>
+        <w:tabs>
+          <w:tab w:val="num" w:pos="2880"/>
+        </w:tabs>
+        <w:ind w:left="2880" w:hanging="360"/>
+      </w:pPr>
+      <w:rPr>
+        <w:rFonts w:ascii="Wingdings" w:hAnsi="Wingdings" w:hint="default"/>
+        <w:sz w:val="20"/>
+      </w:rPr>
+    </w:lvl>
+    <w:lvl w:ilvl="4" w:tentative="1">
+      <w:start w:val="1"/>
+      <w:numFmt w:val="bullet"/>
+      <w:lvlText w:val=""/>
+      <w:lvlJc w:val="left"/>
+      <w:pPr>
+        <w:tabs>
+          <w:tab w:val="num" w:pos="3600"/>
+        </w:tabs>
+        <w:ind w:left="3600" w:hanging="360"/>
+      </w:pPr>
+      <w:rPr>
+        <w:rFonts w:ascii="Wingdings" w:hAnsi="Wingdings" w:hint="default"/>
+        <w:sz w:val="20"/>
+      </w:rPr>
+    </w:lvl>
+    <w:lvl w:ilvl="5" w:tentative="1">
+      <w:start w:val="1"/>
+      <w:numFmt w:val="bullet"/>
+      <w:lvlText w:val=""/>
+      <w:lvlJc w:val="left"/>
+      <w:pPr>
+        <w:tabs>
+          <w:tab w:val="num" w:pos="4320"/>
+        </w:tabs>
+        <w:ind w:left="4320" w:hanging="360"/>
+      </w:pPr>
+      <w:rPr>
+        <w:rFonts w:ascii="Wingdings" w:hAnsi="Wingdings" w:hint="default"/>
+        <w:sz w:val="20"/>
+      </w:rPr>
+    </w:lvl>
+    <w:lvl w:ilvl="6" w:tentative="1">
+      <w:start w:val="1"/>
+      <w:numFmt w:val="bullet"/>
+      <w:lvlText w:val=""/>
+      <w:lvlJc w:val="left"/>
+      <w:pPr>
+        <w:tabs>
+          <w:tab w:val="num" w:pos="5040"/>
+        </w:tabs>
+        <w:ind w:left="5040" w:hanging="360"/>
+      </w:pPr>
+      <w:rPr>
+        <w:rFonts w:ascii="Wingdings" w:hAnsi="Wingdings" w:hint="default"/>
+        <w:sz w:val="20"/>
+      </w:rPr>
+    </w:lvl>
+    <w:lvl w:ilvl="7" w:tentative="1">
+      <w:start w:val="1"/>
+      <w:numFmt w:val="bullet"/>
+      <w:lvlText w:val=""/>
+      <w:lvlJc w:val="left"/>
+      <w:pPr>
+        <w:tabs>
+          <w:tab w:val="num" w:pos="5760"/>
+        </w:tabs>
+        <w:ind w:left="5760" w:hanging="360"/>
+      </w:pPr>
+      <w:rPr>
+        <w:rFonts w:ascii="Wingdings" w:hAnsi="Wingdings" w:hint="default"/>
+        <w:sz w:val="20"/>
+      </w:rPr>
+    </w:lvl>
+    <w:lvl w:ilvl="8" w:tentative="1">
+      <w:start w:val="1"/>
+      <w:numFmt w:val="bullet"/>
+      <w:lvlText w:val=""/>
+      <w:lvlJc w:val="left"/>
+      <w:pPr>
+        <w:tabs>
+          <w:tab w:val="num" w:pos="6480"/>
+        </w:tabs>
+        <w:ind w:left="6480" w:hanging="360"/>
+      </w:pPr>
+      <w:rPr>
+        <w:rFonts w:ascii="Wingdings" w:hAnsi="Wingdings" w:hint="default"/>
+        <w:sz w:val="20"/>
+      </w:rPr>
+    </w:lvl>
+  </w:abstractNum>
+  <w:abstractNum w:abstractNumId="7" w15:restartNumberingAfterBreak="0">
+    <w:nsid w:val="2D1121D6"/>
+    <w:multiLevelType w:val="multilevel"/>
+    <w:tmpl w:val="A1828FD8"/>
+    <w:lvl w:ilvl="0">
+      <w:start w:val="1"/>
+      <w:numFmt w:val="bullet"/>
+      <w:lvlText w:val=""/>
+      <w:lvlJc w:val="left"/>
+      <w:pPr>
+        <w:tabs>
+          <w:tab w:val="num" w:pos="720"/>
+        </w:tabs>
+        <w:ind w:left="720" w:hanging="360"/>
+      </w:pPr>
+      <w:rPr>
+        <w:rFonts w:ascii="Symbol" w:hAnsi="Symbol" w:hint="default"/>
+        <w:sz w:val="20"/>
+      </w:rPr>
+    </w:lvl>
+    <w:lvl w:ilvl="1" w:tentative="1">
+      <w:start w:val="1"/>
+      <w:numFmt w:val="bullet"/>
+      <w:lvlText w:val="o"/>
+      <w:lvlJc w:val="left"/>
+      <w:pPr>
+        <w:tabs>
+          <w:tab w:val="num" w:pos="1440"/>
+        </w:tabs>
+        <w:ind w:left="1440" w:hanging="360"/>
+      </w:pPr>
+      <w:rPr>
+        <w:rFonts w:ascii="Courier New" w:hAnsi="Courier New" w:hint="default"/>
+        <w:sz w:val="20"/>
+      </w:rPr>
+    </w:lvl>
+    <w:lvl w:ilvl="2" w:tentative="1">
+      <w:start w:val="1"/>
+      <w:numFmt w:val="bullet"/>
+      <w:lvlText w:val=""/>
+      <w:lvlJc w:val="left"/>
+      <w:pPr>
+        <w:tabs>
+          <w:tab w:val="num" w:pos="2160"/>
+        </w:tabs>
+        <w:ind w:left="2160" w:hanging="360"/>
+      </w:pPr>
+      <w:rPr>
+        <w:rFonts w:ascii="Wingdings" w:hAnsi="Wingdings" w:hint="default"/>
+        <w:sz w:val="20"/>
+      </w:rPr>
+    </w:lvl>
+    <w:lvl w:ilvl="3" w:tentative="1">
+      <w:start w:val="1"/>
+      <w:numFmt w:val="bullet"/>
+      <w:lvlText w:val=""/>
+      <w:lvlJc w:val="left"/>
+      <w:pPr>
+        <w:tabs>
+          <w:tab w:val="num" w:pos="2880"/>
+        </w:tabs>
+        <w:ind w:left="2880" w:hanging="360"/>
+      </w:pPr>
+      <w:rPr>
+        <w:rFonts w:ascii="Wingdings" w:hAnsi="Wingdings" w:hint="default"/>
+        <w:sz w:val="20"/>
+      </w:rPr>
+    </w:lvl>
+    <w:lvl w:ilvl="4" w:tentative="1">
+      <w:start w:val="1"/>
+      <w:numFmt w:val="bullet"/>
+      <w:lvlText w:val=""/>
+      <w:lvlJc w:val="left"/>
+      <w:pPr>
+        <w:tabs>
+          <w:tab w:val="num" w:pos="3600"/>
+        </w:tabs>
+        <w:ind w:left="3600" w:hanging="360"/>
+      </w:pPr>
+      <w:rPr>
+        <w:rFonts w:ascii="Wingdings" w:hAnsi="Wingdings" w:hint="default"/>
+        <w:sz w:val="20"/>
+      </w:rPr>
+    </w:lvl>
+    <w:lvl w:ilvl="5" w:tentative="1">
+      <w:start w:val="1"/>
+      <w:numFmt w:val="bullet"/>
+      <w:lvlText w:val=""/>
+      <w:lvlJc w:val="left"/>
+      <w:pPr>
+        <w:tabs>
+          <w:tab w:val="num" w:pos="4320"/>
+        </w:tabs>
+        <w:ind w:left="4320" w:hanging="360"/>
+      </w:pPr>
+      <w:rPr>
+        <w:rFonts w:ascii="Wingdings" w:hAnsi="Wingdings" w:hint="default"/>
+        <w:sz w:val="20"/>
+      </w:rPr>
+    </w:lvl>
+    <w:lvl w:ilvl="6" w:tentative="1">
+      <w:start w:val="1"/>
+      <w:numFmt w:val="bullet"/>
+      <w:lvlText w:val=""/>
+      <w:lvlJc w:val="left"/>
+      <w:pPr>
+        <w:tabs>
+          <w:tab w:val="num" w:pos="5040"/>
+        </w:tabs>
+        <w:ind w:left="5040" w:hanging="360"/>
+      </w:pPr>
+      <w:rPr>
+        <w:rFonts w:ascii="Wingdings" w:hAnsi="Wingdings" w:hint="default"/>
+        <w:sz w:val="20"/>
+      </w:rPr>
+    </w:lvl>
+    <w:lvl w:ilvl="7" w:tentative="1">
+      <w:start w:val="1"/>
+      <w:numFmt w:val="bullet"/>
+      <w:lvlText w:val=""/>
+      <w:lvlJc w:val="left"/>
+      <w:pPr>
+        <w:tabs>
+          <w:tab w:val="num" w:pos="5760"/>
+        </w:tabs>
+        <w:ind w:left="5760" w:hanging="360"/>
+      </w:pPr>
+      <w:rPr>
+        <w:rFonts w:ascii="Wingdings" w:hAnsi="Wingdings" w:hint="default"/>
+        <w:sz w:val="20"/>
+      </w:rPr>
+    </w:lvl>
+    <w:lvl w:ilvl="8" w:tentative="1">
+      <w:start w:val="1"/>
+      <w:numFmt w:val="bullet"/>
+      <w:lvlText w:val=""/>
+      <w:lvlJc w:val="left"/>
+      <w:pPr>
+        <w:tabs>
+          <w:tab w:val="num" w:pos="6480"/>
+        </w:tabs>
+        <w:ind w:left="6480" w:hanging="360"/>
+      </w:pPr>
+      <w:rPr>
+        <w:rFonts w:ascii="Wingdings" w:hAnsi="Wingdings" w:hint="default"/>
+        <w:sz w:val="20"/>
+      </w:rPr>
+    </w:lvl>
+  </w:abstractNum>
+  <w:abstractNum w:abstractNumId="8" w15:restartNumberingAfterBreak="0">
+    <w:nsid w:val="34C807E9"/>
+    <w:multiLevelType w:val="multilevel"/>
+    <w:tmpl w:val="440CDF16"/>
+    <w:lvl w:ilvl="0">
+      <w:start w:val="1"/>
+      <w:numFmt w:val="bullet"/>
+      <w:lvlText w:val=""/>
+      <w:lvlJc w:val="left"/>
+      <w:pPr>
+        <w:tabs>
+          <w:tab w:val="num" w:pos="720"/>
+        </w:tabs>
+        <w:ind w:left="720" w:hanging="360"/>
+      </w:pPr>
+      <w:rPr>
+        <w:rFonts w:ascii="Symbol" w:hAnsi="Symbol" w:hint="default"/>
+        <w:sz w:val="20"/>
+      </w:rPr>
+    </w:lvl>
+    <w:lvl w:ilvl="1" w:tentative="1">
+      <w:start w:val="1"/>
+      <w:numFmt w:val="bullet"/>
+      <w:lvlText w:val="o"/>
+      <w:lvlJc w:val="left"/>
+      <w:pPr>
+        <w:tabs>
+          <w:tab w:val="num" w:pos="1440"/>
+        </w:tabs>
+        <w:ind w:left="1440" w:hanging="360"/>
+      </w:pPr>
+      <w:rPr>
+        <w:rFonts w:ascii="Courier New" w:hAnsi="Courier New" w:hint="default"/>
+        <w:sz w:val="20"/>
+      </w:rPr>
+    </w:lvl>
+    <w:lvl w:ilvl="2" w:tentative="1">
+      <w:start w:val="1"/>
+      <w:numFmt w:val="bullet"/>
+      <w:lvlText w:val=""/>
+      <w:lvlJc w:val="left"/>
+      <w:pPr>
+        <w:tabs>
+          <w:tab w:val="num" w:pos="2160"/>
+        </w:tabs>
+        <w:ind w:left="2160" w:hanging="360"/>
+      </w:pPr>
+      <w:rPr>
+        <w:rFonts w:ascii="Wingdings" w:hAnsi="Wingdings" w:hint="default"/>
+        <w:sz w:val="20"/>
+      </w:rPr>
+    </w:lvl>
+    <w:lvl w:ilvl="3" w:tentative="1">
+      <w:start w:val="1"/>
+      <w:numFmt w:val="bullet"/>
+      <w:lvlText w:val=""/>
+      <w:lvlJc w:val="left"/>
+      <w:pPr>
+        <w:tabs>
+          <w:tab w:val="num" w:pos="2880"/>
+        </w:tabs>
+        <w:ind w:left="2880" w:hanging="360"/>
+      </w:pPr>
+      <w:rPr>
+        <w:rFonts w:ascii="Wingdings" w:hAnsi="Wingdings" w:hint="default"/>
+        <w:sz w:val="20"/>
+      </w:rPr>
+    </w:lvl>
+    <w:lvl w:ilvl="4" w:tentative="1">
+      <w:start w:val="1"/>
+      <w:numFmt w:val="bullet"/>
+      <w:lvlText w:val=""/>
+      <w:lvlJc w:val="left"/>
+      <w:pPr>
+        <w:tabs>
+          <w:tab w:val="num" w:pos="3600"/>
+        </w:tabs>
+        <w:ind w:left="3600" w:hanging="360"/>
+      </w:pPr>
+      <w:rPr>
+        <w:rFonts w:ascii="Wingdings" w:hAnsi="Wingdings" w:hint="default"/>
+        <w:sz w:val="20"/>
+      </w:rPr>
+    </w:lvl>
+    <w:lvl w:ilvl="5" w:tentative="1">
+      <w:start w:val="1"/>
+      <w:numFmt w:val="bullet"/>
+      <w:lvlText w:val=""/>
+      <w:lvlJc w:val="left"/>
+      <w:pPr>
+        <w:tabs>
+          <w:tab w:val="num" w:pos="4320"/>
+        </w:tabs>
+        <w:ind w:left="4320" w:hanging="360"/>
+      </w:pPr>
+      <w:rPr>
+        <w:rFonts w:ascii="Wingdings" w:hAnsi="Wingdings" w:hint="default"/>
+        <w:sz w:val="20"/>
+      </w:rPr>
+    </w:lvl>
+    <w:lvl w:ilvl="6" w:tentative="1">
+      <w:start w:val="1"/>
+      <w:numFmt w:val="bullet"/>
+      <w:lvlText w:val=""/>
+      <w:lvlJc w:val="left"/>
+      <w:pPr>
+        <w:tabs>
+          <w:tab w:val="num" w:pos="5040"/>
+        </w:tabs>
+        <w:ind w:left="5040" w:hanging="360"/>
+      </w:pPr>
+      <w:rPr>
+        <w:rFonts w:ascii="Wingdings" w:hAnsi="Wingdings" w:hint="default"/>
+        <w:sz w:val="20"/>
+      </w:rPr>
+    </w:lvl>
+    <w:lvl w:ilvl="7" w:tentative="1">
+      <w:start w:val="1"/>
+      <w:numFmt w:val="bullet"/>
+      <w:lvlText w:val=""/>
+      <w:lvlJc w:val="left"/>
+      <w:pPr>
+        <w:tabs>
+          <w:tab w:val="num" w:pos="5760"/>
+        </w:tabs>
+        <w:ind w:left="5760" w:hanging="360"/>
+      </w:pPr>
+      <w:rPr>
+        <w:rFonts w:ascii="Wingdings" w:hAnsi="Wingdings" w:hint="default"/>
+        <w:sz w:val="20"/>
+      </w:rPr>
+    </w:lvl>
+    <w:lvl w:ilvl="8" w:tentative="1">
+      <w:start w:val="1"/>
+      <w:numFmt w:val="bullet"/>
+      <w:lvlText w:val=""/>
+      <w:lvlJc w:val="left"/>
+      <w:pPr>
+        <w:tabs>
+          <w:tab w:val="num" w:pos="6480"/>
+        </w:tabs>
+        <w:ind w:left="6480" w:hanging="360"/>
+      </w:pPr>
+      <w:rPr>
+        <w:rFonts w:ascii="Wingdings" w:hAnsi="Wingdings" w:hint="default"/>
+        <w:sz w:val="20"/>
+      </w:rPr>
+    </w:lvl>
+  </w:abstractNum>
+  <w:abstractNum w:abstractNumId="9" w15:restartNumberingAfterBreak="0">
     <w:nsid w:val="3BA16064"/>
     <w:multiLevelType w:val="multilevel"/>
     <w:tmpl w:val="368E45FA"/>
@@ -3659,7 +6153,305 @@
       </w:rPr>
     </w:lvl>
   </w:abstractNum>
-  <w:abstractNum w:abstractNumId="5" w15:restartNumberingAfterBreak="0">
+  <w:abstractNum w:abstractNumId="10" w15:restartNumberingAfterBreak="0">
+    <w:nsid w:val="422253AD"/>
+    <w:multiLevelType w:val="multilevel"/>
+    <w:tmpl w:val="C54EB932"/>
+    <w:lvl w:ilvl="0">
+      <w:start w:val="1"/>
+      <w:numFmt w:val="bullet"/>
+      <w:lvlText w:val=""/>
+      <w:lvlJc w:val="left"/>
+      <w:pPr>
+        <w:tabs>
+          <w:tab w:val="num" w:pos="720"/>
+        </w:tabs>
+        <w:ind w:left="720" w:hanging="360"/>
+      </w:pPr>
+      <w:rPr>
+        <w:rFonts w:ascii="Symbol" w:hAnsi="Symbol" w:hint="default"/>
+        <w:sz w:val="20"/>
+      </w:rPr>
+    </w:lvl>
+    <w:lvl w:ilvl="1" w:tentative="1">
+      <w:start w:val="1"/>
+      <w:numFmt w:val="bullet"/>
+      <w:lvlText w:val="o"/>
+      <w:lvlJc w:val="left"/>
+      <w:pPr>
+        <w:tabs>
+          <w:tab w:val="num" w:pos="1440"/>
+        </w:tabs>
+        <w:ind w:left="1440" w:hanging="360"/>
+      </w:pPr>
+      <w:rPr>
+        <w:rFonts w:ascii="Courier New" w:hAnsi="Courier New" w:hint="default"/>
+        <w:sz w:val="20"/>
+      </w:rPr>
+    </w:lvl>
+    <w:lvl w:ilvl="2" w:tentative="1">
+      <w:start w:val="1"/>
+      <w:numFmt w:val="bullet"/>
+      <w:lvlText w:val=""/>
+      <w:lvlJc w:val="left"/>
+      <w:pPr>
+        <w:tabs>
+          <w:tab w:val="num" w:pos="2160"/>
+        </w:tabs>
+        <w:ind w:left="2160" w:hanging="360"/>
+      </w:pPr>
+      <w:rPr>
+        <w:rFonts w:ascii="Wingdings" w:hAnsi="Wingdings" w:hint="default"/>
+        <w:sz w:val="20"/>
+      </w:rPr>
+    </w:lvl>
+    <w:lvl w:ilvl="3" w:tentative="1">
+      <w:start w:val="1"/>
+      <w:numFmt w:val="bullet"/>
+      <w:lvlText w:val=""/>
+      <w:lvlJc w:val="left"/>
+      <w:pPr>
+        <w:tabs>
+          <w:tab w:val="num" w:pos="2880"/>
+        </w:tabs>
+        <w:ind w:left="2880" w:hanging="360"/>
+      </w:pPr>
+      <w:rPr>
+        <w:rFonts w:ascii="Wingdings" w:hAnsi="Wingdings" w:hint="default"/>
+        <w:sz w:val="20"/>
+      </w:rPr>
+    </w:lvl>
+    <w:lvl w:ilvl="4" w:tentative="1">
+      <w:start w:val="1"/>
+      <w:numFmt w:val="bullet"/>
+      <w:lvlText w:val=""/>
+      <w:lvlJc w:val="left"/>
+      <w:pPr>
+        <w:tabs>
+          <w:tab w:val="num" w:pos="3600"/>
+        </w:tabs>
+        <w:ind w:left="3600" w:hanging="360"/>
+      </w:pPr>
+      <w:rPr>
+        <w:rFonts w:ascii="Wingdings" w:hAnsi="Wingdings" w:hint="default"/>
+        <w:sz w:val="20"/>
+      </w:rPr>
+    </w:lvl>
+    <w:lvl w:ilvl="5" w:tentative="1">
+      <w:start w:val="1"/>
+      <w:numFmt w:val="bullet"/>
+      <w:lvlText w:val=""/>
+      <w:lvlJc w:val="left"/>
+      <w:pPr>
+        <w:tabs>
+          <w:tab w:val="num" w:pos="4320"/>
+        </w:tabs>
+        <w:ind w:left="4320" w:hanging="360"/>
+      </w:pPr>
+      <w:rPr>
+        <w:rFonts w:ascii="Wingdings" w:hAnsi="Wingdings" w:hint="default"/>
+        <w:sz w:val="20"/>
+      </w:rPr>
+    </w:lvl>
+    <w:lvl w:ilvl="6" w:tentative="1">
+      <w:start w:val="1"/>
+      <w:numFmt w:val="bullet"/>
+      <w:lvlText w:val=""/>
+      <w:lvlJc w:val="left"/>
+      <w:pPr>
+        <w:tabs>
+          <w:tab w:val="num" w:pos="5040"/>
+        </w:tabs>
+        <w:ind w:left="5040" w:hanging="360"/>
+      </w:pPr>
+      <w:rPr>
+        <w:rFonts w:ascii="Wingdings" w:hAnsi="Wingdings" w:hint="default"/>
+        <w:sz w:val="20"/>
+      </w:rPr>
+    </w:lvl>
+    <w:lvl w:ilvl="7" w:tentative="1">
+      <w:start w:val="1"/>
+      <w:numFmt w:val="bullet"/>
+      <w:lvlText w:val=""/>
+      <w:lvlJc w:val="left"/>
+      <w:pPr>
+        <w:tabs>
+          <w:tab w:val="num" w:pos="5760"/>
+        </w:tabs>
+        <w:ind w:left="5760" w:hanging="360"/>
+      </w:pPr>
+      <w:rPr>
+        <w:rFonts w:ascii="Wingdings" w:hAnsi="Wingdings" w:hint="default"/>
+        <w:sz w:val="20"/>
+      </w:rPr>
+    </w:lvl>
+    <w:lvl w:ilvl="8" w:tentative="1">
+      <w:start w:val="1"/>
+      <w:numFmt w:val="bullet"/>
+      <w:lvlText w:val=""/>
+      <w:lvlJc w:val="left"/>
+      <w:pPr>
+        <w:tabs>
+          <w:tab w:val="num" w:pos="6480"/>
+        </w:tabs>
+        <w:ind w:left="6480" w:hanging="360"/>
+      </w:pPr>
+      <w:rPr>
+        <w:rFonts w:ascii="Wingdings" w:hAnsi="Wingdings" w:hint="default"/>
+        <w:sz w:val="20"/>
+      </w:rPr>
+    </w:lvl>
+  </w:abstractNum>
+  <w:abstractNum w:abstractNumId="11" w15:restartNumberingAfterBreak="0">
+    <w:nsid w:val="47622B95"/>
+    <w:multiLevelType w:val="multilevel"/>
+    <w:tmpl w:val="41269BBA"/>
+    <w:lvl w:ilvl="0">
+      <w:start w:val="1"/>
+      <w:numFmt w:val="bullet"/>
+      <w:lvlText w:val=""/>
+      <w:lvlJc w:val="left"/>
+      <w:pPr>
+        <w:tabs>
+          <w:tab w:val="num" w:pos="720"/>
+        </w:tabs>
+        <w:ind w:left="720" w:hanging="360"/>
+      </w:pPr>
+      <w:rPr>
+        <w:rFonts w:ascii="Symbol" w:hAnsi="Symbol" w:hint="default"/>
+        <w:sz w:val="20"/>
+      </w:rPr>
+    </w:lvl>
+    <w:lvl w:ilvl="1" w:tentative="1">
+      <w:start w:val="1"/>
+      <w:numFmt w:val="bullet"/>
+      <w:lvlText w:val="o"/>
+      <w:lvlJc w:val="left"/>
+      <w:pPr>
+        <w:tabs>
+          <w:tab w:val="num" w:pos="1440"/>
+        </w:tabs>
+        <w:ind w:left="1440" w:hanging="360"/>
+      </w:pPr>
+      <w:rPr>
+        <w:rFonts w:ascii="Courier New" w:hAnsi="Courier New" w:hint="default"/>
+        <w:sz w:val="20"/>
+      </w:rPr>
+    </w:lvl>
+    <w:lvl w:ilvl="2" w:tentative="1">
+      <w:start w:val="1"/>
+      <w:numFmt w:val="bullet"/>
+      <w:lvlText w:val=""/>
+      <w:lvlJc w:val="left"/>
+      <w:pPr>
+        <w:tabs>
+          <w:tab w:val="num" w:pos="2160"/>
+        </w:tabs>
+        <w:ind w:left="2160" w:hanging="360"/>
+      </w:pPr>
+      <w:rPr>
+        <w:rFonts w:ascii="Wingdings" w:hAnsi="Wingdings" w:hint="default"/>
+        <w:sz w:val="20"/>
+      </w:rPr>
+    </w:lvl>
+    <w:lvl w:ilvl="3" w:tentative="1">
+      <w:start w:val="1"/>
+      <w:numFmt w:val="bullet"/>
+      <w:lvlText w:val=""/>
+      <w:lvlJc w:val="left"/>
+      <w:pPr>
+        <w:tabs>
+          <w:tab w:val="num" w:pos="2880"/>
+        </w:tabs>
+        <w:ind w:left="2880" w:hanging="360"/>
+      </w:pPr>
+      <w:rPr>
+        <w:rFonts w:ascii="Wingdings" w:hAnsi="Wingdings" w:hint="default"/>
+        <w:sz w:val="20"/>
+      </w:rPr>
+    </w:lvl>
+    <w:lvl w:ilvl="4" w:tentative="1">
+      <w:start w:val="1"/>
+      <w:numFmt w:val="bullet"/>
+      <w:lvlText w:val=""/>
+      <w:lvlJc w:val="left"/>
+      <w:pPr>
+        <w:tabs>
+          <w:tab w:val="num" w:pos="3600"/>
+        </w:tabs>
+        <w:ind w:left="3600" w:hanging="360"/>
+      </w:pPr>
+      <w:rPr>
+        <w:rFonts w:ascii="Wingdings" w:hAnsi="Wingdings" w:hint="default"/>
+        <w:sz w:val="20"/>
+      </w:rPr>
+    </w:lvl>
+    <w:lvl w:ilvl="5" w:tentative="1">
+      <w:start w:val="1"/>
+      <w:numFmt w:val="bullet"/>
+      <w:lvlText w:val=""/>
+      <w:lvlJc w:val="left"/>
+      <w:pPr>
+        <w:tabs>
+          <w:tab w:val="num" w:pos="4320"/>
+        </w:tabs>
+        <w:ind w:left="4320" w:hanging="360"/>
+      </w:pPr>
+      <w:rPr>
+        <w:rFonts w:ascii="Wingdings" w:hAnsi="Wingdings" w:hint="default"/>
+        <w:sz w:val="20"/>
+      </w:rPr>
+    </w:lvl>
+    <w:lvl w:ilvl="6" w:tentative="1">
+      <w:start w:val="1"/>
+      <w:numFmt w:val="bullet"/>
+      <w:lvlText w:val=""/>
+      <w:lvlJc w:val="left"/>
+      <w:pPr>
+        <w:tabs>
+          <w:tab w:val="num" w:pos="5040"/>
+        </w:tabs>
+        <w:ind w:left="5040" w:hanging="360"/>
+      </w:pPr>
+      <w:rPr>
+        <w:rFonts w:ascii="Wingdings" w:hAnsi="Wingdings" w:hint="default"/>
+        <w:sz w:val="20"/>
+      </w:rPr>
+    </w:lvl>
+    <w:lvl w:ilvl="7" w:tentative="1">
+      <w:start w:val="1"/>
+      <w:numFmt w:val="bullet"/>
+      <w:lvlText w:val=""/>
+      <w:lvlJc w:val="left"/>
+      <w:pPr>
+        <w:tabs>
+          <w:tab w:val="num" w:pos="5760"/>
+        </w:tabs>
+        <w:ind w:left="5760" w:hanging="360"/>
+      </w:pPr>
+      <w:rPr>
+        <w:rFonts w:ascii="Wingdings" w:hAnsi="Wingdings" w:hint="default"/>
+        <w:sz w:val="20"/>
+      </w:rPr>
+    </w:lvl>
+    <w:lvl w:ilvl="8" w:tentative="1">
+      <w:start w:val="1"/>
+      <w:numFmt w:val="bullet"/>
+      <w:lvlText w:val=""/>
+      <w:lvlJc w:val="left"/>
+      <w:pPr>
+        <w:tabs>
+          <w:tab w:val="num" w:pos="6480"/>
+        </w:tabs>
+        <w:ind w:left="6480" w:hanging="360"/>
+      </w:pPr>
+      <w:rPr>
+        <w:rFonts w:ascii="Wingdings" w:hAnsi="Wingdings" w:hint="default"/>
+        <w:sz w:val="20"/>
+      </w:rPr>
+    </w:lvl>
+  </w:abstractNum>
+  <w:abstractNum w:abstractNumId="12" w15:restartNumberingAfterBreak="0">
     <w:nsid w:val="47DC03D9"/>
     <w:multiLevelType w:val="multilevel"/>
     <w:tmpl w:val="8CF86EDA"/>
@@ -3808,7 +6600,305 @@
       </w:rPr>
     </w:lvl>
   </w:abstractNum>
-  <w:abstractNum w:abstractNumId="6" w15:restartNumberingAfterBreak="0">
+  <w:abstractNum w:abstractNumId="13" w15:restartNumberingAfterBreak="0">
+    <w:nsid w:val="4B5E0BF3"/>
+    <w:multiLevelType w:val="multilevel"/>
+    <w:tmpl w:val="28D4ACCC"/>
+    <w:lvl w:ilvl="0">
+      <w:start w:val="1"/>
+      <w:numFmt w:val="bullet"/>
+      <w:lvlText w:val=""/>
+      <w:lvlJc w:val="left"/>
+      <w:pPr>
+        <w:tabs>
+          <w:tab w:val="num" w:pos="720"/>
+        </w:tabs>
+        <w:ind w:left="720" w:hanging="360"/>
+      </w:pPr>
+      <w:rPr>
+        <w:rFonts w:ascii="Symbol" w:hAnsi="Symbol" w:hint="default"/>
+        <w:sz w:val="20"/>
+      </w:rPr>
+    </w:lvl>
+    <w:lvl w:ilvl="1" w:tentative="1">
+      <w:start w:val="1"/>
+      <w:numFmt w:val="bullet"/>
+      <w:lvlText w:val="o"/>
+      <w:lvlJc w:val="left"/>
+      <w:pPr>
+        <w:tabs>
+          <w:tab w:val="num" w:pos="1440"/>
+        </w:tabs>
+        <w:ind w:left="1440" w:hanging="360"/>
+      </w:pPr>
+      <w:rPr>
+        <w:rFonts w:ascii="Courier New" w:hAnsi="Courier New" w:hint="default"/>
+        <w:sz w:val="20"/>
+      </w:rPr>
+    </w:lvl>
+    <w:lvl w:ilvl="2" w:tentative="1">
+      <w:start w:val="1"/>
+      <w:numFmt w:val="bullet"/>
+      <w:lvlText w:val=""/>
+      <w:lvlJc w:val="left"/>
+      <w:pPr>
+        <w:tabs>
+          <w:tab w:val="num" w:pos="2160"/>
+        </w:tabs>
+        <w:ind w:left="2160" w:hanging="360"/>
+      </w:pPr>
+      <w:rPr>
+        <w:rFonts w:ascii="Wingdings" w:hAnsi="Wingdings" w:hint="default"/>
+        <w:sz w:val="20"/>
+      </w:rPr>
+    </w:lvl>
+    <w:lvl w:ilvl="3" w:tentative="1">
+      <w:start w:val="1"/>
+      <w:numFmt w:val="bullet"/>
+      <w:lvlText w:val=""/>
+      <w:lvlJc w:val="left"/>
+      <w:pPr>
+        <w:tabs>
+          <w:tab w:val="num" w:pos="2880"/>
+        </w:tabs>
+        <w:ind w:left="2880" w:hanging="360"/>
+      </w:pPr>
+      <w:rPr>
+        <w:rFonts w:ascii="Wingdings" w:hAnsi="Wingdings" w:hint="default"/>
+        <w:sz w:val="20"/>
+      </w:rPr>
+    </w:lvl>
+    <w:lvl w:ilvl="4" w:tentative="1">
+      <w:start w:val="1"/>
+      <w:numFmt w:val="bullet"/>
+      <w:lvlText w:val=""/>
+      <w:lvlJc w:val="left"/>
+      <w:pPr>
+        <w:tabs>
+          <w:tab w:val="num" w:pos="3600"/>
+        </w:tabs>
+        <w:ind w:left="3600" w:hanging="360"/>
+      </w:pPr>
+      <w:rPr>
+        <w:rFonts w:ascii="Wingdings" w:hAnsi="Wingdings" w:hint="default"/>
+        <w:sz w:val="20"/>
+      </w:rPr>
+    </w:lvl>
+    <w:lvl w:ilvl="5" w:tentative="1">
+      <w:start w:val="1"/>
+      <w:numFmt w:val="bullet"/>
+      <w:lvlText w:val=""/>
+      <w:lvlJc w:val="left"/>
+      <w:pPr>
+        <w:tabs>
+          <w:tab w:val="num" w:pos="4320"/>
+        </w:tabs>
+        <w:ind w:left="4320" w:hanging="360"/>
+      </w:pPr>
+      <w:rPr>
+        <w:rFonts w:ascii="Wingdings" w:hAnsi="Wingdings" w:hint="default"/>
+        <w:sz w:val="20"/>
+      </w:rPr>
+    </w:lvl>
+    <w:lvl w:ilvl="6" w:tentative="1">
+      <w:start w:val="1"/>
+      <w:numFmt w:val="bullet"/>
+      <w:lvlText w:val=""/>
+      <w:lvlJc w:val="left"/>
+      <w:pPr>
+        <w:tabs>
+          <w:tab w:val="num" w:pos="5040"/>
+        </w:tabs>
+        <w:ind w:left="5040" w:hanging="360"/>
+      </w:pPr>
+      <w:rPr>
+        <w:rFonts w:ascii="Wingdings" w:hAnsi="Wingdings" w:hint="default"/>
+        <w:sz w:val="20"/>
+      </w:rPr>
+    </w:lvl>
+    <w:lvl w:ilvl="7" w:tentative="1">
+      <w:start w:val="1"/>
+      <w:numFmt w:val="bullet"/>
+      <w:lvlText w:val=""/>
+      <w:lvlJc w:val="left"/>
+      <w:pPr>
+        <w:tabs>
+          <w:tab w:val="num" w:pos="5760"/>
+        </w:tabs>
+        <w:ind w:left="5760" w:hanging="360"/>
+      </w:pPr>
+      <w:rPr>
+        <w:rFonts w:ascii="Wingdings" w:hAnsi="Wingdings" w:hint="default"/>
+        <w:sz w:val="20"/>
+      </w:rPr>
+    </w:lvl>
+    <w:lvl w:ilvl="8" w:tentative="1">
+      <w:start w:val="1"/>
+      <w:numFmt w:val="bullet"/>
+      <w:lvlText w:val=""/>
+      <w:lvlJc w:val="left"/>
+      <w:pPr>
+        <w:tabs>
+          <w:tab w:val="num" w:pos="6480"/>
+        </w:tabs>
+        <w:ind w:left="6480" w:hanging="360"/>
+      </w:pPr>
+      <w:rPr>
+        <w:rFonts w:ascii="Wingdings" w:hAnsi="Wingdings" w:hint="default"/>
+        <w:sz w:val="20"/>
+      </w:rPr>
+    </w:lvl>
+  </w:abstractNum>
+  <w:abstractNum w:abstractNumId="14" w15:restartNumberingAfterBreak="0">
+    <w:nsid w:val="603F14A2"/>
+    <w:multiLevelType w:val="multilevel"/>
+    <w:tmpl w:val="5F4C56A4"/>
+    <w:lvl w:ilvl="0">
+      <w:start w:val="1"/>
+      <w:numFmt w:val="bullet"/>
+      <w:lvlText w:val=""/>
+      <w:lvlJc w:val="left"/>
+      <w:pPr>
+        <w:tabs>
+          <w:tab w:val="num" w:pos="720"/>
+        </w:tabs>
+        <w:ind w:left="720" w:hanging="360"/>
+      </w:pPr>
+      <w:rPr>
+        <w:rFonts w:ascii="Symbol" w:hAnsi="Symbol" w:hint="default"/>
+        <w:sz w:val="20"/>
+      </w:rPr>
+    </w:lvl>
+    <w:lvl w:ilvl="1" w:tentative="1">
+      <w:start w:val="1"/>
+      <w:numFmt w:val="bullet"/>
+      <w:lvlText w:val="o"/>
+      <w:lvlJc w:val="left"/>
+      <w:pPr>
+        <w:tabs>
+          <w:tab w:val="num" w:pos="1440"/>
+        </w:tabs>
+        <w:ind w:left="1440" w:hanging="360"/>
+      </w:pPr>
+      <w:rPr>
+        <w:rFonts w:ascii="Courier New" w:hAnsi="Courier New" w:hint="default"/>
+        <w:sz w:val="20"/>
+      </w:rPr>
+    </w:lvl>
+    <w:lvl w:ilvl="2" w:tentative="1">
+      <w:start w:val="1"/>
+      <w:numFmt w:val="bullet"/>
+      <w:lvlText w:val=""/>
+      <w:lvlJc w:val="left"/>
+      <w:pPr>
+        <w:tabs>
+          <w:tab w:val="num" w:pos="2160"/>
+        </w:tabs>
+        <w:ind w:left="2160" w:hanging="360"/>
+      </w:pPr>
+      <w:rPr>
+        <w:rFonts w:ascii="Wingdings" w:hAnsi="Wingdings" w:hint="default"/>
+        <w:sz w:val="20"/>
+      </w:rPr>
+    </w:lvl>
+    <w:lvl w:ilvl="3" w:tentative="1">
+      <w:start w:val="1"/>
+      <w:numFmt w:val="bullet"/>
+      <w:lvlText w:val=""/>
+      <w:lvlJc w:val="left"/>
+      <w:pPr>
+        <w:tabs>
+          <w:tab w:val="num" w:pos="2880"/>
+        </w:tabs>
+        <w:ind w:left="2880" w:hanging="360"/>
+      </w:pPr>
+      <w:rPr>
+        <w:rFonts w:ascii="Wingdings" w:hAnsi="Wingdings" w:hint="default"/>
+        <w:sz w:val="20"/>
+      </w:rPr>
+    </w:lvl>
+    <w:lvl w:ilvl="4" w:tentative="1">
+      <w:start w:val="1"/>
+      <w:numFmt w:val="bullet"/>
+      <w:lvlText w:val=""/>
+      <w:lvlJc w:val="left"/>
+      <w:pPr>
+        <w:tabs>
+          <w:tab w:val="num" w:pos="3600"/>
+        </w:tabs>
+        <w:ind w:left="3600" w:hanging="360"/>
+      </w:pPr>
+      <w:rPr>
+        <w:rFonts w:ascii="Wingdings" w:hAnsi="Wingdings" w:hint="default"/>
+        <w:sz w:val="20"/>
+      </w:rPr>
+    </w:lvl>
+    <w:lvl w:ilvl="5" w:tentative="1">
+      <w:start w:val="1"/>
+      <w:numFmt w:val="bullet"/>
+      <w:lvlText w:val=""/>
+      <w:lvlJc w:val="left"/>
+      <w:pPr>
+        <w:tabs>
+          <w:tab w:val="num" w:pos="4320"/>
+        </w:tabs>
+        <w:ind w:left="4320" w:hanging="360"/>
+      </w:pPr>
+      <w:rPr>
+        <w:rFonts w:ascii="Wingdings" w:hAnsi="Wingdings" w:hint="default"/>
+        <w:sz w:val="20"/>
+      </w:rPr>
+    </w:lvl>
+    <w:lvl w:ilvl="6" w:tentative="1">
+      <w:start w:val="1"/>
+      <w:numFmt w:val="bullet"/>
+      <w:lvlText w:val=""/>
+      <w:lvlJc w:val="left"/>
+      <w:pPr>
+        <w:tabs>
+          <w:tab w:val="num" w:pos="5040"/>
+        </w:tabs>
+        <w:ind w:left="5040" w:hanging="360"/>
+      </w:pPr>
+      <w:rPr>
+        <w:rFonts w:ascii="Wingdings" w:hAnsi="Wingdings" w:hint="default"/>
+        <w:sz w:val="20"/>
+      </w:rPr>
+    </w:lvl>
+    <w:lvl w:ilvl="7" w:tentative="1">
+      <w:start w:val="1"/>
+      <w:numFmt w:val="bullet"/>
+      <w:lvlText w:val=""/>
+      <w:lvlJc w:val="left"/>
+      <w:pPr>
+        <w:tabs>
+          <w:tab w:val="num" w:pos="5760"/>
+        </w:tabs>
+        <w:ind w:left="5760" w:hanging="360"/>
+      </w:pPr>
+      <w:rPr>
+        <w:rFonts w:ascii="Wingdings" w:hAnsi="Wingdings" w:hint="default"/>
+        <w:sz w:val="20"/>
+      </w:rPr>
+    </w:lvl>
+    <w:lvl w:ilvl="8" w:tentative="1">
+      <w:start w:val="1"/>
+      <w:numFmt w:val="bullet"/>
+      <w:lvlText w:val=""/>
+      <w:lvlJc w:val="left"/>
+      <w:pPr>
+        <w:tabs>
+          <w:tab w:val="num" w:pos="6480"/>
+        </w:tabs>
+        <w:ind w:left="6480" w:hanging="360"/>
+      </w:pPr>
+      <w:rPr>
+        <w:rFonts w:ascii="Wingdings" w:hAnsi="Wingdings" w:hint="default"/>
+        <w:sz w:val="20"/>
+      </w:rPr>
+    </w:lvl>
+  </w:abstractNum>
+  <w:abstractNum w:abstractNumId="15" w15:restartNumberingAfterBreak="0">
     <w:nsid w:val="64FF530C"/>
     <w:multiLevelType w:val="multilevel"/>
     <w:tmpl w:val="97145B8A"/>
@@ -3957,7 +7047,305 @@
       </w:rPr>
     </w:lvl>
   </w:abstractNum>
-  <w:abstractNum w:abstractNumId="7" w15:restartNumberingAfterBreak="0">
+  <w:abstractNum w:abstractNumId="16" w15:restartNumberingAfterBreak="0">
+    <w:nsid w:val="67487D4A"/>
+    <w:multiLevelType w:val="multilevel"/>
+    <w:tmpl w:val="BE44ACAA"/>
+    <w:lvl w:ilvl="0">
+      <w:start w:val="1"/>
+      <w:numFmt w:val="bullet"/>
+      <w:lvlText w:val=""/>
+      <w:lvlJc w:val="left"/>
+      <w:pPr>
+        <w:tabs>
+          <w:tab w:val="num" w:pos="720"/>
+        </w:tabs>
+        <w:ind w:left="720" w:hanging="360"/>
+      </w:pPr>
+      <w:rPr>
+        <w:rFonts w:ascii="Symbol" w:hAnsi="Symbol" w:hint="default"/>
+        <w:sz w:val="20"/>
+      </w:rPr>
+    </w:lvl>
+    <w:lvl w:ilvl="1" w:tentative="1">
+      <w:start w:val="1"/>
+      <w:numFmt w:val="bullet"/>
+      <w:lvlText w:val="o"/>
+      <w:lvlJc w:val="left"/>
+      <w:pPr>
+        <w:tabs>
+          <w:tab w:val="num" w:pos="1440"/>
+        </w:tabs>
+        <w:ind w:left="1440" w:hanging="360"/>
+      </w:pPr>
+      <w:rPr>
+        <w:rFonts w:ascii="Courier New" w:hAnsi="Courier New" w:hint="default"/>
+        <w:sz w:val="20"/>
+      </w:rPr>
+    </w:lvl>
+    <w:lvl w:ilvl="2" w:tentative="1">
+      <w:start w:val="1"/>
+      <w:numFmt w:val="bullet"/>
+      <w:lvlText w:val=""/>
+      <w:lvlJc w:val="left"/>
+      <w:pPr>
+        <w:tabs>
+          <w:tab w:val="num" w:pos="2160"/>
+        </w:tabs>
+        <w:ind w:left="2160" w:hanging="360"/>
+      </w:pPr>
+      <w:rPr>
+        <w:rFonts w:ascii="Wingdings" w:hAnsi="Wingdings" w:hint="default"/>
+        <w:sz w:val="20"/>
+      </w:rPr>
+    </w:lvl>
+    <w:lvl w:ilvl="3" w:tentative="1">
+      <w:start w:val="1"/>
+      <w:numFmt w:val="bullet"/>
+      <w:lvlText w:val=""/>
+      <w:lvlJc w:val="left"/>
+      <w:pPr>
+        <w:tabs>
+          <w:tab w:val="num" w:pos="2880"/>
+        </w:tabs>
+        <w:ind w:left="2880" w:hanging="360"/>
+      </w:pPr>
+      <w:rPr>
+        <w:rFonts w:ascii="Wingdings" w:hAnsi="Wingdings" w:hint="default"/>
+        <w:sz w:val="20"/>
+      </w:rPr>
+    </w:lvl>
+    <w:lvl w:ilvl="4" w:tentative="1">
+      <w:start w:val="1"/>
+      <w:numFmt w:val="bullet"/>
+      <w:lvlText w:val=""/>
+      <w:lvlJc w:val="left"/>
+      <w:pPr>
+        <w:tabs>
+          <w:tab w:val="num" w:pos="3600"/>
+        </w:tabs>
+        <w:ind w:left="3600" w:hanging="360"/>
+      </w:pPr>
+      <w:rPr>
+        <w:rFonts w:ascii="Wingdings" w:hAnsi="Wingdings" w:hint="default"/>
+        <w:sz w:val="20"/>
+      </w:rPr>
+    </w:lvl>
+    <w:lvl w:ilvl="5" w:tentative="1">
+      <w:start w:val="1"/>
+      <w:numFmt w:val="bullet"/>
+      <w:lvlText w:val=""/>
+      <w:lvlJc w:val="left"/>
+      <w:pPr>
+        <w:tabs>
+          <w:tab w:val="num" w:pos="4320"/>
+        </w:tabs>
+        <w:ind w:left="4320" w:hanging="360"/>
+      </w:pPr>
+      <w:rPr>
+        <w:rFonts w:ascii="Wingdings" w:hAnsi="Wingdings" w:hint="default"/>
+        <w:sz w:val="20"/>
+      </w:rPr>
+    </w:lvl>
+    <w:lvl w:ilvl="6" w:tentative="1">
+      <w:start w:val="1"/>
+      <w:numFmt w:val="bullet"/>
+      <w:lvlText w:val=""/>
+      <w:lvlJc w:val="left"/>
+      <w:pPr>
+        <w:tabs>
+          <w:tab w:val="num" w:pos="5040"/>
+        </w:tabs>
+        <w:ind w:left="5040" w:hanging="360"/>
+      </w:pPr>
+      <w:rPr>
+        <w:rFonts w:ascii="Wingdings" w:hAnsi="Wingdings" w:hint="default"/>
+        <w:sz w:val="20"/>
+      </w:rPr>
+    </w:lvl>
+    <w:lvl w:ilvl="7" w:tentative="1">
+      <w:start w:val="1"/>
+      <w:numFmt w:val="bullet"/>
+      <w:lvlText w:val=""/>
+      <w:lvlJc w:val="left"/>
+      <w:pPr>
+        <w:tabs>
+          <w:tab w:val="num" w:pos="5760"/>
+        </w:tabs>
+        <w:ind w:left="5760" w:hanging="360"/>
+      </w:pPr>
+      <w:rPr>
+        <w:rFonts w:ascii="Wingdings" w:hAnsi="Wingdings" w:hint="default"/>
+        <w:sz w:val="20"/>
+      </w:rPr>
+    </w:lvl>
+    <w:lvl w:ilvl="8" w:tentative="1">
+      <w:start w:val="1"/>
+      <w:numFmt w:val="bullet"/>
+      <w:lvlText w:val=""/>
+      <w:lvlJc w:val="left"/>
+      <w:pPr>
+        <w:tabs>
+          <w:tab w:val="num" w:pos="6480"/>
+        </w:tabs>
+        <w:ind w:left="6480" w:hanging="360"/>
+      </w:pPr>
+      <w:rPr>
+        <w:rFonts w:ascii="Wingdings" w:hAnsi="Wingdings" w:hint="default"/>
+        <w:sz w:val="20"/>
+      </w:rPr>
+    </w:lvl>
+  </w:abstractNum>
+  <w:abstractNum w:abstractNumId="17" w15:restartNumberingAfterBreak="0">
+    <w:nsid w:val="6EC31102"/>
+    <w:multiLevelType w:val="multilevel"/>
+    <w:tmpl w:val="4C4ECE12"/>
+    <w:lvl w:ilvl="0">
+      <w:start w:val="1"/>
+      <w:numFmt w:val="bullet"/>
+      <w:lvlText w:val=""/>
+      <w:lvlJc w:val="left"/>
+      <w:pPr>
+        <w:tabs>
+          <w:tab w:val="num" w:pos="720"/>
+        </w:tabs>
+        <w:ind w:left="720" w:hanging="360"/>
+      </w:pPr>
+      <w:rPr>
+        <w:rFonts w:ascii="Symbol" w:hAnsi="Symbol" w:hint="default"/>
+        <w:sz w:val="20"/>
+      </w:rPr>
+    </w:lvl>
+    <w:lvl w:ilvl="1" w:tentative="1">
+      <w:start w:val="1"/>
+      <w:numFmt w:val="bullet"/>
+      <w:lvlText w:val="o"/>
+      <w:lvlJc w:val="left"/>
+      <w:pPr>
+        <w:tabs>
+          <w:tab w:val="num" w:pos="1440"/>
+        </w:tabs>
+        <w:ind w:left="1440" w:hanging="360"/>
+      </w:pPr>
+      <w:rPr>
+        <w:rFonts w:ascii="Courier New" w:hAnsi="Courier New" w:hint="default"/>
+        <w:sz w:val="20"/>
+      </w:rPr>
+    </w:lvl>
+    <w:lvl w:ilvl="2" w:tentative="1">
+      <w:start w:val="1"/>
+      <w:numFmt w:val="bullet"/>
+      <w:lvlText w:val=""/>
+      <w:lvlJc w:val="left"/>
+      <w:pPr>
+        <w:tabs>
+          <w:tab w:val="num" w:pos="2160"/>
+        </w:tabs>
+        <w:ind w:left="2160" w:hanging="360"/>
+      </w:pPr>
+      <w:rPr>
+        <w:rFonts w:ascii="Wingdings" w:hAnsi="Wingdings" w:hint="default"/>
+        <w:sz w:val="20"/>
+      </w:rPr>
+    </w:lvl>
+    <w:lvl w:ilvl="3" w:tentative="1">
+      <w:start w:val="1"/>
+      <w:numFmt w:val="bullet"/>
+      <w:lvlText w:val=""/>
+      <w:lvlJc w:val="left"/>
+      <w:pPr>
+        <w:tabs>
+          <w:tab w:val="num" w:pos="2880"/>
+        </w:tabs>
+        <w:ind w:left="2880" w:hanging="360"/>
+      </w:pPr>
+      <w:rPr>
+        <w:rFonts w:ascii="Wingdings" w:hAnsi="Wingdings" w:hint="default"/>
+        <w:sz w:val="20"/>
+      </w:rPr>
+    </w:lvl>
+    <w:lvl w:ilvl="4" w:tentative="1">
+      <w:start w:val="1"/>
+      <w:numFmt w:val="bullet"/>
+      <w:lvlText w:val=""/>
+      <w:lvlJc w:val="left"/>
+      <w:pPr>
+        <w:tabs>
+          <w:tab w:val="num" w:pos="3600"/>
+        </w:tabs>
+        <w:ind w:left="3600" w:hanging="360"/>
+      </w:pPr>
+      <w:rPr>
+        <w:rFonts w:ascii="Wingdings" w:hAnsi="Wingdings" w:hint="default"/>
+        <w:sz w:val="20"/>
+      </w:rPr>
+    </w:lvl>
+    <w:lvl w:ilvl="5" w:tentative="1">
+      <w:start w:val="1"/>
+      <w:numFmt w:val="bullet"/>
+      <w:lvlText w:val=""/>
+      <w:lvlJc w:val="left"/>
+      <w:pPr>
+        <w:tabs>
+          <w:tab w:val="num" w:pos="4320"/>
+        </w:tabs>
+        <w:ind w:left="4320" w:hanging="360"/>
+      </w:pPr>
+      <w:rPr>
+        <w:rFonts w:ascii="Wingdings" w:hAnsi="Wingdings" w:hint="default"/>
+        <w:sz w:val="20"/>
+      </w:rPr>
+    </w:lvl>
+    <w:lvl w:ilvl="6" w:tentative="1">
+      <w:start w:val="1"/>
+      <w:numFmt w:val="bullet"/>
+      <w:lvlText w:val=""/>
+      <w:lvlJc w:val="left"/>
+      <w:pPr>
+        <w:tabs>
+          <w:tab w:val="num" w:pos="5040"/>
+        </w:tabs>
+        <w:ind w:left="5040" w:hanging="360"/>
+      </w:pPr>
+      <w:rPr>
+        <w:rFonts w:ascii="Wingdings" w:hAnsi="Wingdings" w:hint="default"/>
+        <w:sz w:val="20"/>
+      </w:rPr>
+    </w:lvl>
+    <w:lvl w:ilvl="7" w:tentative="1">
+      <w:start w:val="1"/>
+      <w:numFmt w:val="bullet"/>
+      <w:lvlText w:val=""/>
+      <w:lvlJc w:val="left"/>
+      <w:pPr>
+        <w:tabs>
+          <w:tab w:val="num" w:pos="5760"/>
+        </w:tabs>
+        <w:ind w:left="5760" w:hanging="360"/>
+      </w:pPr>
+      <w:rPr>
+        <w:rFonts w:ascii="Wingdings" w:hAnsi="Wingdings" w:hint="default"/>
+        <w:sz w:val="20"/>
+      </w:rPr>
+    </w:lvl>
+    <w:lvl w:ilvl="8" w:tentative="1">
+      <w:start w:val="1"/>
+      <w:numFmt w:val="bullet"/>
+      <w:lvlText w:val=""/>
+      <w:lvlJc w:val="left"/>
+      <w:pPr>
+        <w:tabs>
+          <w:tab w:val="num" w:pos="6480"/>
+        </w:tabs>
+        <w:ind w:left="6480" w:hanging="360"/>
+      </w:pPr>
+      <w:rPr>
+        <w:rFonts w:ascii="Wingdings" w:hAnsi="Wingdings" w:hint="default"/>
+        <w:sz w:val="20"/>
+      </w:rPr>
+    </w:lvl>
+  </w:abstractNum>
+  <w:abstractNum w:abstractNumId="18" w15:restartNumberingAfterBreak="0">
     <w:nsid w:val="7FFB250A"/>
     <w:multiLevelType w:val="multilevel"/>
     <w:tmpl w:val="59384012"/>
@@ -4107,27 +7495,60 @@
     </w:lvl>
   </w:abstractNum>
   <w:num w:numId="1" w16cid:durableId="743068070">
-    <w:abstractNumId w:val="6"/>
+    <w:abstractNumId w:val="15"/>
   </w:num>
   <w:num w:numId="2" w16cid:durableId="944579289">
     <w:abstractNumId w:val="0"/>
   </w:num>
   <w:num w:numId="3" w16cid:durableId="33434850">
+    <w:abstractNumId w:val="2"/>
+  </w:num>
+  <w:num w:numId="4" w16cid:durableId="98574562">
+    <w:abstractNumId w:val="9"/>
+  </w:num>
+  <w:num w:numId="5" w16cid:durableId="2110420785">
+    <w:abstractNumId w:val="12"/>
+  </w:num>
+  <w:num w:numId="6" w16cid:durableId="1259095550">
+    <w:abstractNumId w:val="5"/>
+  </w:num>
+  <w:num w:numId="7" w16cid:durableId="906653135">
+    <w:abstractNumId w:val="4"/>
+  </w:num>
+  <w:num w:numId="8" w16cid:durableId="588461709">
+    <w:abstractNumId w:val="18"/>
+  </w:num>
+  <w:num w:numId="9" w16cid:durableId="880703187">
+    <w:abstractNumId w:val="6"/>
+  </w:num>
+  <w:num w:numId="10" w16cid:durableId="1429499019">
+    <w:abstractNumId w:val="16"/>
+  </w:num>
+  <w:num w:numId="11" w16cid:durableId="435297960">
+    <w:abstractNumId w:val="14"/>
+  </w:num>
+  <w:num w:numId="12" w16cid:durableId="1656949925">
+    <w:abstractNumId w:val="11"/>
+  </w:num>
+  <w:num w:numId="13" w16cid:durableId="2009022060">
     <w:abstractNumId w:val="1"/>
   </w:num>
-  <w:num w:numId="4" w16cid:durableId="98574562">
-    <w:abstractNumId w:val="4"/>
+  <w:num w:numId="14" w16cid:durableId="724109427">
+    <w:abstractNumId w:val="10"/>
   </w:num>
-  <w:num w:numId="5" w16cid:durableId="2110420785">
-    <w:abstractNumId w:val="5"/>
+  <w:num w:numId="15" w16cid:durableId="1393653867">
+    <w:abstractNumId w:val="13"/>
   </w:num>
-  <w:num w:numId="6" w16cid:durableId="1259095550">
+  <w:num w:numId="16" w16cid:durableId="2039045715">
+    <w:abstractNumId w:val="8"/>
+  </w:num>
+  <w:num w:numId="17" w16cid:durableId="213852986">
+    <w:abstractNumId w:val="17"/>
+  </w:num>
+  <w:num w:numId="18" w16cid:durableId="1306592570">
     <w:abstractNumId w:val="3"/>
   </w:num>
-  <w:num w:numId="7" w16cid:durableId="906653135">
-    <w:abstractNumId w:val="2"/>
-  </w:num>
-  <w:num w:numId="8" w16cid:durableId="588461709">
+  <w:num w:numId="19" w16cid:durableId="2000763875">
     <w:abstractNumId w:val="7"/>
   </w:num>
 </w:numbering>

</xml_diff>

<commit_message>
Updated the ReadMe file for the jobs of the pages that will be completed.
</commit_message>
<xml_diff>
--- a/hoffman-site-plan.docx
+++ b/hoffman-site-plan.docx
@@ -1621,19 +1621,11 @@
                 <w:rFonts w:eastAsia="Times New Roman"/>
               </w:rPr>
             </w:pPr>
-            <w:proofErr w:type="spellStart"/>
             <w:r>
               <w:rPr>
                 <w:rFonts w:eastAsia="Times New Roman"/>
               </w:rPr>
-              <w:t>CLion</w:t>
-            </w:r>
-            <w:proofErr w:type="spellEnd"/>
-            <w:r>
-              <w:rPr>
-                <w:rFonts w:eastAsia="Times New Roman"/>
-              </w:rPr>
-              <w:t>, Visual Studio</w:t>
+              <w:t>CLion, Visual Studio</w:t>
             </w:r>
           </w:p>
         </w:tc>
@@ -1807,16 +1799,8 @@
               <w:rPr>
                 <w:rFonts w:eastAsia="Times New Roman"/>
               </w:rPr>
-              <w:t xml:space="preserve">VS Code, </w:t>
+              <w:t>VS Code, PHPStorm</w:t>
             </w:r>
-            <w:proofErr w:type="spellStart"/>
-            <w:r>
-              <w:rPr>
-                <w:rFonts w:eastAsia="Times New Roman"/>
-              </w:rPr>
-              <w:t>PHPStorm</w:t>
-            </w:r>
-            <w:proofErr w:type="spellEnd"/>
           </w:p>
         </w:tc>
         <w:tc>
@@ -3840,21 +3824,7 @@
         <w:rPr>
           <w:rFonts w:eastAsia="Times New Roman"/>
         </w:rPr>
-        <w:t xml:space="preserve">This site is organized to make </w:t>
-      </w:r>
-      <w:proofErr w:type="gramStart"/>
-      <w:r>
-        <w:rPr>
-          <w:rFonts w:eastAsia="Times New Roman"/>
-        </w:rPr>
-        <w:t>comparisons simple and intuitive</w:t>
-      </w:r>
-      <w:proofErr w:type="gramEnd"/>
-      <w:r>
-        <w:rPr>
-          <w:rFonts w:eastAsia="Times New Roman"/>
-        </w:rPr>
-        <w:t>. Users can explore:</w:t>
+        <w:t>This site is organized to make comparisons simple and intuitive. Users can explore:</w:t>
       </w:r>
     </w:p>
     <w:p>
@@ -3891,21 +3861,7 @@
         <w:rPr>
           <w:rFonts w:eastAsia="Times New Roman"/>
         </w:rPr>
-        <w:t xml:space="preserve">Side-by-side examples of popular programming languages </w:t>
-      </w:r>
-      <w:proofErr w:type="gramStart"/>
-      <w:r>
-        <w:rPr>
-          <w:rFonts w:eastAsia="Times New Roman"/>
-        </w:rPr>
-        <w:t>demonstrating</w:t>
-      </w:r>
-      <w:proofErr w:type="gramEnd"/>
-      <w:r>
-        <w:rPr>
-          <w:rFonts w:eastAsia="Times New Roman"/>
-        </w:rPr>
-        <w:t xml:space="preserve"> how they handle the same tasks.</w:t>
+        <w:t>Side-by-side examples of popular programming languages demonstrating how they handle the same tasks.</w:t>
       </w:r>
     </w:p>
     <w:p>
@@ -4389,19 +4345,11 @@
           <w:rFonts w:eastAsia="Times New Roman"/>
         </w:rPr>
       </w:pPr>
-      <w:proofErr w:type="gramStart"/>
-      <w:r>
-        <w:rPr>
-          <w:rFonts w:eastAsia="Times New Roman"/>
-        </w:rPr>
-        <w:t>Make</w:t>
-      </w:r>
-      <w:proofErr w:type="gramEnd"/>
-      <w:r>
-        <w:rPr>
-          <w:rFonts w:eastAsia="Times New Roman"/>
-        </w:rPr>
-        <w:t xml:space="preserve"> programming concepts easier to understand</w:t>
+      <w:r>
+        <w:rPr>
+          <w:rFonts w:eastAsia="Times New Roman"/>
+        </w:rPr>
+        <w:t>Make programming concepts easier to understand</w:t>
       </w:r>
     </w:p>
     <w:p>
@@ -4431,19 +4379,11 @@
           <w:rFonts w:eastAsia="Times New Roman"/>
         </w:rPr>
       </w:pPr>
-      <w:proofErr w:type="gramStart"/>
-      <w:r>
-        <w:rPr>
-          <w:rFonts w:eastAsia="Times New Roman"/>
-        </w:rPr>
-        <w:t>Provide</w:t>
-      </w:r>
-      <w:proofErr w:type="gramEnd"/>
-      <w:r>
-        <w:rPr>
-          <w:rFonts w:eastAsia="Times New Roman"/>
-        </w:rPr>
-        <w:t xml:space="preserve"> a useful educational resource</w:t>
+      <w:r>
+        <w:rPr>
+          <w:rFonts w:eastAsia="Times New Roman"/>
+        </w:rPr>
+        <w:t>Provide a useful educational resource</w:t>
       </w:r>
     </w:p>
     <w:p>
@@ -8023,6 +7963,7 @@
   <w:style w:type="character" w:default="1" w:styleId="DefaultParagraphFont">
     <w:name w:val="Default Paragraph Font"/>
     <w:uiPriority w:val="1"/>
+    <w:semiHidden/>
     <w:unhideWhenUsed/>
   </w:style>
   <w:style w:type="table" w:default="1" w:styleId="TableNormal">

</xml_diff>

<commit_message>
updated the site plan
</commit_message>
<xml_diff>
--- a/hoffman-site-plan.docx
+++ b/hoffman-site-plan.docx
@@ -4544,15 +4544,14 @@
       </w:pPr>
       <w:r>
         <w:rPr>
-          <w:rFonts w:eastAsia="Times New Roman"/>
           <w:noProof/>
         </w:rPr>
         <w:lastRenderedPageBreak/>
         <w:drawing>
-          <wp:inline distT="0" distB="0" distL="0" distR="0" wp14:anchorId="39219353" wp14:editId="26FBBB3D">
-            <wp:extent cx="1676400" cy="8229600"/>
+          <wp:inline distT="0" distB="0" distL="0" distR="0" wp14:anchorId="1C6A5ADF" wp14:editId="78DE0C87">
+            <wp:extent cx="4953000" cy="6781800"/>
             <wp:effectExtent l="0" t="0" r="0" b="0"/>
-            <wp:docPr id="1801053771" name="Picture 3"/>
+            <wp:docPr id="1465584494" name="Picture 1"/>
             <wp:cNvGraphicFramePr>
               <a:graphicFrameLocks xmlns:a="http://schemas.openxmlformats.org/drawingml/2006/main" noChangeAspect="1"/>
             </wp:cNvGraphicFramePr>
@@ -4560,8 +4559,10 @@
               <a:graphicData uri="http://schemas.openxmlformats.org/drawingml/2006/picture">
                 <pic:pic xmlns:pic="http://schemas.openxmlformats.org/drawingml/2006/picture">
                   <pic:nvPicPr>
-                    <pic:cNvPr id="1801053771" name="Picture 1801053771"/>
-                    <pic:cNvPicPr/>
+                    <pic:cNvPr id="0" name="Picture 6"/>
+                    <pic:cNvPicPr>
+                      <a:picLocks noChangeAspect="1" noChangeArrowheads="1"/>
+                    </pic:cNvPicPr>
                   </pic:nvPicPr>
                   <pic:blipFill>
                     <a:blip r:embed="rId8">
@@ -4571,18 +4572,23 @@
                         </a:ext>
                       </a:extLst>
                     </a:blip>
+                    <a:srcRect/>
                     <a:stretch>
                       <a:fillRect/>
                     </a:stretch>
                   </pic:blipFill>
-                  <pic:spPr>
+                  <pic:spPr bwMode="auto">
                     <a:xfrm>
                       <a:off x="0" y="0"/>
-                      <a:ext cx="1676400" cy="8229600"/>
+                      <a:ext cx="4953000" cy="6781800"/>
                     </a:xfrm>
                     <a:prstGeom prst="rect">
                       <a:avLst/>
                     </a:prstGeom>
+                    <a:noFill/>
+                    <a:ln>
+                      <a:noFill/>
+                    </a:ln>
                   </pic:spPr>
                 </pic:pic>
               </a:graphicData>

</xml_diff>